<commit_message>
Update cloud security doc: add 9 modern controls coverage
New subsections added across all major sections:
- 2.1.1 Machine Identity Governance
- 2.2.1 Service-to-Service Zero Trust (service mesh, SPIFFE/SPIRE)
- 2.3.1 Dynamic Secrets and Credential Rotation
- 2.4.1 Runtime Threat Detection (Falco, eBPF, GuardDuty Runtime)
- 2.5.1 Software Supply Chain Security (SLSA, Sigstore/Cosign, in-toto)
- 3.6 Data Security Posture Management (DSPM)
- Section 9: AI Security and LLM Governance (OWASP LLM Top 10, NIST AI RMF)
- Section 10: Cloud Attack Path Analysis (Wiz, Defender, BloodHound)
- Core Principles: expanded to include machine identity, service-to-service ZT, supply chain
- Cover page: updated frameworks to include NIST AI RMF + SLSA + MITRE ATT&CK for Cloud
</commit_message>
<xml_diff>
--- a/Cloud/cloud_security_architecture.docx
+++ b/Cloud/cloud_security_architecture.docx
@@ -120,7 +120,7 @@
           <w:sz w:val="19"/>
           <w:szCs w:val="19"/>
         </w:rPr>
-        <w:t xml:space="preserve">Frameworks: NIST SP 800-53 Rev 5  ·  MITRE ATT&amp;CK Cloud  ·  CIS Benchmarks  ·  CSA CCM</w:t>
+        <w:t xml:space="preserve">Frameworks: NIST SP 800-53 Rev 5  ·  MITRE ATT&amp;CK for Cloud  ·  CIS Benchmarks  ·  CSA CCM  ·  NIST AI Risk Management Framework  ·  SLSA Software Supply Chain Framework</w:t>
       </w:r>
     </w:p>
     <w:p>
@@ -335,6 +335,65 @@
           <w:szCs w:val="20"/>
         </w:rPr>
         <w:t xml:space="preserve">Detect at cloud scale. Native CSPM (Security Hub, Defender for Cloud, SCC), behavioral analytics (GuardDuty, Sentinel, Chronicle), and centralized SIEM.</w:t>
+      </w:r>
+    </w:p>
+    <w:p>
+      <w:r>
+        <w:t xml:space="preserve"/>
+      </w:r>
+    </w:p>
+    <w:p>
+      <w:pPr>
+        <w:spacing w:after="100" w:before="60"/>
+      </w:pPr>
+      <w:r>
+        <w:rPr>
+          <w:rFonts w:ascii="Calibri" w:cs="Calibri" w:eastAsia="Calibri" w:hAnsi="Calibri"/>
+          <w:b w:val="false"/>
+          <w:bCs w:val="false"/>
+          <w:i w:val="false"/>
+          <w:iCs w:val="false"/>
+          <w:color w:val="37474F"/>
+          <w:sz w:val="22"/>
+          <w:szCs w:val="22"/>
+        </w:rPr>
+        <w:t xml:space="preserve">Machine identities are the new attack surface. Cloud environments contain significantly more non-human identities than human users. Workloads must authenticate using federated workload identity and short-lived tokens instead of long-lived credentials.</w:t>
+      </w:r>
+    </w:p>
+    <w:p>
+      <w:pPr>
+        <w:spacing w:after="100" w:before="60"/>
+      </w:pPr>
+      <w:r>
+        <w:rPr>
+          <w:rFonts w:ascii="Calibri" w:cs="Calibri" w:eastAsia="Calibri" w:hAnsi="Calibri"/>
+          <w:b w:val="false"/>
+          <w:bCs w:val="false"/>
+          <w:i w:val="false"/>
+          <w:iCs w:val="false"/>
+          <w:color w:val="37474F"/>
+          <w:sz w:val="22"/>
+          <w:szCs w:val="22"/>
+        </w:rPr>
+        <w:t xml:space="preserve">All service-to-service communication must follow Zero Trust principles. Mutual authentication, strong workload identity, and policy-based authorization must be enforced for east-west traffic between services.</w:t>
+      </w:r>
+    </w:p>
+    <w:p>
+      <w:pPr>
+        <w:spacing w:after="100" w:before="60"/>
+      </w:pPr>
+      <w:r>
+        <w:rPr>
+          <w:rFonts w:ascii="Calibri" w:cs="Calibri" w:eastAsia="Calibri" w:hAnsi="Calibri"/>
+          <w:b w:val="false"/>
+          <w:bCs w:val="false"/>
+          <w:i w:val="false"/>
+          <w:iCs w:val="false"/>
+          <w:color w:val="37474F"/>
+          <w:sz w:val="22"/>
+          <w:szCs w:val="22"/>
+        </w:rPr>
+        <w:t xml:space="preserve">Software supply chain integrity is mandatory. All build artifacts must be generated through trusted CI/CD pipelines with signed provenance and verifiable build metadata.</w:t>
       </w:r>
     </w:p>
     <w:p>
@@ -2006,6 +2065,176 @@
     </w:p>
     <w:p>
       <w:pPr>
+        <w:pStyle w:val="Heading3"/>
+      </w:pPr>
+      <w:r>
+        <w:rPr>
+          <w:rFonts w:ascii="Arial" w:cs="Arial" w:eastAsia="Arial" w:hAnsi="Arial"/>
+          <w:b/>
+          <w:bCs/>
+          <w:color w:val="37474F"/>
+          <w:sz w:val="22"/>
+          <w:szCs w:val="22"/>
+        </w:rPr>
+        <w:t xml:space="preserve">2.1.1 Machine Identity Governance</w:t>
+      </w:r>
+    </w:p>
+    <w:p>
+      <w:pPr>
+        <w:spacing w:after="100" w:before="60"/>
+      </w:pPr>
+      <w:r>
+        <w:rPr>
+          <w:rFonts w:ascii="Calibri" w:cs="Calibri" w:eastAsia="Calibri" w:hAnsi="Calibri"/>
+          <w:b w:val="false"/>
+          <w:bCs w:val="false"/>
+          <w:i w:val="false"/>
+          <w:iCs w:val="false"/>
+          <w:color w:val="37474F"/>
+          <w:sz w:val="22"/>
+          <w:szCs w:val="22"/>
+        </w:rPr>
+        <w:t xml:space="preserve">Machine identities (IAM roles, service accounts, workload identities) often outnumber human users by an order of magnitude in cloud environments and require equivalent governance controls.</w:t>
+      </w:r>
+    </w:p>
+    <w:p>
+      <w:pPr>
+        <w:spacing w:after="100" w:before="60"/>
+      </w:pPr>
+      <w:r>
+        <w:rPr>
+          <w:rFonts w:ascii="Calibri" w:cs="Calibri" w:eastAsia="Calibri" w:hAnsi="Calibri"/>
+          <w:b w:val="false"/>
+          <w:bCs w:val="false"/>
+          <w:i w:val="false"/>
+          <w:iCs w:val="false"/>
+          <w:color w:val="37474F"/>
+          <w:sz w:val="22"/>
+          <w:szCs w:val="22"/>
+        </w:rPr>
+        <w:t xml:space="preserve">Required controls:</w:t>
+      </w:r>
+    </w:p>
+    <w:p>
+      <w:pPr>
+        <w:pStyle w:val="ListParagraph"/>
+        <w:numPr>
+          <w:ilvl w:val="0"/>
+          <w:numId w:val="2"/>
+        </w:numPr>
+        <w:spacing w:after="30" w:before="30"/>
+      </w:pPr>
+      <w:r>
+        <w:rPr>
+          <w:rFonts w:ascii="Calibri" w:cs="Calibri" w:eastAsia="Calibri" w:hAnsi="Calibri"/>
+          <w:color w:val="37474F"/>
+          <w:sz w:val="20"/>
+          <w:szCs w:val="20"/>
+        </w:rPr>
+        <w:t xml:space="preserve">Maintain centralized inventory of all workload identities</w:t>
+      </w:r>
+    </w:p>
+    <w:p>
+      <w:pPr>
+        <w:pStyle w:val="ListParagraph"/>
+        <w:numPr>
+          <w:ilvl w:val="0"/>
+          <w:numId w:val="2"/>
+        </w:numPr>
+        <w:spacing w:after="30" w:before="30"/>
+      </w:pPr>
+      <w:r>
+        <w:rPr>
+          <w:rFonts w:ascii="Calibri" w:cs="Calibri" w:eastAsia="Calibri" w:hAnsi="Calibri"/>
+          <w:color w:val="37474F"/>
+          <w:sz w:val="20"/>
+          <w:szCs w:val="20"/>
+        </w:rPr>
+        <w:t xml:space="preserve">Enforce short-lived credentials via AWS STS</w:t>
+      </w:r>
+    </w:p>
+    <w:p>
+      <w:pPr>
+        <w:pStyle w:val="ListParagraph"/>
+        <w:numPr>
+          <w:ilvl w:val="0"/>
+          <w:numId w:val="2"/>
+        </w:numPr>
+        <w:spacing w:after="30" w:before="30"/>
+      </w:pPr>
+      <w:r>
+        <w:rPr>
+          <w:rFonts w:ascii="Calibri" w:cs="Calibri" w:eastAsia="Calibri" w:hAnsi="Calibri"/>
+          <w:color w:val="37474F"/>
+          <w:sz w:val="20"/>
+          <w:szCs w:val="20"/>
+        </w:rPr>
+        <w:t xml:space="preserve">Detect unused IAM roles and remove stale identities</w:t>
+      </w:r>
+    </w:p>
+    <w:p>
+      <w:pPr>
+        <w:pStyle w:val="ListParagraph"/>
+        <w:numPr>
+          <w:ilvl w:val="0"/>
+          <w:numId w:val="2"/>
+        </w:numPr>
+        <w:spacing w:after="30" w:before="30"/>
+      </w:pPr>
+      <w:r>
+        <w:rPr>
+          <w:rFonts w:ascii="Calibri" w:cs="Calibri" w:eastAsia="Calibri" w:hAnsi="Calibri"/>
+          <w:color w:val="37474F"/>
+          <w:sz w:val="20"/>
+          <w:szCs w:val="20"/>
+        </w:rPr>
+        <w:t xml:space="preserve">Restrict cross-account role assumption using aws:PrincipalOrgID</w:t>
+      </w:r>
+    </w:p>
+    <w:p>
+      <w:pPr>
+        <w:pStyle w:val="ListParagraph"/>
+        <w:numPr>
+          <w:ilvl w:val="0"/>
+          <w:numId w:val="2"/>
+        </w:numPr>
+        <w:spacing w:after="30" w:before="30"/>
+      </w:pPr>
+      <w:r>
+        <w:rPr>
+          <w:rFonts w:ascii="Calibri" w:cs="Calibri" w:eastAsia="Calibri" w:hAnsi="Calibri"/>
+          <w:color w:val="37474F"/>
+          <w:sz w:val="20"/>
+          <w:szCs w:val="20"/>
+        </w:rPr>
+        <w:t xml:space="preserve">Monitor excessive privilege escalation paths via IAM Access Analyzer</w:t>
+      </w:r>
+    </w:p>
+    <w:p>
+      <w:pPr>
+        <w:spacing w:after="100" w:before="60"/>
+      </w:pPr>
+      <w:r>
+        <w:rPr>
+          <w:rFonts w:ascii="Calibri" w:cs="Calibri" w:eastAsia="Calibri" w:hAnsi="Calibri"/>
+          <w:b w:val="false"/>
+          <w:bCs w:val="false"/>
+          <w:i w:val="false"/>
+          <w:iCs w:val="false"/>
+          <w:color w:val="37474F"/>
+          <w:sz w:val="22"/>
+          <w:szCs w:val="22"/>
+        </w:rPr>
+        <w:t xml:space="preserve">Machine identities must follow the same lifecycle governance as human identities including provisioning, review, and decommissioning.</w:t>
+      </w:r>
+    </w:p>
+    <w:p>
+      <w:r>
+        <w:t xml:space="preserve"/>
+      </w:r>
+    </w:p>
+    <w:p>
+      <w:pPr>
         <w:pStyle w:val="Heading2"/>
       </w:pPr>
       <w:r>
@@ -2301,6 +2530,264 @@
     </w:p>
     <w:p>
       <w:pPr>
+        <w:pStyle w:val="Heading3"/>
+      </w:pPr>
+      <w:r>
+        <w:rPr>
+          <w:rFonts w:ascii="Arial" w:cs="Arial" w:eastAsia="Arial" w:hAnsi="Arial"/>
+          <w:b/>
+          <w:bCs/>
+          <w:color w:val="37474F"/>
+          <w:sz w:val="22"/>
+          <w:szCs w:val="22"/>
+        </w:rPr>
+        <w:t xml:space="preserve">2.2.1 Service-to-Service Zero Trust</w:t>
+      </w:r>
+    </w:p>
+    <w:p>
+      <w:pPr>
+        <w:spacing w:after="100" w:before="60"/>
+      </w:pPr>
+      <w:r>
+        <w:rPr>
+          <w:rFonts w:ascii="Calibri" w:cs="Calibri" w:eastAsia="Calibri" w:hAnsi="Calibri"/>
+          <w:b w:val="false"/>
+          <w:bCs w:val="false"/>
+          <w:i w:val="false"/>
+          <w:iCs w:val="false"/>
+          <w:color w:val="37474F"/>
+          <w:sz w:val="22"/>
+          <w:szCs w:val="22"/>
+        </w:rPr>
+        <w:t xml:space="preserve">Traditional network segmentation alone does not adequately protect east-west service communication in cloud environments. All service communication must be authenticated and authorized using strong workload identity.</w:t>
+      </w:r>
+    </w:p>
+    <w:p>
+      <w:pPr>
+        <w:spacing w:after="100" w:before="60"/>
+      </w:pPr>
+      <w:r>
+        <w:rPr>
+          <w:rFonts w:ascii="Calibri" w:cs="Calibri" w:eastAsia="Calibri" w:hAnsi="Calibri"/>
+          <w:b w:val="false"/>
+          <w:bCs w:val="false"/>
+          <w:i w:val="false"/>
+          <w:iCs w:val="false"/>
+          <w:color w:val="37474F"/>
+          <w:sz w:val="22"/>
+          <w:szCs w:val="22"/>
+        </w:rPr>
+        <w:t xml:space="preserve">Recommended controls:</w:t>
+      </w:r>
+    </w:p>
+    <w:p>
+      <w:pPr>
+        <w:pStyle w:val="ListParagraph"/>
+        <w:numPr>
+          <w:ilvl w:val="0"/>
+          <w:numId w:val="2"/>
+        </w:numPr>
+        <w:spacing w:after="30" w:before="30"/>
+      </w:pPr>
+      <w:r>
+        <w:rPr>
+          <w:rFonts w:ascii="Calibri" w:cs="Calibri" w:eastAsia="Calibri" w:hAnsi="Calibri"/>
+          <w:color w:val="37474F"/>
+          <w:sz w:val="20"/>
+          <w:szCs w:val="20"/>
+        </w:rPr>
+        <w:t xml:space="preserve">Mutual TLS (mTLS) authentication between services</w:t>
+      </w:r>
+    </w:p>
+    <w:p>
+      <w:pPr>
+        <w:pStyle w:val="ListParagraph"/>
+        <w:numPr>
+          <w:ilvl w:val="0"/>
+          <w:numId w:val="2"/>
+        </w:numPr>
+        <w:spacing w:after="30" w:before="30"/>
+      </w:pPr>
+      <w:r>
+        <w:rPr>
+          <w:rFonts w:ascii="Calibri" w:cs="Calibri" w:eastAsia="Calibri" w:hAnsi="Calibri"/>
+          <w:color w:val="37474F"/>
+          <w:sz w:val="20"/>
+          <w:szCs w:val="20"/>
+        </w:rPr>
+        <w:t xml:space="preserve">Identity-based authorization policies for service communication</w:t>
+      </w:r>
+    </w:p>
+    <w:p>
+      <w:pPr>
+        <w:pStyle w:val="ListParagraph"/>
+        <w:numPr>
+          <w:ilvl w:val="0"/>
+          <w:numId w:val="2"/>
+        </w:numPr>
+        <w:spacing w:after="30" w:before="30"/>
+      </w:pPr>
+      <w:r>
+        <w:rPr>
+          <w:rFonts w:ascii="Calibri" w:cs="Calibri" w:eastAsia="Calibri" w:hAnsi="Calibri"/>
+          <w:color w:val="37474F"/>
+          <w:sz w:val="20"/>
+          <w:szCs w:val="20"/>
+        </w:rPr>
+        <w:t xml:space="preserve">Layer 7 inspection of internal service traffic</w:t>
+      </w:r>
+    </w:p>
+    <w:p>
+      <w:pPr>
+        <w:pStyle w:val="ListParagraph"/>
+        <w:numPr>
+          <w:ilvl w:val="0"/>
+          <w:numId w:val="2"/>
+        </w:numPr>
+        <w:spacing w:after="30" w:before="30"/>
+      </w:pPr>
+      <w:r>
+        <w:rPr>
+          <w:rFonts w:ascii="Calibri" w:cs="Calibri" w:eastAsia="Calibri" w:hAnsi="Calibri"/>
+          <w:color w:val="37474F"/>
+          <w:sz w:val="20"/>
+          <w:szCs w:val="20"/>
+        </w:rPr>
+        <w:t xml:space="preserve">Service mesh enforcement for containerized workloads</w:t>
+      </w:r>
+    </w:p>
+    <w:p>
+      <w:pPr>
+        <w:spacing w:after="100" w:before="60"/>
+      </w:pPr>
+      <w:r>
+        <w:rPr>
+          <w:rFonts w:ascii="Calibri" w:cs="Calibri" w:eastAsia="Calibri" w:hAnsi="Calibri"/>
+          <w:b w:val="false"/>
+          <w:bCs w:val="false"/>
+          <w:i w:val="false"/>
+          <w:iCs w:val="false"/>
+          <w:color w:val="37474F"/>
+          <w:sz w:val="22"/>
+          <w:szCs w:val="22"/>
+        </w:rPr>
+        <w:t xml:space="preserve">Example technologies:</w:t>
+      </w:r>
+    </w:p>
+    <w:p>
+      <w:pPr>
+        <w:pStyle w:val="ListParagraph"/>
+        <w:numPr>
+          <w:ilvl w:val="0"/>
+          <w:numId w:val="2"/>
+        </w:numPr>
+        <w:spacing w:after="30" w:before="30"/>
+      </w:pPr>
+      <w:r>
+        <w:rPr>
+          <w:rFonts w:ascii="Calibri" w:cs="Calibri" w:eastAsia="Calibri" w:hAnsi="Calibri"/>
+          <w:color w:val="37474F"/>
+          <w:sz w:val="20"/>
+          <w:szCs w:val="20"/>
+        </w:rPr>
+        <w:t xml:space="preserve">Istio or Linkerd service mesh</w:t>
+      </w:r>
+    </w:p>
+    <w:p>
+      <w:pPr>
+        <w:pStyle w:val="ListParagraph"/>
+        <w:numPr>
+          <w:ilvl w:val="0"/>
+          <w:numId w:val="2"/>
+        </w:numPr>
+        <w:spacing w:after="30" w:before="30"/>
+      </w:pPr>
+      <w:r>
+        <w:rPr>
+          <w:rFonts w:ascii="Calibri" w:cs="Calibri" w:eastAsia="Calibri" w:hAnsi="Calibri"/>
+          <w:color w:val="37474F"/>
+          <w:sz w:val="20"/>
+          <w:szCs w:val="20"/>
+        </w:rPr>
+        <w:t xml:space="preserve">SPIFFE/SPIRE workload identity standard</w:t>
+      </w:r>
+    </w:p>
+    <w:p>
+      <w:pPr>
+        <w:pStyle w:val="ListParagraph"/>
+        <w:numPr>
+          <w:ilvl w:val="0"/>
+          <w:numId w:val="2"/>
+        </w:numPr>
+        <w:spacing w:after="30" w:before="30"/>
+      </w:pPr>
+      <w:r>
+        <w:rPr>
+          <w:rFonts w:ascii="Calibri" w:cs="Calibri" w:eastAsia="Calibri" w:hAnsi="Calibri"/>
+          <w:color w:val="37474F"/>
+          <w:sz w:val="20"/>
+          <w:szCs w:val="20"/>
+        </w:rPr>
+        <w:t xml:space="preserve">Envoy proxy policy enforcement</w:t>
+      </w:r>
+    </w:p>
+    <w:tbl>
+      <w:tblPr>
+        <w:tblW w:type="dxa" w:w="9360"/>
+        <w:tblBorders>
+          <w:top w:val="single" w:color="auto" w:sz="4"/>
+          <w:left w:val="single" w:color="auto" w:sz="4"/>
+          <w:bottom w:val="single" w:color="auto" w:sz="4"/>
+          <w:right w:val="single" w:color="auto" w:sz="4"/>
+          <w:insideH w:val="single" w:color="auto" w:sz="4"/>
+          <w:insideV w:val="single" w:color="auto" w:sz="4"/>
+        </w:tblBorders>
+      </w:tblPr>
+      <w:tblGrid>
+        <w:gridCol w:w="9360"/>
+      </w:tblGrid>
+      <w:tr>
+        <w:tc>
+          <w:tcPr>
+            <w:tcW w:type="dxa" w:w="9360"/>
+            <w:tcBorders>
+              <w:top w:val="single" w:color="CCCCCC" w:sz="1"/>
+              <w:left w:val="single" w:color="1565C0" w:sz="8"/>
+              <w:bottom w:val="single" w:color="CCCCCC" w:sz="1"/>
+              <w:right w:val="none" w:color="FFFFFF" w:sz="0"/>
+            </w:tcBorders>
+            <w:shd w:fill="F0F4F8" w:val="clear"/>
+            <w:tcMar>
+              <w:top w:type="dxa" w:w="80"/>
+              <w:left w:type="dxa" w:w="160"/>
+              <w:bottom w:type="dxa" w:w="80"/>
+              <w:right w:type="dxa" w:w="160"/>
+            </w:tcMar>
+          </w:tcPr>
+          <w:p>
+            <w:pPr>
+              <w:spacing w:after="0" w:before="0"/>
+            </w:pPr>
+            <w:r>
+              <w:rPr>
+                <w:rFonts w:ascii="Calibri" w:cs="Calibri" w:eastAsia="Calibri" w:hAnsi="Calibri"/>
+                <w:color w:val="37474F"/>
+                <w:sz w:val="19"/>
+                <w:szCs w:val="19"/>
+              </w:rPr>
+              <w:t xml:space="preserve">Outcome: Every service interaction is authenticated, encrypted, and authorized regardless of network location.</w:t>
+            </w:r>
+          </w:p>
+        </w:tc>
+      </w:tr>
+    </w:tbl>
+    <w:p>
+      <w:r>
+        <w:t xml:space="preserve"/>
+      </w:r>
+    </w:p>
+    <w:p>
+      <w:pPr>
         <w:pStyle w:val="Heading2"/>
       </w:pPr>
       <w:r>
@@ -2673,6 +3160,189 @@
     </w:p>
     <w:p>
       <w:pPr>
+        <w:pStyle w:val="Heading3"/>
+      </w:pPr>
+      <w:r>
+        <w:rPr>
+          <w:rFonts w:ascii="Arial" w:cs="Arial" w:eastAsia="Arial" w:hAnsi="Arial"/>
+          <w:b/>
+          <w:bCs/>
+          <w:color w:val="37474F"/>
+          <w:sz w:val="22"/>
+          <w:szCs w:val="22"/>
+        </w:rPr>
+        <w:t xml:space="preserve">2.3.1 Dynamic Secrets and Credential Rotation</w:t>
+      </w:r>
+    </w:p>
+    <w:p>
+      <w:pPr>
+        <w:spacing w:after="100" w:before="60"/>
+      </w:pPr>
+      <w:r>
+        <w:rPr>
+          <w:rFonts w:ascii="Calibri" w:cs="Calibri" w:eastAsia="Calibri" w:hAnsi="Calibri"/>
+          <w:b w:val="false"/>
+          <w:bCs w:val="false"/>
+          <w:i w:val="false"/>
+          <w:iCs w:val="false"/>
+          <w:color w:val="37474F"/>
+          <w:sz w:val="22"/>
+          <w:szCs w:val="22"/>
+        </w:rPr>
+        <w:t xml:space="preserve">Static application secrets significantly increase the risk of credential compromise. Applications must retrieve secrets dynamically at runtime rather than storing credentials in configuration files or source code.</w:t>
+      </w:r>
+    </w:p>
+    <w:p>
+      <w:pPr>
+        <w:spacing w:after="100" w:before="60"/>
+      </w:pPr>
+      <w:r>
+        <w:rPr>
+          <w:rFonts w:ascii="Calibri" w:cs="Calibri" w:eastAsia="Calibri" w:hAnsi="Calibri"/>
+          <w:b w:val="false"/>
+          <w:bCs w:val="false"/>
+          <w:i w:val="false"/>
+          <w:iCs w:val="false"/>
+          <w:color w:val="37474F"/>
+          <w:sz w:val="22"/>
+          <w:szCs w:val="22"/>
+        </w:rPr>
+        <w:t xml:space="preserve">Recommended controls:</w:t>
+      </w:r>
+    </w:p>
+    <w:p>
+      <w:pPr>
+        <w:pStyle w:val="ListParagraph"/>
+        <w:numPr>
+          <w:ilvl w:val="0"/>
+          <w:numId w:val="2"/>
+        </w:numPr>
+        <w:spacing w:after="30" w:before="30"/>
+      </w:pPr>
+      <w:r>
+        <w:rPr>
+          <w:rFonts w:ascii="Calibri" w:cs="Calibri" w:eastAsia="Calibri" w:hAnsi="Calibri"/>
+          <w:color w:val="37474F"/>
+          <w:sz w:val="20"/>
+          <w:szCs w:val="20"/>
+        </w:rPr>
+        <w:t xml:space="preserve">AWS Secrets Manager automatic rotation via Lambda rotation functions</w:t>
+      </w:r>
+    </w:p>
+    <w:p>
+      <w:pPr>
+        <w:pStyle w:val="ListParagraph"/>
+        <w:numPr>
+          <w:ilvl w:val="0"/>
+          <w:numId w:val="2"/>
+        </w:numPr>
+        <w:spacing w:after="30" w:before="30"/>
+      </w:pPr>
+      <w:r>
+        <w:rPr>
+          <w:rFonts w:ascii="Calibri" w:cs="Calibri" w:eastAsia="Calibri" w:hAnsi="Calibri"/>
+          <w:color w:val="37474F"/>
+          <w:sz w:val="20"/>
+          <w:szCs w:val="20"/>
+        </w:rPr>
+        <w:t xml:space="preserve">Dynamic credentials issued by secrets management systems (e.g., HashiCorp Vault dynamic secrets)</w:t>
+      </w:r>
+    </w:p>
+    <w:p>
+      <w:pPr>
+        <w:pStyle w:val="ListParagraph"/>
+        <w:numPr>
+          <w:ilvl w:val="0"/>
+          <w:numId w:val="2"/>
+        </w:numPr>
+        <w:spacing w:after="30" w:before="30"/>
+      </w:pPr>
+      <w:r>
+        <w:rPr>
+          <w:rFonts w:ascii="Calibri" w:cs="Calibri" w:eastAsia="Calibri" w:hAnsi="Calibri"/>
+          <w:color w:val="37474F"/>
+          <w:sz w:val="20"/>
+          <w:szCs w:val="20"/>
+        </w:rPr>
+        <w:t xml:space="preserve">Short-lived secret leases with automatic expiration</w:t>
+      </w:r>
+    </w:p>
+    <w:p>
+      <w:pPr>
+        <w:pStyle w:val="ListParagraph"/>
+        <w:numPr>
+          <w:ilvl w:val="0"/>
+          <w:numId w:val="2"/>
+        </w:numPr>
+        <w:spacing w:after="30" w:before="30"/>
+      </w:pPr>
+      <w:r>
+        <w:rPr>
+          <w:rFonts w:ascii="Calibri" w:cs="Calibri" w:eastAsia="Calibri" w:hAnsi="Calibri"/>
+          <w:color w:val="37474F"/>
+          <w:sz w:val="20"/>
+          <w:szCs w:val="20"/>
+        </w:rPr>
+        <w:t xml:space="preserve">Kubernetes External Secrets Operator for injecting secrets into pods at runtime</w:t>
+      </w:r>
+    </w:p>
+    <w:tbl>
+      <w:tblPr>
+        <w:tblW w:type="dxa" w:w="9360"/>
+        <w:tblBorders>
+          <w:top w:val="single" w:color="auto" w:sz="4"/>
+          <w:left w:val="single" w:color="auto" w:sz="4"/>
+          <w:bottom w:val="single" w:color="auto" w:sz="4"/>
+          <w:right w:val="single" w:color="auto" w:sz="4"/>
+          <w:insideH w:val="single" w:color="auto" w:sz="4"/>
+          <w:insideV w:val="single" w:color="auto" w:sz="4"/>
+        </w:tblBorders>
+      </w:tblPr>
+      <w:tblGrid>
+        <w:gridCol w:w="9360"/>
+      </w:tblGrid>
+      <w:tr>
+        <w:tc>
+          <w:tcPr>
+            <w:tcW w:type="dxa" w:w="9360"/>
+            <w:tcBorders>
+              <w:top w:val="single" w:color="CCCCCC" w:sz="1"/>
+              <w:left w:val="single" w:color="FF9900" w:sz="8"/>
+              <w:bottom w:val="single" w:color="CCCCCC" w:sz="1"/>
+              <w:right w:val="none" w:color="FFFFFF" w:sz="0"/>
+            </w:tcBorders>
+            <w:shd w:fill="F0F4F8" w:val="clear"/>
+            <w:tcMar>
+              <w:top w:type="dxa" w:w="80"/>
+              <w:left w:type="dxa" w:w="160"/>
+              <w:bottom w:type="dxa" w:w="80"/>
+              <w:right w:type="dxa" w:w="160"/>
+            </w:tcMar>
+          </w:tcPr>
+          <w:p>
+            <w:pPr>
+              <w:spacing w:after="0" w:before="0"/>
+            </w:pPr>
+            <w:r>
+              <w:rPr>
+                <w:rFonts w:ascii="Calibri" w:cs="Calibri" w:eastAsia="Calibri" w:hAnsi="Calibri"/>
+                <w:color w:val="37474F"/>
+                <w:sz w:val="19"/>
+                <w:szCs w:val="19"/>
+              </w:rPr>
+              <w:t xml:space="preserve">Outcome: Application credentials are short-lived and automatically rotated, significantly reducing credential exposure risk.</w:t>
+            </w:r>
+          </w:p>
+        </w:tc>
+      </w:tr>
+    </w:tbl>
+    <w:p>
+      <w:r>
+        <w:t xml:space="preserve"/>
+      </w:r>
+    </w:p>
+    <w:p>
+      <w:pPr>
         <w:pStyle w:val="Heading2"/>
       </w:pPr>
       <w:r>
@@ -2824,6 +3494,283 @@
     </w:p>
     <w:p>
       <w:pPr>
+        <w:pStyle w:val="Heading3"/>
+      </w:pPr>
+      <w:r>
+        <w:rPr>
+          <w:rFonts w:ascii="Arial" w:cs="Arial" w:eastAsia="Arial" w:hAnsi="Arial"/>
+          <w:b/>
+          <w:bCs/>
+          <w:color w:val="37474F"/>
+          <w:sz w:val="22"/>
+          <w:szCs w:val="22"/>
+        </w:rPr>
+        <w:t xml:space="preserve">2.4.1 Runtime Threat Detection</w:t>
+      </w:r>
+    </w:p>
+    <w:p>
+      <w:pPr>
+        <w:spacing w:after="100" w:before="60"/>
+      </w:pPr>
+      <w:r>
+        <w:rPr>
+          <w:rFonts w:ascii="Calibri" w:cs="Calibri" w:eastAsia="Calibri" w:hAnsi="Calibri"/>
+          <w:b w:val="false"/>
+          <w:bCs w:val="false"/>
+          <w:i w:val="false"/>
+          <w:iCs w:val="false"/>
+          <w:color w:val="37474F"/>
+          <w:sz w:val="22"/>
+          <w:szCs w:val="22"/>
+        </w:rPr>
+        <w:t xml:space="preserve">Traditional log-based detection mechanisms identify threats after malicious activity has already occurred. Runtime security platforms monitor system behavior within active workloads to detect attacks in real time.</w:t>
+      </w:r>
+    </w:p>
+    <w:p>
+      <w:pPr>
+        <w:spacing w:after="100" w:before="60"/>
+      </w:pPr>
+      <w:r>
+        <w:rPr>
+          <w:rFonts w:ascii="Calibri" w:cs="Calibri" w:eastAsia="Calibri" w:hAnsi="Calibri"/>
+          <w:b w:val="false"/>
+          <w:bCs w:val="false"/>
+          <w:i w:val="false"/>
+          <w:iCs w:val="false"/>
+          <w:color w:val="37474F"/>
+          <w:sz w:val="22"/>
+          <w:szCs w:val="22"/>
+        </w:rPr>
+        <w:t xml:space="preserve">Key capabilities:</w:t>
+      </w:r>
+    </w:p>
+    <w:p>
+      <w:pPr>
+        <w:pStyle w:val="ListParagraph"/>
+        <w:numPr>
+          <w:ilvl w:val="0"/>
+          <w:numId w:val="2"/>
+        </w:numPr>
+        <w:spacing w:after="30" w:before="30"/>
+      </w:pPr>
+      <w:r>
+        <w:rPr>
+          <w:rFonts w:ascii="Calibri" w:cs="Calibri" w:eastAsia="Calibri" w:hAnsi="Calibri"/>
+          <w:color w:val="37474F"/>
+          <w:sz w:val="20"/>
+          <w:szCs w:val="20"/>
+        </w:rPr>
+        <w:t xml:space="preserve">Container runtime monitoring (system call auditing at kernel level)</w:t>
+      </w:r>
+    </w:p>
+    <w:p>
+      <w:pPr>
+        <w:pStyle w:val="ListParagraph"/>
+        <w:numPr>
+          <w:ilvl w:val="0"/>
+          <w:numId w:val="2"/>
+        </w:numPr>
+        <w:spacing w:after="30" w:before="30"/>
+      </w:pPr>
+      <w:r>
+        <w:rPr>
+          <w:rFonts w:ascii="Calibri" w:cs="Calibri" w:eastAsia="Calibri" w:hAnsi="Calibri"/>
+          <w:color w:val="37474F"/>
+          <w:sz w:val="20"/>
+          <w:szCs w:val="20"/>
+        </w:rPr>
+        <w:t xml:space="preserve">Detection of container escape attempts</w:t>
+      </w:r>
+    </w:p>
+    <w:p>
+      <w:pPr>
+        <w:pStyle w:val="ListParagraph"/>
+        <w:numPr>
+          <w:ilvl w:val="0"/>
+          <w:numId w:val="2"/>
+        </w:numPr>
+        <w:spacing w:after="30" w:before="30"/>
+      </w:pPr>
+      <w:r>
+        <w:rPr>
+          <w:rFonts w:ascii="Calibri" w:cs="Calibri" w:eastAsia="Calibri" w:hAnsi="Calibri"/>
+          <w:color w:val="37474F"/>
+          <w:sz w:val="20"/>
+          <w:szCs w:val="20"/>
+        </w:rPr>
+        <w:t xml:space="preserve">Detection of cryptocurrency mining and malicious processes</w:t>
+      </w:r>
+    </w:p>
+    <w:p>
+      <w:pPr>
+        <w:pStyle w:val="ListParagraph"/>
+        <w:numPr>
+          <w:ilvl w:val="0"/>
+          <w:numId w:val="2"/>
+        </w:numPr>
+        <w:spacing w:after="30" w:before="30"/>
+      </w:pPr>
+      <w:r>
+        <w:rPr>
+          <w:rFonts w:ascii="Calibri" w:cs="Calibri" w:eastAsia="Calibri" w:hAnsi="Calibri"/>
+          <w:color w:val="37474F"/>
+          <w:sz w:val="20"/>
+          <w:szCs w:val="20"/>
+        </w:rPr>
+        <w:t xml:space="preserve">Behavioral anomaly detection for workloads</w:t>
+      </w:r>
+    </w:p>
+    <w:p>
+      <w:pPr>
+        <w:spacing w:after="100" w:before="60"/>
+      </w:pPr>
+      <w:r>
+        <w:rPr>
+          <w:rFonts w:ascii="Calibri" w:cs="Calibri" w:eastAsia="Calibri" w:hAnsi="Calibri"/>
+          <w:b w:val="false"/>
+          <w:bCs w:val="false"/>
+          <w:i w:val="false"/>
+          <w:iCs w:val="false"/>
+          <w:color w:val="37474F"/>
+          <w:sz w:val="22"/>
+          <w:szCs w:val="22"/>
+        </w:rPr>
+        <w:t xml:space="preserve">Example technologies:</w:t>
+      </w:r>
+    </w:p>
+    <w:p>
+      <w:pPr>
+        <w:pStyle w:val="ListParagraph"/>
+        <w:numPr>
+          <w:ilvl w:val="0"/>
+          <w:numId w:val="2"/>
+        </w:numPr>
+        <w:spacing w:after="30" w:before="30"/>
+      </w:pPr>
+      <w:r>
+        <w:rPr>
+          <w:rFonts w:ascii="Calibri" w:cs="Calibri" w:eastAsia="Calibri" w:hAnsi="Calibri"/>
+          <w:color w:val="37474F"/>
+          <w:sz w:val="20"/>
+          <w:szCs w:val="20"/>
+        </w:rPr>
+        <w:t xml:space="preserve">Falco runtime security (CNCF graduated project; eBPF or kernel module)</w:t>
+      </w:r>
+    </w:p>
+    <w:p>
+      <w:pPr>
+        <w:pStyle w:val="ListParagraph"/>
+        <w:numPr>
+          <w:ilvl w:val="0"/>
+          <w:numId w:val="2"/>
+        </w:numPr>
+        <w:spacing w:after="30" w:before="30"/>
+      </w:pPr>
+      <w:r>
+        <w:rPr>
+          <w:rFonts w:ascii="Calibri" w:cs="Calibri" w:eastAsia="Calibri" w:hAnsi="Calibri"/>
+          <w:color w:val="37474F"/>
+          <w:sz w:val="20"/>
+          <w:szCs w:val="20"/>
+        </w:rPr>
+        <w:t xml:space="preserve">AWS GuardDuty Runtime Monitoring (EKS and EC2)</w:t>
+      </w:r>
+    </w:p>
+    <w:p>
+      <w:pPr>
+        <w:pStyle w:val="ListParagraph"/>
+        <w:numPr>
+          <w:ilvl w:val="0"/>
+          <w:numId w:val="2"/>
+        </w:numPr>
+        <w:spacing w:after="30" w:before="30"/>
+      </w:pPr>
+      <w:r>
+        <w:rPr>
+          <w:rFonts w:ascii="Calibri" w:cs="Calibri" w:eastAsia="Calibri" w:hAnsi="Calibri"/>
+          <w:color w:val="37474F"/>
+          <w:sz w:val="20"/>
+          <w:szCs w:val="20"/>
+        </w:rPr>
+        <w:t xml:space="preserve">Microsoft Defender for Containers (runtime behavioral analysis)</w:t>
+      </w:r>
+    </w:p>
+    <w:p>
+      <w:pPr>
+        <w:pStyle w:val="ListParagraph"/>
+        <w:numPr>
+          <w:ilvl w:val="0"/>
+          <w:numId w:val="2"/>
+        </w:numPr>
+        <w:spacing w:after="30" w:before="30"/>
+      </w:pPr>
+      <w:r>
+        <w:rPr>
+          <w:rFonts w:ascii="Calibri" w:cs="Calibri" w:eastAsia="Calibri" w:hAnsi="Calibri"/>
+          <w:color w:val="37474F"/>
+          <w:sz w:val="20"/>
+          <w:szCs w:val="20"/>
+        </w:rPr>
+        <w:t xml:space="preserve">eBPF-based sensors: Tetragon (Cilium), Tracee (Aqua)</w:t>
+      </w:r>
+    </w:p>
+    <w:tbl>
+      <w:tblPr>
+        <w:tblW w:type="dxa" w:w="9360"/>
+        <w:tblBorders>
+          <w:top w:val="single" w:color="auto" w:sz="4"/>
+          <w:left w:val="single" w:color="auto" w:sz="4"/>
+          <w:bottom w:val="single" w:color="auto" w:sz="4"/>
+          <w:right w:val="single" w:color="auto" w:sz="4"/>
+          <w:insideH w:val="single" w:color="auto" w:sz="4"/>
+          <w:insideV w:val="single" w:color="auto" w:sz="4"/>
+        </w:tblBorders>
+      </w:tblPr>
+      <w:tblGrid>
+        <w:gridCol w:w="9360"/>
+      </w:tblGrid>
+      <w:tr>
+        <w:tc>
+          <w:tcPr>
+            <w:tcW w:type="dxa" w:w="9360"/>
+            <w:tcBorders>
+              <w:top w:val="single" w:color="CCCCCC" w:sz="1"/>
+              <w:left w:val="single" w:color="C62828" w:sz="8"/>
+              <w:bottom w:val="single" w:color="CCCCCC" w:sz="1"/>
+              <w:right w:val="none" w:color="FFFFFF" w:sz="0"/>
+            </w:tcBorders>
+            <w:shd w:fill="F0F4F8" w:val="clear"/>
+            <w:tcMar>
+              <w:top w:type="dxa" w:w="80"/>
+              <w:left w:type="dxa" w:w="160"/>
+              <w:bottom w:type="dxa" w:w="80"/>
+              <w:right w:type="dxa" w:w="160"/>
+            </w:tcMar>
+          </w:tcPr>
+          <w:p>
+            <w:pPr>
+              <w:spacing w:after="0" w:before="0"/>
+            </w:pPr>
+            <w:r>
+              <w:rPr>
+                <w:rFonts w:ascii="Calibri" w:cs="Calibri" w:eastAsia="Calibri" w:hAnsi="Calibri"/>
+                <w:color w:val="37474F"/>
+                <w:sz w:val="19"/>
+                <w:szCs w:val="19"/>
+              </w:rPr>
+              <w:t xml:space="preserve">Outcome: Threats are detected during execution rather than after log ingestion, reducing mean time to detect (MTTD) significantly.</w:t>
+            </w:r>
+          </w:p>
+        </w:tc>
+      </w:tr>
+    </w:tbl>
+    <w:p>
+      <w:r>
+        <w:t xml:space="preserve"/>
+      </w:r>
+    </w:p>
+    <w:p>
+      <w:pPr>
         <w:pStyle w:val="Heading2"/>
       </w:pPr>
       <w:r>
@@ -2940,6 +3887,264 @@
     </w:p>
     <w:p>
       <w:pPr>
+        <w:pStyle w:val="Heading3"/>
+      </w:pPr>
+      <w:r>
+        <w:rPr>
+          <w:rFonts w:ascii="Arial" w:cs="Arial" w:eastAsia="Arial" w:hAnsi="Arial"/>
+          <w:b/>
+          <w:bCs/>
+          <w:color w:val="37474F"/>
+          <w:sz w:val="22"/>
+          <w:szCs w:val="22"/>
+        </w:rPr>
+        <w:t xml:space="preserve">2.5.1 Software Supply Chain Security</w:t>
+      </w:r>
+    </w:p>
+    <w:p>
+      <w:pPr>
+        <w:spacing w:after="100" w:before="60"/>
+      </w:pPr>
+      <w:r>
+        <w:rPr>
+          <w:rFonts w:ascii="Calibri" w:cs="Calibri" w:eastAsia="Calibri" w:hAnsi="Calibri"/>
+          <w:b w:val="false"/>
+          <w:bCs w:val="false"/>
+          <w:i w:val="false"/>
+          <w:iCs w:val="false"/>
+          <w:color w:val="37474F"/>
+          <w:sz w:val="22"/>
+          <w:szCs w:val="22"/>
+        </w:rPr>
+        <w:t xml:space="preserve">Modern cloud environments depend heavily on third-party dependencies and automated build pipelines. Compromise of the software supply chain can introduce malicious code into production workloads without triggering traditional security controls.</w:t>
+      </w:r>
+    </w:p>
+    <w:p>
+      <w:pPr>
+        <w:spacing w:after="100" w:before="60"/>
+      </w:pPr>
+      <w:r>
+        <w:rPr>
+          <w:rFonts w:ascii="Calibri" w:cs="Calibri" w:eastAsia="Calibri" w:hAnsi="Calibri"/>
+          <w:b w:val="false"/>
+          <w:bCs w:val="false"/>
+          <w:i w:val="false"/>
+          <w:iCs w:val="false"/>
+          <w:color w:val="37474F"/>
+          <w:sz w:val="22"/>
+          <w:szCs w:val="22"/>
+        </w:rPr>
+        <w:t xml:space="preserve">Required controls:</w:t>
+      </w:r>
+    </w:p>
+    <w:p>
+      <w:pPr>
+        <w:pStyle w:val="ListParagraph"/>
+        <w:numPr>
+          <w:ilvl w:val="0"/>
+          <w:numId w:val="2"/>
+        </w:numPr>
+        <w:spacing w:after="30" w:before="30"/>
+      </w:pPr>
+      <w:r>
+        <w:rPr>
+          <w:rFonts w:ascii="Calibri" w:cs="Calibri" w:eastAsia="Calibri" w:hAnsi="Calibri"/>
+          <w:color w:val="37474F"/>
+          <w:sz w:val="20"/>
+          <w:szCs w:val="20"/>
+        </w:rPr>
+        <w:t xml:space="preserve">Software Bill of Materials (SBOM) generation during builds (CycloneDX or SPDX format)</w:t>
+      </w:r>
+    </w:p>
+    <w:p>
+      <w:pPr>
+        <w:pStyle w:val="ListParagraph"/>
+        <w:numPr>
+          <w:ilvl w:val="0"/>
+          <w:numId w:val="2"/>
+        </w:numPr>
+        <w:spacing w:after="30" w:before="30"/>
+      </w:pPr>
+      <w:r>
+        <w:rPr>
+          <w:rFonts w:ascii="Calibri" w:cs="Calibri" w:eastAsia="Calibri" w:hAnsi="Calibri"/>
+          <w:color w:val="37474F"/>
+          <w:sz w:val="20"/>
+          <w:szCs w:val="20"/>
+        </w:rPr>
+        <w:t xml:space="preserve">Signed container images and artifacts using asymmetric keys</w:t>
+      </w:r>
+    </w:p>
+    <w:p>
+      <w:pPr>
+        <w:pStyle w:val="ListParagraph"/>
+        <w:numPr>
+          <w:ilvl w:val="0"/>
+          <w:numId w:val="2"/>
+        </w:numPr>
+        <w:spacing w:after="30" w:before="30"/>
+      </w:pPr>
+      <w:r>
+        <w:rPr>
+          <w:rFonts w:ascii="Calibri" w:cs="Calibri" w:eastAsia="Calibri" w:hAnsi="Calibri"/>
+          <w:color w:val="37474F"/>
+          <w:sz w:val="20"/>
+          <w:szCs w:val="20"/>
+        </w:rPr>
+        <w:t xml:space="preserve">Provenance verification for build pipelines before deployment</w:t>
+      </w:r>
+    </w:p>
+    <w:p>
+      <w:pPr>
+        <w:pStyle w:val="ListParagraph"/>
+        <w:numPr>
+          <w:ilvl w:val="0"/>
+          <w:numId w:val="2"/>
+        </w:numPr>
+        <w:spacing w:after="30" w:before="30"/>
+      </w:pPr>
+      <w:r>
+        <w:rPr>
+          <w:rFonts w:ascii="Calibri" w:cs="Calibri" w:eastAsia="Calibri" w:hAnsi="Calibri"/>
+          <w:color w:val="37474F"/>
+          <w:sz w:val="20"/>
+          <w:szCs w:val="20"/>
+        </w:rPr>
+        <w:t xml:space="preserve">Dependency vulnerability scanning in CI/CD (SCA: Snyk, OWASP Dependency-Check, GitHub Dependabot)</w:t>
+      </w:r>
+    </w:p>
+    <w:p>
+      <w:pPr>
+        <w:spacing w:after="100" w:before="60"/>
+      </w:pPr>
+      <w:r>
+        <w:rPr>
+          <w:rFonts w:ascii="Calibri" w:cs="Calibri" w:eastAsia="Calibri" w:hAnsi="Calibri"/>
+          <w:b w:val="false"/>
+          <w:bCs w:val="false"/>
+          <w:i w:val="false"/>
+          <w:iCs w:val="false"/>
+          <w:color w:val="37474F"/>
+          <w:sz w:val="22"/>
+          <w:szCs w:val="22"/>
+        </w:rPr>
+        <w:t xml:space="preserve">Standards and tools:</w:t>
+      </w:r>
+    </w:p>
+    <w:p>
+      <w:pPr>
+        <w:pStyle w:val="ListParagraph"/>
+        <w:numPr>
+          <w:ilvl w:val="0"/>
+          <w:numId w:val="2"/>
+        </w:numPr>
+        <w:spacing w:after="30" w:before="30"/>
+      </w:pPr>
+      <w:r>
+        <w:rPr>
+          <w:rFonts w:ascii="Calibri" w:cs="Calibri" w:eastAsia="Calibri" w:hAnsi="Calibri"/>
+          <w:color w:val="37474F"/>
+          <w:sz w:val="20"/>
+          <w:szCs w:val="20"/>
+        </w:rPr>
+        <w:t xml:space="preserve">SLSA (Supply chain Levels for Software Artifacts) framework: target SLSA Level 3 for production builds</w:t>
+      </w:r>
+    </w:p>
+    <w:p>
+      <w:pPr>
+        <w:pStyle w:val="ListParagraph"/>
+        <w:numPr>
+          <w:ilvl w:val="0"/>
+          <w:numId w:val="2"/>
+        </w:numPr>
+        <w:spacing w:after="30" w:before="30"/>
+      </w:pPr>
+      <w:r>
+        <w:rPr>
+          <w:rFonts w:ascii="Calibri" w:cs="Calibri" w:eastAsia="Calibri" w:hAnsi="Calibri"/>
+          <w:color w:val="37474F"/>
+          <w:sz w:val="20"/>
+          <w:szCs w:val="20"/>
+        </w:rPr>
+        <w:t xml:space="preserve">Sigstore / Cosign: keyless artifact signing using OIDC identity</w:t>
+      </w:r>
+    </w:p>
+    <w:p>
+      <w:pPr>
+        <w:pStyle w:val="ListParagraph"/>
+        <w:numPr>
+          <w:ilvl w:val="0"/>
+          <w:numId w:val="2"/>
+        </w:numPr>
+        <w:spacing w:after="30" w:before="30"/>
+      </w:pPr>
+      <w:r>
+        <w:rPr>
+          <w:rFonts w:ascii="Calibri" w:cs="Calibri" w:eastAsia="Calibri" w:hAnsi="Calibri"/>
+          <w:color w:val="37474F"/>
+          <w:sz w:val="20"/>
+          <w:szCs w:val="20"/>
+        </w:rPr>
+        <w:t xml:space="preserve">in-toto attestation framework: cryptographically verify each step in the build pipeline</w:t>
+      </w:r>
+    </w:p>
+    <w:tbl>
+      <w:tblPr>
+        <w:tblW w:type="dxa" w:w="9360"/>
+        <w:tblBorders>
+          <w:top w:val="single" w:color="auto" w:sz="4"/>
+          <w:left w:val="single" w:color="auto" w:sz="4"/>
+          <w:bottom w:val="single" w:color="auto" w:sz="4"/>
+          <w:right w:val="single" w:color="auto" w:sz="4"/>
+          <w:insideH w:val="single" w:color="auto" w:sz="4"/>
+          <w:insideV w:val="single" w:color="auto" w:sz="4"/>
+        </w:tblBorders>
+      </w:tblPr>
+      <w:tblGrid>
+        <w:gridCol w:w="9360"/>
+      </w:tblGrid>
+      <w:tr>
+        <w:tc>
+          <w:tcPr>
+            <w:tcW w:type="dxa" w:w="9360"/>
+            <w:tcBorders>
+              <w:top w:val="single" w:color="CCCCCC" w:sz="1"/>
+              <w:left w:val="single" w:color="2E7D32" w:sz="8"/>
+              <w:bottom w:val="single" w:color="CCCCCC" w:sz="1"/>
+              <w:right w:val="none" w:color="FFFFFF" w:sz="0"/>
+            </w:tcBorders>
+            <w:shd w:fill="F0F4F8" w:val="clear"/>
+            <w:tcMar>
+              <w:top w:type="dxa" w:w="80"/>
+              <w:left w:type="dxa" w:w="160"/>
+              <w:bottom w:type="dxa" w:w="80"/>
+              <w:right w:type="dxa" w:w="160"/>
+            </w:tcMar>
+          </w:tcPr>
+          <w:p>
+            <w:pPr>
+              <w:spacing w:after="0" w:before="0"/>
+            </w:pPr>
+            <w:r>
+              <w:rPr>
+                <w:rFonts w:ascii="Calibri" w:cs="Calibri" w:eastAsia="Calibri" w:hAnsi="Calibri"/>
+                <w:color w:val="37474F"/>
+                <w:sz w:val="19"/>
+                <w:szCs w:val="19"/>
+              </w:rPr>
+              <w:t xml:space="preserve">Outcome: All deployed artifacts are cryptographically verifiable and traceable to a trusted build pipeline. Compromised dependencies are detected before reaching production.</w:t>
+            </w:r>
+          </w:p>
+        </w:tc>
+      </w:tr>
+    </w:tbl>
+    <w:p>
+      <w:r>
+        <w:t xml:space="preserve"/>
+      </w:r>
+    </w:p>
+    <w:p>
+      <w:pPr>
         <w:pStyle w:val="Heading1"/>
         <w:pageBreakBefore/>
       </w:pPr>
@@ -4383,6 +5588,302 @@
         <w:t xml:space="preserve">Cost Management: budget alerts at 80% and 100% per subscription. Anomaly alerts on tagged resources. Regular idle resource cleanup.</w:t>
       </w:r>
     </w:p>
+    <w:p>
+      <w:r>
+        <w:t xml:space="preserve"/>
+      </w:r>
+    </w:p>
+    <w:p>
+      <w:pPr>
+        <w:pStyle w:val="Heading2"/>
+      </w:pPr>
+      <w:r>
+        <w:rPr>
+          <w:rFonts w:ascii="Arial" w:cs="Arial" w:eastAsia="Arial" w:hAnsi="Arial"/>
+          <w:b/>
+          <w:bCs/>
+          <w:color w:val="1565C0"/>
+          <w:sz w:val="26"/>
+          <w:szCs w:val="26"/>
+        </w:rPr>
+        <w:t xml:space="preserve">3.6 Data Security Posture Management (DSPM)</w:t>
+      </w:r>
+    </w:p>
+    <w:p>
+      <w:pPr>
+        <w:spacing w:after="100" w:before="60"/>
+      </w:pPr>
+      <w:r>
+        <w:rPr>
+          <w:rFonts w:ascii="Calibri" w:cs="Calibri" w:eastAsia="Calibri" w:hAnsi="Calibri"/>
+          <w:b w:val="false"/>
+          <w:bCs w:val="false"/>
+          <w:i w:val="false"/>
+          <w:iCs w:val="false"/>
+          <w:color w:val="37474F"/>
+          <w:sz w:val="22"/>
+          <w:szCs w:val="22"/>
+        </w:rPr>
+        <w:t xml:space="preserve">Sensitive data often proliferates across cloud storage systems, databases, and data lakes without centralized visibility. DSPM platforms continuously discover and classify sensitive data across cloud environments to reduce exposure risk.</w:t>
+      </w:r>
+    </w:p>
+    <w:p>
+      <w:pPr>
+        <w:spacing w:after="100" w:before="60"/>
+      </w:pPr>
+      <w:r>
+        <w:rPr>
+          <w:rFonts w:ascii="Calibri" w:cs="Calibri" w:eastAsia="Calibri" w:hAnsi="Calibri"/>
+          <w:b w:val="false"/>
+          <w:bCs w:val="false"/>
+          <w:i w:val="false"/>
+          <w:iCs w:val="false"/>
+          <w:color w:val="37474F"/>
+          <w:sz w:val="22"/>
+          <w:szCs w:val="22"/>
+        </w:rPr>
+        <w:t xml:space="preserve">Controls:</w:t>
+      </w:r>
+    </w:p>
+    <w:p>
+      <w:pPr>
+        <w:pStyle w:val="ListParagraph"/>
+        <w:numPr>
+          <w:ilvl w:val="0"/>
+          <w:numId w:val="2"/>
+        </w:numPr>
+        <w:spacing w:after="30" w:before="30"/>
+      </w:pPr>
+      <w:r>
+        <w:rPr>
+          <w:rFonts w:ascii="Calibri" w:cs="Calibri" w:eastAsia="Calibri" w:hAnsi="Calibri"/>
+          <w:color w:val="37474F"/>
+          <w:sz w:val="20"/>
+          <w:szCs w:val="20"/>
+        </w:rPr>
+        <w:t xml:space="preserve">Automated discovery of sensitive data in storage accounts, databases, and data lake services</w:t>
+      </w:r>
+    </w:p>
+    <w:p>
+      <w:pPr>
+        <w:pStyle w:val="ListParagraph"/>
+        <w:numPr>
+          <w:ilvl w:val="0"/>
+          <w:numId w:val="2"/>
+        </w:numPr>
+        <w:spacing w:after="30" w:before="30"/>
+      </w:pPr>
+      <w:r>
+        <w:rPr>
+          <w:rFonts w:ascii="Calibri" w:cs="Calibri" w:eastAsia="Calibri" w:hAnsi="Calibri"/>
+          <w:color w:val="37474F"/>
+          <w:sz w:val="20"/>
+          <w:szCs w:val="20"/>
+        </w:rPr>
+        <w:t xml:space="preserve">Classification of PII, PCI, PHI, and regulated datasets with risk scoring</w:t>
+      </w:r>
+    </w:p>
+    <w:p>
+      <w:pPr>
+        <w:pStyle w:val="ListParagraph"/>
+        <w:numPr>
+          <w:ilvl w:val="0"/>
+          <w:numId w:val="2"/>
+        </w:numPr>
+        <w:spacing w:after="30" w:before="30"/>
+      </w:pPr>
+      <w:r>
+        <w:rPr>
+          <w:rFonts w:ascii="Calibri" w:cs="Calibri" w:eastAsia="Calibri" w:hAnsi="Calibri"/>
+          <w:color w:val="37474F"/>
+          <w:sz w:val="20"/>
+          <w:szCs w:val="20"/>
+        </w:rPr>
+        <w:t xml:space="preserve">Continuous monitoring for exposed or over-permissioned sensitive data</w:t>
+      </w:r>
+    </w:p>
+    <w:p>
+      <w:pPr>
+        <w:pStyle w:val="ListParagraph"/>
+        <w:numPr>
+          <w:ilvl w:val="0"/>
+          <w:numId w:val="2"/>
+        </w:numPr>
+        <w:spacing w:after="30" w:before="30"/>
+      </w:pPr>
+      <w:r>
+        <w:rPr>
+          <w:rFonts w:ascii="Calibri" w:cs="Calibri" w:eastAsia="Calibri" w:hAnsi="Calibri"/>
+          <w:color w:val="37474F"/>
+          <w:sz w:val="20"/>
+          <w:szCs w:val="20"/>
+        </w:rPr>
+        <w:t xml:space="preserve">Enforcement of encryption and access controls on data with high classification</w:t>
+      </w:r>
+    </w:p>
+    <w:p>
+      <w:pPr>
+        <w:pStyle w:val="ListParagraph"/>
+        <w:numPr>
+          <w:ilvl w:val="0"/>
+          <w:numId w:val="2"/>
+        </w:numPr>
+        <w:spacing w:after="30" w:before="30"/>
+      </w:pPr>
+      <w:r>
+        <w:rPr>
+          <w:rFonts w:ascii="Calibri" w:cs="Calibri" w:eastAsia="Calibri" w:hAnsi="Calibri"/>
+          <w:color w:val="37474F"/>
+          <w:sz w:val="20"/>
+          <w:szCs w:val="20"/>
+        </w:rPr>
+        <w:t xml:space="preserve">Data flow mapping: understand where sensitive data moves across environments</w:t>
+      </w:r>
+    </w:p>
+    <w:p>
+      <w:pPr>
+        <w:spacing w:after="100" w:before="60"/>
+      </w:pPr>
+      <w:r>
+        <w:rPr>
+          <w:rFonts w:ascii="Calibri" w:cs="Calibri" w:eastAsia="Calibri" w:hAnsi="Calibri"/>
+          <w:b w:val="false"/>
+          <w:bCs w:val="false"/>
+          <w:i w:val="false"/>
+          <w:iCs w:val="false"/>
+          <w:color w:val="37474F"/>
+          <w:sz w:val="22"/>
+          <w:szCs w:val="22"/>
+        </w:rPr>
+        <w:t xml:space="preserve">Example technologies:</w:t>
+      </w:r>
+    </w:p>
+    <w:p>
+      <w:pPr>
+        <w:pStyle w:val="ListParagraph"/>
+        <w:numPr>
+          <w:ilvl w:val="0"/>
+          <w:numId w:val="2"/>
+        </w:numPr>
+        <w:spacing w:after="30" w:before="30"/>
+      </w:pPr>
+      <w:r>
+        <w:rPr>
+          <w:rFonts w:ascii="Calibri" w:cs="Calibri" w:eastAsia="Calibri" w:hAnsi="Calibri"/>
+          <w:color w:val="37474F"/>
+          <w:sz w:val="20"/>
+          <w:szCs w:val="20"/>
+        </w:rPr>
+        <w:t xml:space="preserve">Microsoft Purview (native Azure DSPM + DLP)</w:t>
+      </w:r>
+    </w:p>
+    <w:p>
+      <w:pPr>
+        <w:pStyle w:val="ListParagraph"/>
+        <w:numPr>
+          <w:ilvl w:val="0"/>
+          <w:numId w:val="2"/>
+        </w:numPr>
+        <w:spacing w:after="30" w:before="30"/>
+      </w:pPr>
+      <w:r>
+        <w:rPr>
+          <w:rFonts w:ascii="Calibri" w:cs="Calibri" w:eastAsia="Calibri" w:hAnsi="Calibri"/>
+          <w:color w:val="37474F"/>
+          <w:sz w:val="20"/>
+          <w:szCs w:val="20"/>
+        </w:rPr>
+        <w:t xml:space="preserve">Amazon Macie (S3-focused sensitive data discovery)</w:t>
+      </w:r>
+    </w:p>
+    <w:p>
+      <w:pPr>
+        <w:pStyle w:val="ListParagraph"/>
+        <w:numPr>
+          <w:ilvl w:val="0"/>
+          <w:numId w:val="2"/>
+        </w:numPr>
+        <w:spacing w:after="30" w:before="30"/>
+      </w:pPr>
+      <w:r>
+        <w:rPr>
+          <w:rFonts w:ascii="Calibri" w:cs="Calibri" w:eastAsia="Calibri" w:hAnsi="Calibri"/>
+          <w:color w:val="37474F"/>
+          <w:sz w:val="20"/>
+          <w:szCs w:val="20"/>
+        </w:rPr>
+        <w:t xml:space="preserve">Google Cloud DLP / Sensitive Data Protection</w:t>
+      </w:r>
+    </w:p>
+    <w:p>
+      <w:pPr>
+        <w:pStyle w:val="ListParagraph"/>
+        <w:numPr>
+          <w:ilvl w:val="0"/>
+          <w:numId w:val="2"/>
+        </w:numPr>
+        <w:spacing w:after="30" w:before="30"/>
+      </w:pPr>
+      <w:r>
+        <w:rPr>
+          <w:rFonts w:ascii="Calibri" w:cs="Calibri" w:eastAsia="Calibri" w:hAnsi="Calibri"/>
+          <w:color w:val="37474F"/>
+          <w:sz w:val="20"/>
+          <w:szCs w:val="20"/>
+        </w:rPr>
+        <w:t xml:space="preserve">Wiz DSPM (multi-cloud data risk visibility)</w:t>
+      </w:r>
+    </w:p>
+    <w:tbl>
+      <w:tblPr>
+        <w:tblW w:type="dxa" w:w="9360"/>
+        <w:tblBorders>
+          <w:top w:val="single" w:color="auto" w:sz="4"/>
+          <w:left w:val="single" w:color="auto" w:sz="4"/>
+          <w:bottom w:val="single" w:color="auto" w:sz="4"/>
+          <w:right w:val="single" w:color="auto" w:sz="4"/>
+          <w:insideH w:val="single" w:color="auto" w:sz="4"/>
+          <w:insideV w:val="single" w:color="auto" w:sz="4"/>
+        </w:tblBorders>
+      </w:tblPr>
+      <w:tblGrid>
+        <w:gridCol w:w="9360"/>
+      </w:tblGrid>
+      <w:tr>
+        <w:tc>
+          <w:tcPr>
+            <w:tcW w:type="dxa" w:w="9360"/>
+            <w:tcBorders>
+              <w:top w:val="single" w:color="CCCCCC" w:sz="1"/>
+              <w:left w:val="single" w:color="4285F4" w:sz="8"/>
+              <w:bottom w:val="single" w:color="CCCCCC" w:sz="1"/>
+              <w:right w:val="none" w:color="FFFFFF" w:sz="0"/>
+            </w:tcBorders>
+            <w:shd w:fill="F0F4F8" w:val="clear"/>
+            <w:tcMar>
+              <w:top w:type="dxa" w:w="80"/>
+              <w:left w:type="dxa" w:w="160"/>
+              <w:bottom w:type="dxa" w:w="80"/>
+              <w:right w:type="dxa" w:w="160"/>
+            </w:tcMar>
+          </w:tcPr>
+          <w:p>
+            <w:pPr>
+              <w:spacing w:after="0" w:before="0"/>
+            </w:pPr>
+            <w:r>
+              <w:rPr>
+                <w:rFonts w:ascii="Calibri" w:cs="Calibri" w:eastAsia="Calibri" w:hAnsi="Calibri"/>
+                <w:color w:val="37474F"/>
+                <w:sz w:val="19"/>
+                <w:szCs w:val="19"/>
+              </w:rPr>
+              <w:t xml:space="preserve">Outcome: Security teams maintain continuous visibility into sensitive data risk across the cloud estate, enabling proactive remediation of data exposure before it becomes a breach.</w:t>
+            </w:r>
+          </w:p>
+        </w:tc>
+      </w:tr>
+    </w:tbl>
     <w:p>
       <w:r>
         <w:t xml:space="preserve"/>
@@ -11734,6 +13235,600 @@
                 <w:szCs w:val="19"/>
               </w:rPr>
               <w:t xml:space="preserve">&lt; 48 hours for Critical; &lt; 7 days for High severity</w:t>
+            </w:r>
+          </w:p>
+        </w:tc>
+      </w:tr>
+    </w:tbl>
+    <w:p>
+      <w:r>
+        <w:t xml:space="preserve"/>
+      </w:r>
+    </w:p>
+    <w:p>
+      <w:pPr>
+        <w:pStyle w:val="Heading1"/>
+        <w:pageBreakBefore/>
+      </w:pPr>
+      <w:r>
+        <w:rPr>
+          <w:rFonts w:ascii="Arial" w:cs="Arial" w:eastAsia="Arial" w:hAnsi="Arial"/>
+          <w:b/>
+          <w:bCs/>
+          <w:color w:val="0F4C75"/>
+          <w:sz w:val="32"/>
+          <w:szCs w:val="32"/>
+        </w:rPr>
+        <w:t xml:space="preserve">9. AI Security and LLM Governance</w:t>
+      </w:r>
+    </w:p>
+    <w:p>
+      <w:pPr>
+        <w:spacing w:after="100" w:before="60"/>
+      </w:pPr>
+      <w:r>
+        <w:rPr>
+          <w:rFonts w:ascii="Calibri" w:cs="Calibri" w:eastAsia="Calibri" w:hAnsi="Calibri"/>
+          <w:b w:val="false"/>
+          <w:bCs w:val="false"/>
+          <w:i w:val="false"/>
+          <w:iCs w:val="false"/>
+          <w:color w:val="37474F"/>
+          <w:sz w:val="22"/>
+          <w:szCs w:val="22"/>
+        </w:rPr>
+        <w:t xml:space="preserve">Artificial intelligence systems introduce new attack surfaces including prompt injection, data leakage, model manipulation, and training data poisoning. Organizations deploying AI services — including large language models (LLMs), ML inference endpoints, and AI-powered features — must implement dedicated security controls.</w:t>
+      </w:r>
+    </w:p>
+    <w:p>
+      <w:pPr>
+        <w:spacing w:after="100" w:before="60"/>
+      </w:pPr>
+      <w:r>
+        <w:rPr>
+          <w:rFonts w:ascii="Calibri" w:cs="Calibri" w:eastAsia="Calibri" w:hAnsi="Calibri"/>
+          <w:b w:val="false"/>
+          <w:bCs w:val="false"/>
+          <w:i w:val="false"/>
+          <w:iCs w:val="false"/>
+          <w:color w:val="37474F"/>
+          <w:sz w:val="22"/>
+          <w:szCs w:val="22"/>
+        </w:rPr>
+        <w:t xml:space="preserve">Key controls:</w:t>
+      </w:r>
+    </w:p>
+    <w:p>
+      <w:pPr>
+        <w:pStyle w:val="ListParagraph"/>
+        <w:numPr>
+          <w:ilvl w:val="0"/>
+          <w:numId w:val="2"/>
+        </w:numPr>
+        <w:spacing w:after="30" w:before="30"/>
+      </w:pPr>
+      <w:r>
+        <w:rPr>
+          <w:rFonts w:ascii="Calibri" w:cs="Calibri" w:eastAsia="Calibri" w:hAnsi="Calibri"/>
+          <w:color w:val="37474F"/>
+          <w:sz w:val="20"/>
+          <w:szCs w:val="20"/>
+        </w:rPr>
+        <w:t xml:space="preserve">Strict access control for AI model APIs: authentication, rate limiting, and input/output logging</w:t>
+      </w:r>
+    </w:p>
+    <w:p>
+      <w:pPr>
+        <w:pStyle w:val="ListParagraph"/>
+        <w:numPr>
+          <w:ilvl w:val="0"/>
+          <w:numId w:val="2"/>
+        </w:numPr>
+        <w:spacing w:after="30" w:before="30"/>
+      </w:pPr>
+      <w:r>
+        <w:rPr>
+          <w:rFonts w:ascii="Calibri" w:cs="Calibri" w:eastAsia="Calibri" w:hAnsi="Calibri"/>
+          <w:color w:val="37474F"/>
+          <w:sz w:val="20"/>
+          <w:szCs w:val="20"/>
+        </w:rPr>
+        <w:t xml:space="preserve">Prompt injection detection and filtering: validate and sanitize all user-supplied inputs before sending to LLM</w:t>
+      </w:r>
+    </w:p>
+    <w:p>
+      <w:pPr>
+        <w:pStyle w:val="ListParagraph"/>
+        <w:numPr>
+          <w:ilvl w:val="0"/>
+          <w:numId w:val="2"/>
+        </w:numPr>
+        <w:spacing w:after="30" w:before="30"/>
+      </w:pPr>
+      <w:r>
+        <w:rPr>
+          <w:rFonts w:ascii="Calibri" w:cs="Calibri" w:eastAsia="Calibri" w:hAnsi="Calibri"/>
+          <w:color w:val="37474F"/>
+          <w:sz w:val="20"/>
+          <w:szCs w:val="20"/>
+        </w:rPr>
+        <w:t xml:space="preserve">Monitoring of model outputs for sensitive data exposure (PII, credentials, system prompt leakage)</w:t>
+      </w:r>
+    </w:p>
+    <w:p>
+      <w:pPr>
+        <w:pStyle w:val="ListParagraph"/>
+        <w:numPr>
+          <w:ilvl w:val="0"/>
+          <w:numId w:val="2"/>
+        </w:numPr>
+        <w:spacing w:after="30" w:before="30"/>
+      </w:pPr>
+      <w:r>
+        <w:rPr>
+          <w:rFonts w:ascii="Calibri" w:cs="Calibri" w:eastAsia="Calibri" w:hAnsi="Calibri"/>
+          <w:color w:val="37474F"/>
+          <w:sz w:val="20"/>
+          <w:szCs w:val="20"/>
+        </w:rPr>
+        <w:t xml:space="preserve">Red-team testing of AI systems for adversarial prompts, jailbreaking, and indirect prompt injection</w:t>
+      </w:r>
+    </w:p>
+    <w:p>
+      <w:pPr>
+        <w:pStyle w:val="ListParagraph"/>
+        <w:numPr>
+          <w:ilvl w:val="0"/>
+          <w:numId w:val="2"/>
+        </w:numPr>
+        <w:spacing w:after="30" w:before="30"/>
+      </w:pPr>
+      <w:r>
+        <w:rPr>
+          <w:rFonts w:ascii="Calibri" w:cs="Calibri" w:eastAsia="Calibri" w:hAnsi="Calibri"/>
+          <w:color w:val="37474F"/>
+          <w:sz w:val="20"/>
+          <w:szCs w:val="20"/>
+        </w:rPr>
+        <w:t xml:space="preserve">Data isolation: ensure fine-tuning and RAG data pipelines cannot exfiltrate sensitive training data</w:t>
+      </w:r>
+    </w:p>
+    <w:p>
+      <w:pPr>
+        <w:pStyle w:val="ListParagraph"/>
+        <w:numPr>
+          <w:ilvl w:val="0"/>
+          <w:numId w:val="2"/>
+        </w:numPr>
+        <w:spacing w:after="30" w:before="30"/>
+      </w:pPr>
+      <w:r>
+        <w:rPr>
+          <w:rFonts w:ascii="Calibri" w:cs="Calibri" w:eastAsia="Calibri" w:hAnsi="Calibri"/>
+          <w:color w:val="37474F"/>
+          <w:sz w:val="20"/>
+          <w:szCs w:val="20"/>
+        </w:rPr>
+        <w:t xml:space="preserve">Least-privilege access for AI agents: restrict tool use and external actions to minimum required scope</w:t>
+      </w:r>
+    </w:p>
+    <w:p>
+      <w:pPr>
+        <w:spacing w:after="100" w:before="60"/>
+      </w:pPr>
+      <w:r>
+        <w:rPr>
+          <w:rFonts w:ascii="Calibri" w:cs="Calibri" w:eastAsia="Calibri" w:hAnsi="Calibri"/>
+          <w:b w:val="false"/>
+          <w:bCs w:val="false"/>
+          <w:i w:val="false"/>
+          <w:iCs w:val="false"/>
+          <w:color w:val="37474F"/>
+          <w:sz w:val="22"/>
+          <w:szCs w:val="22"/>
+        </w:rPr>
+        <w:t xml:space="preserve">Recommended frameworks:</w:t>
+      </w:r>
+    </w:p>
+    <w:p>
+      <w:pPr>
+        <w:pStyle w:val="ListParagraph"/>
+        <w:numPr>
+          <w:ilvl w:val="0"/>
+          <w:numId w:val="2"/>
+        </w:numPr>
+        <w:spacing w:after="30" w:before="30"/>
+      </w:pPr>
+      <w:r>
+        <w:rPr>
+          <w:rFonts w:ascii="Calibri" w:cs="Calibri" w:eastAsia="Calibri" w:hAnsi="Calibri"/>
+          <w:color w:val="37474F"/>
+          <w:sz w:val="20"/>
+          <w:szCs w:val="20"/>
+        </w:rPr>
+        <w:t xml:space="preserve">OWASP Top 10 for LLM Applications: LLM01 Prompt Injection through LLM10 Model Theft</w:t>
+      </w:r>
+    </w:p>
+    <w:p>
+      <w:pPr>
+        <w:pStyle w:val="ListParagraph"/>
+        <w:numPr>
+          <w:ilvl w:val="0"/>
+          <w:numId w:val="2"/>
+        </w:numPr>
+        <w:spacing w:after="30" w:before="30"/>
+      </w:pPr>
+      <w:r>
+        <w:rPr>
+          <w:rFonts w:ascii="Calibri" w:cs="Calibri" w:eastAsia="Calibri" w:hAnsi="Calibri"/>
+          <w:color w:val="37474F"/>
+          <w:sz w:val="20"/>
+          <w:szCs w:val="20"/>
+        </w:rPr>
+        <w:t xml:space="preserve">NIST AI Risk Management Framework (AI RMF 1.0): Govern, Map, Measure, Manage</w:t>
+      </w:r>
+    </w:p>
+    <w:p>
+      <w:pPr>
+        <w:pStyle w:val="ListParagraph"/>
+        <w:numPr>
+          <w:ilvl w:val="0"/>
+          <w:numId w:val="2"/>
+        </w:numPr>
+        <w:spacing w:after="30" w:before="30"/>
+      </w:pPr>
+      <w:r>
+        <w:rPr>
+          <w:rFonts w:ascii="Calibri" w:cs="Calibri" w:eastAsia="Calibri" w:hAnsi="Calibri"/>
+          <w:color w:val="37474F"/>
+          <w:sz w:val="20"/>
+          <w:szCs w:val="20"/>
+        </w:rPr>
+        <w:t xml:space="preserve">MITRE ATLAS: adversarial threat landscape for AI systems</w:t>
+      </w:r>
+    </w:p>
+    <w:tbl>
+      <w:tblPr>
+        <w:tblW w:type="dxa" w:w="9360"/>
+        <w:tblBorders>
+          <w:top w:val="single" w:color="auto" w:sz="4"/>
+          <w:left w:val="single" w:color="auto" w:sz="4"/>
+          <w:bottom w:val="single" w:color="auto" w:sz="4"/>
+          <w:right w:val="single" w:color="auto" w:sz="4"/>
+          <w:insideH w:val="single" w:color="auto" w:sz="4"/>
+          <w:insideV w:val="single" w:color="auto" w:sz="4"/>
+        </w:tblBorders>
+      </w:tblPr>
+      <w:tblGrid>
+        <w:gridCol w:w="9360"/>
+      </w:tblGrid>
+      <w:tr>
+        <w:tc>
+          <w:tcPr>
+            <w:tcW w:type="dxa" w:w="9360"/>
+            <w:tcBorders>
+              <w:top w:val="single" w:color="CCCCCC" w:sz="1"/>
+              <w:left w:val="single" w:color="F4A261" w:sz="8"/>
+              <w:bottom w:val="single" w:color="CCCCCC" w:sz="1"/>
+              <w:right w:val="none" w:color="FFFFFF" w:sz="0"/>
+            </w:tcBorders>
+            <w:shd w:fill="F0F4F8" w:val="clear"/>
+            <w:tcMar>
+              <w:top w:type="dxa" w:w="80"/>
+              <w:left w:type="dxa" w:w="160"/>
+              <w:bottom w:type="dxa" w:w="80"/>
+              <w:right w:type="dxa" w:w="160"/>
+            </w:tcMar>
+          </w:tcPr>
+          <w:p>
+            <w:pPr>
+              <w:spacing w:after="0" w:before="0"/>
+            </w:pPr>
+            <w:r>
+              <w:rPr>
+                <w:rFonts w:ascii="Calibri" w:cs="Calibri" w:eastAsia="Calibri" w:hAnsi="Calibri"/>
+                <w:color w:val="37474F"/>
+                <w:sz w:val="19"/>
+                <w:szCs w:val="19"/>
+              </w:rPr>
+              <w:t xml:space="preserve">Outcome: AI capabilities are deployed with security guardrails that mitigate emerging AI-specific threats while enabling productive use of AI services.</w:t>
+            </w:r>
+          </w:p>
+        </w:tc>
+      </w:tr>
+    </w:tbl>
+    <w:p>
+      <w:r>
+        <w:t xml:space="preserve"/>
+      </w:r>
+    </w:p>
+    <w:p>
+      <w:pPr>
+        <w:pStyle w:val="Heading1"/>
+        <w:pageBreakBefore/>
+      </w:pPr>
+      <w:r>
+        <w:rPr>
+          <w:rFonts w:ascii="Arial" w:cs="Arial" w:eastAsia="Arial" w:hAnsi="Arial"/>
+          <w:b/>
+          <w:bCs/>
+          <w:color w:val="0F4C75"/>
+          <w:sz w:val="32"/>
+          <w:szCs w:val="32"/>
+        </w:rPr>
+        <w:t xml:space="preserve">10. Cloud Attack Path Analysis</w:t>
+      </w:r>
+    </w:p>
+    <w:p>
+      <w:pPr>
+        <w:spacing w:after="100" w:before="60"/>
+      </w:pPr>
+      <w:r>
+        <w:rPr>
+          <w:rFonts w:ascii="Calibri" w:cs="Calibri" w:eastAsia="Calibri" w:hAnsi="Calibri"/>
+          <w:b w:val="false"/>
+          <w:bCs w:val="false"/>
+          <w:i w:val="false"/>
+          <w:iCs w:val="false"/>
+          <w:color w:val="37474F"/>
+          <w:sz w:val="22"/>
+          <w:szCs w:val="22"/>
+        </w:rPr>
+        <w:t xml:space="preserve">Individual security controls and misconfiguration findings do not always reveal the full impact of an attack. A single exposed credential, overly permissive role, or misconfigured resource may be exploitable only when combined with other weaknesses in a chain. Attack path analysis identifies these exploitable privilege escalation chains across identities, resources, and permissions in cloud environments.</w:t>
+      </w:r>
+    </w:p>
+    <w:p>
+      <w:pPr>
+        <w:spacing w:after="100" w:before="60"/>
+      </w:pPr>
+      <w:r>
+        <w:rPr>
+          <w:rFonts w:ascii="Calibri" w:cs="Calibri" w:eastAsia="Calibri" w:hAnsi="Calibri"/>
+          <w:b w:val="false"/>
+          <w:bCs w:val="false"/>
+          <w:i w:val="false"/>
+          <w:iCs w:val="false"/>
+          <w:color w:val="37474F"/>
+          <w:sz w:val="22"/>
+          <w:szCs w:val="22"/>
+        </w:rPr>
+        <w:t xml:space="preserve">Controls:</w:t>
+      </w:r>
+    </w:p>
+    <w:p>
+      <w:pPr>
+        <w:pStyle w:val="ListParagraph"/>
+        <w:numPr>
+          <w:ilvl w:val="0"/>
+          <w:numId w:val="2"/>
+        </w:numPr>
+        <w:spacing w:after="30" w:before="30"/>
+      </w:pPr>
+      <w:r>
+        <w:rPr>
+          <w:rFonts w:ascii="Calibri" w:cs="Calibri" w:eastAsia="Calibri" w:hAnsi="Calibri"/>
+          <w:color w:val="37474F"/>
+          <w:sz w:val="20"/>
+          <w:szCs w:val="20"/>
+        </w:rPr>
+        <w:t xml:space="preserve">Graph-based identity relationship analysis: map trust relationships between roles, service accounts, and resources</w:t>
+      </w:r>
+    </w:p>
+    <w:p>
+      <w:pPr>
+        <w:pStyle w:val="ListParagraph"/>
+        <w:numPr>
+          <w:ilvl w:val="0"/>
+          <w:numId w:val="2"/>
+        </w:numPr>
+        <w:spacing w:after="30" w:before="30"/>
+      </w:pPr>
+      <w:r>
+        <w:rPr>
+          <w:rFonts w:ascii="Calibri" w:cs="Calibri" w:eastAsia="Calibri" w:hAnsi="Calibri"/>
+          <w:color w:val="37474F"/>
+          <w:sz w:val="20"/>
+          <w:szCs w:val="20"/>
+        </w:rPr>
+        <w:t xml:space="preserve">Detection of privilege escalation paths: identify chains where a low-privilege identity can reach high-privilege resources</w:t>
+      </w:r>
+    </w:p>
+    <w:p>
+      <w:pPr>
+        <w:pStyle w:val="ListParagraph"/>
+        <w:numPr>
+          <w:ilvl w:val="0"/>
+          <w:numId w:val="2"/>
+        </w:numPr>
+        <w:spacing w:after="30" w:before="30"/>
+      </w:pPr>
+      <w:r>
+        <w:rPr>
+          <w:rFonts w:ascii="Calibri" w:cs="Calibri" w:eastAsia="Calibri" w:hAnsi="Calibri"/>
+          <w:color w:val="37474F"/>
+          <w:sz w:val="20"/>
+          <w:szCs w:val="20"/>
+        </w:rPr>
+        <w:t xml:space="preserve">Visualization of lateral movement opportunities across accounts and cloud boundaries</w:t>
+      </w:r>
+    </w:p>
+    <w:p>
+      <w:pPr>
+        <w:pStyle w:val="ListParagraph"/>
+        <w:numPr>
+          <w:ilvl w:val="0"/>
+          <w:numId w:val="2"/>
+        </w:numPr>
+        <w:spacing w:after="30" w:before="30"/>
+      </w:pPr>
+      <w:r>
+        <w:rPr>
+          <w:rFonts w:ascii="Calibri" w:cs="Calibri" w:eastAsia="Calibri" w:hAnsi="Calibri"/>
+          <w:color w:val="37474F"/>
+          <w:sz w:val="20"/>
+          <w:szCs w:val="20"/>
+        </w:rPr>
+        <w:t xml:space="preserve">Prioritization by exploitability: distinguish theoretical misconfiguration from actively exploitable attack paths</w:t>
+      </w:r>
+    </w:p>
+    <w:p>
+      <w:pPr>
+        <w:pStyle w:val="ListParagraph"/>
+        <w:numPr>
+          <w:ilvl w:val="0"/>
+          <w:numId w:val="2"/>
+        </w:numPr>
+        <w:spacing w:after="30" w:before="30"/>
+      </w:pPr>
+      <w:r>
+        <w:rPr>
+          <w:rFonts w:ascii="Calibri" w:cs="Calibri" w:eastAsia="Calibri" w:hAnsi="Calibri"/>
+          <w:color w:val="37474F"/>
+          <w:sz w:val="20"/>
+          <w:szCs w:val="20"/>
+        </w:rPr>
+        <w:t xml:space="preserve">Continuous re-evaluation as identity bindings, permissions, and resource configurations change</w:t>
+      </w:r>
+    </w:p>
+    <w:p>
+      <w:pPr>
+        <w:spacing w:after="100" w:before="60"/>
+      </w:pPr>
+      <w:r>
+        <w:rPr>
+          <w:rFonts w:ascii="Calibri" w:cs="Calibri" w:eastAsia="Calibri" w:hAnsi="Calibri"/>
+          <w:b w:val="false"/>
+          <w:bCs w:val="false"/>
+          <w:i w:val="false"/>
+          <w:iCs w:val="false"/>
+          <w:color w:val="37474F"/>
+          <w:sz w:val="22"/>
+          <w:szCs w:val="22"/>
+        </w:rPr>
+        <w:t xml:space="preserve">Example technologies:</w:t>
+      </w:r>
+    </w:p>
+    <w:p>
+      <w:pPr>
+        <w:pStyle w:val="ListParagraph"/>
+        <w:numPr>
+          <w:ilvl w:val="0"/>
+          <w:numId w:val="2"/>
+        </w:numPr>
+        <w:spacing w:after="30" w:before="30"/>
+      </w:pPr>
+      <w:r>
+        <w:rPr>
+          <w:rFonts w:ascii="Calibri" w:cs="Calibri" w:eastAsia="Calibri" w:hAnsi="Calibri"/>
+          <w:color w:val="37474F"/>
+          <w:sz w:val="20"/>
+          <w:szCs w:val="20"/>
+        </w:rPr>
+        <w:t xml:space="preserve">Wiz Security Graph: graph-based attack path analysis across AWS, Azure, GCP, Kubernetes</w:t>
+      </w:r>
+    </w:p>
+    <w:p>
+      <w:pPr>
+        <w:pStyle w:val="ListParagraph"/>
+        <w:numPr>
+          <w:ilvl w:val="0"/>
+          <w:numId w:val="2"/>
+        </w:numPr>
+        <w:spacing w:after="30" w:before="30"/>
+      </w:pPr>
+      <w:r>
+        <w:rPr>
+          <w:rFonts w:ascii="Calibri" w:cs="Calibri" w:eastAsia="Calibri" w:hAnsi="Calibri"/>
+          <w:color w:val="37474F"/>
+          <w:sz w:val="20"/>
+          <w:szCs w:val="20"/>
+        </w:rPr>
+        <w:t xml:space="preserve">Microsoft Defender for Cloud attack path analysis (built into Defender CSPM Premium)</w:t>
+      </w:r>
+    </w:p>
+    <w:p>
+      <w:pPr>
+        <w:pStyle w:val="ListParagraph"/>
+        <w:numPr>
+          <w:ilvl w:val="0"/>
+          <w:numId w:val="2"/>
+        </w:numPr>
+        <w:spacing w:after="30" w:before="30"/>
+      </w:pPr>
+      <w:r>
+        <w:rPr>
+          <w:rFonts w:ascii="Calibri" w:cs="Calibri" w:eastAsia="Calibri" w:hAnsi="Calibri"/>
+          <w:color w:val="37474F"/>
+          <w:sz w:val="20"/>
+          <w:szCs w:val="20"/>
+        </w:rPr>
+        <w:t xml:space="preserve">BloodHound Enterprise: identity attack paths including cloud IAM and hybrid AD/Azure environments</w:t>
+      </w:r>
+    </w:p>
+    <w:p>
+      <w:pPr>
+        <w:pStyle w:val="ListParagraph"/>
+        <w:numPr>
+          <w:ilvl w:val="0"/>
+          <w:numId w:val="2"/>
+        </w:numPr>
+        <w:spacing w:after="30" w:before="30"/>
+      </w:pPr>
+      <w:r>
+        <w:rPr>
+          <w:rFonts w:ascii="Calibri" w:cs="Calibri" w:eastAsia="Calibri" w:hAnsi="Calibri"/>
+          <w:color w:val="37474F"/>
+          <w:sz w:val="20"/>
+          <w:szCs w:val="20"/>
+        </w:rPr>
+        <w:t xml:space="preserve">IAM Access Analyzer (AWS): automated detection of privilege escalation paths within AWS IAM</w:t>
+      </w:r>
+    </w:p>
+    <w:tbl>
+      <w:tblPr>
+        <w:tblW w:type="dxa" w:w="9360"/>
+        <w:tblBorders>
+          <w:top w:val="single" w:color="auto" w:sz="4"/>
+          <w:left w:val="single" w:color="auto" w:sz="4"/>
+          <w:bottom w:val="single" w:color="auto" w:sz="4"/>
+          <w:right w:val="single" w:color="auto" w:sz="4"/>
+          <w:insideH w:val="single" w:color="auto" w:sz="4"/>
+          <w:insideV w:val="single" w:color="auto" w:sz="4"/>
+        </w:tblBorders>
+      </w:tblPr>
+      <w:tblGrid>
+        <w:gridCol w:w="9360"/>
+      </w:tblGrid>
+      <w:tr>
+        <w:tc>
+          <w:tcPr>
+            <w:tcW w:type="dxa" w:w="9360"/>
+            <w:tcBorders>
+              <w:top w:val="single" w:color="CCCCCC" w:sz="1"/>
+              <w:left w:val="single" w:color="0F4C75" w:sz="8"/>
+              <w:bottom w:val="single" w:color="CCCCCC" w:sz="1"/>
+              <w:right w:val="none" w:color="FFFFFF" w:sz="0"/>
+            </w:tcBorders>
+            <w:shd w:fill="F0F4F8" w:val="clear"/>
+            <w:tcMar>
+              <w:top w:type="dxa" w:w="80"/>
+              <w:left w:type="dxa" w:w="160"/>
+              <w:bottom w:type="dxa" w:w="80"/>
+              <w:right w:type="dxa" w:w="160"/>
+            </w:tcMar>
+          </w:tcPr>
+          <w:p>
+            <w:pPr>
+              <w:spacing w:after="0" w:before="0"/>
+            </w:pPr>
+            <w:r>
+              <w:rPr>
+                <w:rFonts w:ascii="Calibri" w:cs="Calibri" w:eastAsia="Calibri" w:hAnsi="Calibri"/>
+                <w:color w:val="37474F"/>
+                <w:sz w:val="19"/>
+                <w:szCs w:val="19"/>
+              </w:rPr>
+              <w:t xml:space="preserve">Outcome: Security teams gain visibility into realistic, exploitable attack chains rather than isolated configuration issues. Remediation effort is focused on the paths that matter.</w:t>
             </w:r>
           </w:p>
         </w:tc>

</xml_diff>

<commit_message>
Refine cloud security doc: precision corrections and new Section 11
- Fix MITRE ATT&CK naming to 'MITRE ATT&CK for Cloud' throughout
- Soften prescriptive absolutes: private endpoints, encryption, wildcards
- Tighten AWS section opener, IRSA/STS sentence, CloudHSM language
- Narrow VPC Endpoints list to high-risk services
- Update Network Firewall bullet to include third-party appliances
- Soften AWS-managed keys statement (regulatory framing)
- Soften Secrets Manager mandate to include HashiCorp Vault
- Add service mesh operational complexity caveat
- Add operational sustainability principle in Core Security Principles
- Add Section 11: Operational Security Metrics (IAM, Detection,
  Data Protection, Supply Chain tables with targets and SLAs)
Result: 731 paragraphs, 21 tables
</commit_message>
<xml_diff>
--- a/Cloud/cloud_security_architecture.docx
+++ b/Cloud/cloud_security_architecture.docx
@@ -200,7 +200,7 @@
           <w:sz w:val="22"/>
           <w:szCs w:val="22"/>
         </w:rPr>
-        <w:t xml:space="preserve">Cloud security is not a product you buy — it is an architecture you design. This reference document provides prescriptive, technically-detailed security controls for Amazon Web Services (AWS), Microsoft Azure, and Google Cloud Platform (GCP), covering identity and access management, network security, data protection, detection and response, and governance.</w:t>
+        <w:t xml:space="preserve">Cloud security is not a single product. It is an architecture composed of identity controls, network isolation, secure software delivery, and continuous detection. This reference document provides prescriptive, technically-detailed security controls for Amazon Web Services (AWS), Microsoft Azure, and Google Cloud Platform (GCP), covering identity and access management, network security, data protection, detection and response, and governance.</w:t>
       </w:r>
     </w:p>
     <w:p>
@@ -218,7 +218,7 @@
           <w:sz w:val="22"/>
           <w:szCs w:val="22"/>
         </w:rPr>
-        <w:t xml:space="preserve">The foundational posture is Zero Trust: no implicit trust based on network location. Every request, API call, and workload interaction must be authenticated, authorized, and continuously validated. The controls in this document are mapped to MITRE ATT&amp;CK Cloud and NIST SP 800-53 Rev 5 to support compliance reporting and threat modeling.</w:t>
+        <w:t xml:space="preserve">The foundational posture is Zero Trust: no implicit trust based on network location. Every request, API call, and workload interaction must be authenticated, authorized, and continuously validated. The controls in this document are mapped to MITRE ATT&amp;CK for Cloud and NIST SP 800-53 Rev 5 to support compliance reporting and threat modeling.</w:t>
       </w:r>
     </w:p>
     <w:p>
@@ -277,26 +277,26 @@
           <w:sz w:val="20"/>
           <w:szCs w:val="20"/>
         </w:rPr>
-        <w:t xml:space="preserve">Private by default. All cloud services accessed via private endpoints. No public IPs on compute, storage, or databases unless explicitly justified.</w:t>
-      </w:r>
-    </w:p>
-    <w:p>
-      <w:pPr>
-        <w:pStyle w:val="ListParagraph"/>
-        <w:numPr>
-          <w:ilvl w:val="0"/>
-          <w:numId w:val="2"/>
-        </w:numPr>
-        <w:spacing w:after="30" w:before="30"/>
-      </w:pPr>
-      <w:r>
-        <w:rPr>
-          <w:rFonts w:ascii="Calibri" w:cs="Calibri" w:eastAsia="Calibri" w:hAnsi="Calibri"/>
-          <w:color w:val="37474F"/>
-          <w:sz w:val="20"/>
-          <w:szCs w:val="20"/>
-        </w:rPr>
-        <w:t xml:space="preserve">Encrypt everything. Customer-managed keys (CMKs) on all data stores. TLS 1.2+ in transit. Secrets managed via dedicated vaults.</w:t>
+        <w:t xml:space="preserve">Private by default. Cloud services should be accessed through private endpoints whenever possible. Public exposure must be minimized and justified through documented exception processes.</w:t>
+      </w:r>
+    </w:p>
+    <w:p>
+      <w:pPr>
+        <w:pStyle w:val="ListParagraph"/>
+        <w:numPr>
+          <w:ilvl w:val="0"/>
+          <w:numId w:val="2"/>
+        </w:numPr>
+        <w:spacing w:after="30" w:before="30"/>
+      </w:pPr>
+      <w:r>
+        <w:rPr>
+          <w:rFonts w:ascii="Calibri" w:cs="Calibri" w:eastAsia="Calibri" w:hAnsi="Calibri"/>
+          <w:color w:val="37474F"/>
+          <w:sz w:val="20"/>
+          <w:szCs w:val="20"/>
+        </w:rPr>
+        <w:t xml:space="preserve">Encrypt all sensitive data. Use customer-managed keys (CMKs) where regulatory, operational, or separation-of-duty requirements apply. TLS 1.2+ in transit. Secrets managed via dedicated vaults.</w:t>
       </w:r>
     </w:p>
     <w:p>
@@ -394,6 +394,24 @@
           <w:szCs w:val="22"/>
         </w:rPr>
         <w:t xml:space="preserve">Software supply chain integrity is mandatory. All build artifacts must be generated through trusted CI/CD pipelines with signed provenance and verifiable build metadata.</w:t>
+      </w:r>
+    </w:p>
+    <w:p>
+      <w:pPr>
+        <w:spacing w:after="100" w:before="60"/>
+      </w:pPr>
+      <w:r>
+        <w:rPr>
+          <w:rFonts w:ascii="Calibri" w:cs="Calibri" w:eastAsia="Calibri" w:hAnsi="Calibri"/>
+          <w:b w:val="false"/>
+          <w:bCs w:val="false"/>
+          <w:i w:val="false"/>
+          <w:iCs w:val="false"/>
+          <w:color w:val="37474F"/>
+          <w:sz w:val="22"/>
+          <w:szCs w:val="22"/>
+        </w:rPr>
+        <w:t xml:space="preserve">Security controls must be operationally sustainable. Architectures that are too complex to operate consistently create their own risk surface. Automation, observability, and runbook clarity are security requirements, not operational afterthoughts. When a control cannot be maintained reliably at scale, it will degrade silently and fail at the worst time.</w:t>
       </w:r>
     </w:p>
     <w:p>
@@ -1596,7 +1614,7 @@
           <w:sz w:val="22"/>
           <w:szCs w:val="22"/>
         </w:rPr>
-        <w:t xml:space="preserve">AWS security relies on a layered control model: Service Control Policies (SCPs) establish org-wide guardrails, IAM roles govern workload permissions, VPC configurations enforce network isolation, and AWS-native detection services provide continuous threat visibility.</w:t>
+        <w:t xml:space="preserve">AWS security architecture relies on a layered control model combining organizational guardrails, identity controls, network segmentation, and centralized detection. Service Control Policies (SCPs) establish org-wide boundaries, IAM roles govern workload permissions, VPC configurations enforce network isolation, and AWS-native detection services provide continuous threat visibility.</w:t>
       </w:r>
     </w:p>
     <w:p>
@@ -1794,7 +1812,7 @@
           <w:sz w:val="22"/>
           <w:szCs w:val="22"/>
         </w:rPr>
-        <w:t xml:space="preserve">IAM Roles for Service Accounts (IRSA) binds a Kubernetes ServiceAccount to an IAM role via OIDC token federation. The pod receives short-lived credentials from the AWS STS service with no hardcoded keys.</w:t>
+        <w:t xml:space="preserve">IAM Roles for Service Accounts (IRSA) binds a Kubernetes ServiceAccount to an IAM role via OIDC token federation. The pod receives short-lived credentials issued by AWS STS through OIDC federation. No static credentials are stored in the workload.</w:t>
       </w:r>
     </w:p>
     <w:p>
@@ -2000,7 +2018,7 @@
           <w:sz w:val="20"/>
           <w:szCs w:val="20"/>
         </w:rPr>
-        <w:t xml:space="preserve">No wildcard (*) actions on production IAM roles; use specific service:Action pairs</w:t>
+        <w:t xml:space="preserve">Avoid wildcard (*) actions in production IAM roles unless explicitly required and documented through exception review; prefer specific service:Action pairs</w:t>
       </w:r>
     </w:p>
     <w:p>
@@ -2375,7 +2393,7 @@
           <w:sz w:val="20"/>
           <w:szCs w:val="20"/>
         </w:rPr>
-        <w:t xml:space="preserve">VPC Endpoints for all AWS services (S3, DynamoDB, SSM, KMS, Secrets Manager, ECR)</w:t>
+        <w:t xml:space="preserve">Use VPC endpoints for high-risk services such as S3, DynamoDB, SSM, ECR, Secrets Manager, and KMS to prevent data exfiltration via public internet paths</w:t>
       </w:r>
     </w:p>
     <w:p>
@@ -2501,7 +2519,7 @@
           <w:sz w:val="20"/>
           <w:szCs w:val="20"/>
         </w:rPr>
-        <w:t xml:space="preserve">AWS Network Firewall in inspection VPC for egress FQDN filtering.</w:t>
+        <w:t xml:space="preserve">AWS Network Firewall or third-party firewall appliances in an inspection VPC for controlled egress inspection and domain filtering.</w:t>
       </w:r>
     </w:p>
     <w:p>
@@ -2782,6 +2800,24 @@
       </w:tr>
     </w:tbl>
     <w:p>
+      <w:pPr>
+        <w:spacing w:after="100" w:before="60"/>
+      </w:pPr>
+      <w:r>
+        <w:rPr>
+          <w:rFonts w:ascii="Calibri" w:cs="Calibri" w:eastAsia="Calibri" w:hAnsi="Calibri"/>
+          <w:b w:val="false"/>
+          <w:bCs w:val="false"/>
+          <w:i w:val="false"/>
+          <w:iCs w:val="false"/>
+          <w:color w:val="37474F"/>
+          <w:sz w:val="22"/>
+          <w:szCs w:val="22"/>
+        </w:rPr>
+        <w:t xml:space="preserve">Service mesh adoption introduces operational complexity. Organizations should assess readiness in areas such as control plane reliability, certificate lifecycle management, observability tooling, and team expertise before mandating mesh across all workloads. Phased adoption starting with high-risk services is a common and pragmatic pattern.</w:t>
+      </w:r>
+    </w:p>
+    <w:p>
       <w:r>
         <w:t xml:space="preserve"/>
       </w:r>
@@ -2833,7 +2869,7 @@
           <w:sz w:val="22"/>
           <w:szCs w:val="22"/>
         </w:rPr>
-        <w:t xml:space="preserve">All data at rest must be encrypted with customer-managed keys (CMKs). AWS-managed keys are insufficient for regulated workloads because customers cannot control or audit key policy separately.</w:t>
+        <w:t xml:space="preserve">All data at rest must be encrypted. AWS-managed keys may be insufficient for regulated workloads requiring strict key ownership, separation of duties, or external auditability. Customer-managed keys (CMKs) provide the necessary control plane separation for those scenarios.</w:t>
       </w:r>
     </w:p>
     <w:p>
@@ -2909,7 +2945,7 @@
           <w:sz w:val="20"/>
           <w:szCs w:val="20"/>
         </w:rPr>
-        <w:t xml:space="preserve">CloudHSM cluster for FIPS 140-2 Level 3 hardware-backed keys (PCI DSS, FedRAMP High)</w:t>
+        <w:t xml:space="preserve">Use AWS CloudHSM for workloads requiring FIPS 140-2 Level 3 validated hardware key protection (PCI DSS, FedRAMP High)</w:t>
       </w:r>
     </w:p>
     <w:p>
@@ -3074,7 +3110,7 @@
           <w:sz w:val="20"/>
           <w:szCs w:val="20"/>
         </w:rPr>
-        <w:t xml:space="preserve">All application secrets (DB passwords, API keys, OAuth tokens) in Secrets Manager</w:t>
+        <w:t xml:space="preserve">Application secrets such as database credentials, API keys, and OAuth tokens should be stored in a dedicated secrets management system such as AWS Secrets Manager or HashiCorp Vault</w:t>
       </w:r>
     </w:p>
     <w:p>
@@ -8334,7 +8370,7 @@
           <w:sz w:val="32"/>
           <w:szCs w:val="32"/>
         </w:rPr>
-        <w:t xml:space="preserve">6. MITRE ATT&amp;CK Cloud Techniques</w:t>
+        <w:t xml:space="preserve">6. MITRE ATT&amp;CK for Cloud Techniques</w:t>
       </w:r>
     </w:p>
     <w:p>
@@ -8352,7 +8388,7 @@
           <w:sz w:val="22"/>
           <w:szCs w:val="22"/>
         </w:rPr>
-        <w:t xml:space="preserve">The following table maps key MITRE ATT&amp;CK Cloud techniques to their descriptions, affected providers, and recommended mitigations. These techniques represent the primary attack vectors in cloud environments.</w:t>
+        <w:t xml:space="preserve">The following table maps key MITRE ATT&amp;CK for Cloud techniques to their descriptions, affected providers, and recommended mitigations. These techniques represent the primary attack vectors in cloud environments.</w:t>
       </w:r>
     </w:p>
     <w:p>
@@ -13829,6 +13865,2039 @@
                 <w:szCs w:val="19"/>
               </w:rPr>
               <w:t xml:space="preserve">Outcome: Security teams gain visibility into realistic, exploitable attack chains rather than isolated configuration issues. Remediation effort is focused on the paths that matter.</w:t>
+            </w:r>
+          </w:p>
+        </w:tc>
+      </w:tr>
+    </w:tbl>
+    <w:p>
+      <w:r>
+        <w:t xml:space="preserve"/>
+      </w:r>
+    </w:p>
+    <w:p>
+      <w:pPr>
+        <w:pStyle w:val="Heading1"/>
+        <w:pageBreakBefore/>
+      </w:pPr>
+      <w:r>
+        <w:rPr>
+          <w:rFonts w:ascii="Arial" w:cs="Arial" w:eastAsia="Arial" w:hAnsi="Arial"/>
+          <w:b/>
+          <w:bCs/>
+          <w:color w:val="0F4C75"/>
+          <w:sz w:val="32"/>
+          <w:szCs w:val="32"/>
+        </w:rPr>
+        <w:t xml:space="preserve">11. Operational Security Metrics</w:t>
+      </w:r>
+    </w:p>
+    <w:p>
+      <w:pPr>
+        <w:spacing w:after="100" w:before="60"/>
+      </w:pPr>
+      <w:r>
+        <w:rPr>
+          <w:rFonts w:ascii="Calibri" w:cs="Calibri" w:eastAsia="Calibri" w:hAnsi="Calibri"/>
+          <w:b w:val="false"/>
+          <w:bCs w:val="false"/>
+          <w:i w:val="false"/>
+          <w:iCs w:val="false"/>
+          <w:color w:val="37474F"/>
+          <w:sz w:val="22"/>
+          <w:szCs w:val="22"/>
+        </w:rPr>
+        <w:t xml:space="preserve">Security programs that cannot be measured cannot be managed. The following metrics provide a baseline for evaluating the operational health of a cloud security architecture. Metrics should be tracked continuously, reviewed at least monthly, and tied to defined remediation SLAs.</w:t>
+      </w:r>
+    </w:p>
+    <w:p>
+      <w:r>
+        <w:t xml:space="preserve"/>
+      </w:r>
+    </w:p>
+    <w:p>
+      <w:pPr>
+        <w:pStyle w:val="Heading2"/>
+      </w:pPr>
+      <w:r>
+        <w:rPr>
+          <w:rFonts w:ascii="Arial" w:cs="Arial" w:eastAsia="Arial" w:hAnsi="Arial"/>
+          <w:b/>
+          <w:bCs/>
+          <w:color w:val="1565C0"/>
+          <w:sz w:val="26"/>
+          <w:szCs w:val="26"/>
+        </w:rPr>
+        <w:t xml:space="preserve">11.1 Identity and Access</w:t>
+      </w:r>
+    </w:p>
+    <w:tbl>
+      <w:tblPr>
+        <w:tblW w:type="dxa" w:w="9360"/>
+        <w:tblBorders>
+          <w:top w:val="single" w:color="auto" w:sz="4"/>
+          <w:left w:val="single" w:color="auto" w:sz="4"/>
+          <w:bottom w:val="single" w:color="auto" w:sz="4"/>
+          <w:right w:val="single" w:color="auto" w:sz="4"/>
+          <w:insideH w:val="single" w:color="auto" w:sz="4"/>
+          <w:insideV w:val="single" w:color="auto" w:sz="4"/>
+        </w:tblBorders>
+      </w:tblPr>
+      <w:tblGrid>
+        <w:gridCol w:w="3120"/>
+        <w:gridCol w:w="3120"/>
+        <w:gridCol w:w="3120"/>
+      </w:tblGrid>
+      <w:tr>
+        <w:tc>
+          <w:tcPr>
+            <w:tcW w:type="dxa" w:w="3120"/>
+            <w:tcBorders>
+              <w:top w:val="single" w:color="CCCCCC" w:sz="1"/>
+              <w:left w:val="single" w:color="CCCCCC" w:sz="1"/>
+              <w:bottom w:val="single" w:color="CCCCCC" w:sz="1"/>
+              <w:right w:val="single" w:color="CCCCCC" w:sz="1"/>
+            </w:tcBorders>
+            <w:shd w:fill="0F4C75" w:val="clear"/>
+            <w:tcMar>
+              <w:top w:type="dxa" w:w="60"/>
+              <w:left w:type="dxa" w:w="100"/>
+              <w:bottom w:type="dxa" w:w="60"/>
+              <w:right w:type="dxa" w:w="100"/>
+            </w:tcMar>
+          </w:tcPr>
+          <w:p>
+            <w:r>
+              <w:rPr>
+                <w:rFonts w:ascii="Arial" w:cs="Arial" w:eastAsia="Arial" w:hAnsi="Arial"/>
+                <w:b/>
+                <w:bCs/>
+                <w:color w:val="FFFFFF"/>
+                <w:sz w:val="19"/>
+                <w:szCs w:val="19"/>
+              </w:rPr>
+              <w:t xml:space="preserve">Metric</w:t>
+            </w:r>
+          </w:p>
+        </w:tc>
+        <w:tc>
+          <w:tcPr>
+            <w:tcW w:type="dxa" w:w="3120"/>
+            <w:tcBorders>
+              <w:top w:val="single" w:color="CCCCCC" w:sz="1"/>
+              <w:left w:val="single" w:color="CCCCCC" w:sz="1"/>
+              <w:bottom w:val="single" w:color="CCCCCC" w:sz="1"/>
+              <w:right w:val="single" w:color="CCCCCC" w:sz="1"/>
+            </w:tcBorders>
+            <w:shd w:fill="0F4C75" w:val="clear"/>
+            <w:tcMar>
+              <w:top w:type="dxa" w:w="60"/>
+              <w:left w:type="dxa" w:w="100"/>
+              <w:bottom w:type="dxa" w:w="60"/>
+              <w:right w:type="dxa" w:w="100"/>
+            </w:tcMar>
+          </w:tcPr>
+          <w:p>
+            <w:r>
+              <w:rPr>
+                <w:rFonts w:ascii="Arial" w:cs="Arial" w:eastAsia="Arial" w:hAnsi="Arial"/>
+                <w:b/>
+                <w:bCs/>
+                <w:color w:val="FFFFFF"/>
+                <w:sz w:val="19"/>
+                <w:szCs w:val="19"/>
+              </w:rPr>
+              <w:t xml:space="preserve">Target</w:t>
+            </w:r>
+          </w:p>
+        </w:tc>
+        <w:tc>
+          <w:tcPr>
+            <w:tcW w:type="dxa" w:w="3120"/>
+            <w:tcBorders>
+              <w:top w:val="single" w:color="CCCCCC" w:sz="1"/>
+              <w:left w:val="single" w:color="CCCCCC" w:sz="1"/>
+              <w:bottom w:val="single" w:color="CCCCCC" w:sz="1"/>
+              <w:right w:val="single" w:color="CCCCCC" w:sz="1"/>
+            </w:tcBorders>
+            <w:shd w:fill="0F4C75" w:val="clear"/>
+            <w:tcMar>
+              <w:top w:type="dxa" w:w="60"/>
+              <w:left w:type="dxa" w:w="100"/>
+              <w:bottom w:type="dxa" w:w="60"/>
+              <w:right w:type="dxa" w:w="100"/>
+            </w:tcMar>
+          </w:tcPr>
+          <w:p>
+            <w:r>
+              <w:rPr>
+                <w:rFonts w:ascii="Arial" w:cs="Arial" w:eastAsia="Arial" w:hAnsi="Arial"/>
+                <w:b/>
+                <w:bCs/>
+                <w:color w:val="FFFFFF"/>
+                <w:sz w:val="19"/>
+                <w:szCs w:val="19"/>
+              </w:rPr>
+              <w:t xml:space="preserve">Notes</w:t>
+            </w:r>
+          </w:p>
+        </w:tc>
+      </w:tr>
+      <w:tr>
+        <w:tc>
+          <w:tcPr>
+            <w:tcW w:type="dxa" w:w="3120"/>
+            <w:tcBorders>
+              <w:top w:val="single" w:color="CCCCCC" w:sz="1"/>
+              <w:left w:val="single" w:color="CCCCCC" w:sz="1"/>
+              <w:bottom w:val="single" w:color="CCCCCC" w:sz="1"/>
+              <w:right w:val="single" w:color="CCCCCC" w:sz="1"/>
+            </w:tcBorders>
+            <w:shd w:fill="F5F6FA" w:val="clear"/>
+            <w:tcMar>
+              <w:top w:type="dxa" w:w="60"/>
+              <w:left w:type="dxa" w:w="100"/>
+              <w:bottom w:type="dxa" w:w="60"/>
+              <w:right w:type="dxa" w:w="100"/>
+            </w:tcMar>
+          </w:tcPr>
+          <w:p>
+            <w:r>
+              <w:rPr>
+                <w:rFonts w:ascii="Calibri" w:cs="Calibri" w:eastAsia="Calibri" w:hAnsi="Calibri"/>
+                <w:b/>
+                <w:bCs/>
+                <w:color w:val="37474F"/>
+                <w:sz w:val="18"/>
+                <w:szCs w:val="18"/>
+              </w:rPr>
+              <w:t xml:space="preserve">Human accounts with MFA enforced</w:t>
+            </w:r>
+          </w:p>
+        </w:tc>
+        <w:tc>
+          <w:tcPr>
+            <w:tcW w:type="dxa" w:w="3120"/>
+            <w:tcBorders>
+              <w:top w:val="single" w:color="CCCCCC" w:sz="1"/>
+              <w:left w:val="single" w:color="CCCCCC" w:sz="1"/>
+              <w:bottom w:val="single" w:color="CCCCCC" w:sz="1"/>
+              <w:right w:val="single" w:color="CCCCCC" w:sz="1"/>
+            </w:tcBorders>
+            <w:shd w:fill="F5F6FA" w:val="clear"/>
+            <w:tcMar>
+              <w:top w:type="dxa" w:w="60"/>
+              <w:left w:type="dxa" w:w="100"/>
+              <w:bottom w:type="dxa" w:w="60"/>
+              <w:right w:type="dxa" w:w="100"/>
+            </w:tcMar>
+          </w:tcPr>
+          <w:p>
+            <w:r>
+              <w:rPr>
+                <w:rFonts w:ascii="Calibri" w:cs="Calibri" w:eastAsia="Calibri" w:hAnsi="Calibri"/>
+                <w:b w:val="false"/>
+                <w:bCs w:val="false"/>
+                <w:color w:val="37474F"/>
+                <w:sz w:val="18"/>
+                <w:szCs w:val="18"/>
+              </w:rPr>
+              <w:t xml:space="preserve">100%</w:t>
+            </w:r>
+          </w:p>
+        </w:tc>
+        <w:tc>
+          <w:tcPr>
+            <w:tcW w:type="dxa" w:w="3120"/>
+            <w:tcBorders>
+              <w:top w:val="single" w:color="CCCCCC" w:sz="1"/>
+              <w:left w:val="single" w:color="CCCCCC" w:sz="1"/>
+              <w:bottom w:val="single" w:color="CCCCCC" w:sz="1"/>
+              <w:right w:val="single" w:color="CCCCCC" w:sz="1"/>
+            </w:tcBorders>
+            <w:shd w:fill="F5F6FA" w:val="clear"/>
+            <w:tcMar>
+              <w:top w:type="dxa" w:w="60"/>
+              <w:left w:type="dxa" w:w="100"/>
+              <w:bottom w:type="dxa" w:w="60"/>
+              <w:right w:type="dxa" w:w="100"/>
+            </w:tcMar>
+          </w:tcPr>
+          <w:p>
+            <w:r>
+              <w:rPr>
+                <w:rFonts w:ascii="Calibri" w:cs="Calibri" w:eastAsia="Calibri" w:hAnsi="Calibri"/>
+                <w:b w:val="false"/>
+                <w:bCs w:val="false"/>
+                <w:color w:val="37474F"/>
+                <w:sz w:val="18"/>
+                <w:szCs w:val="18"/>
+              </w:rPr>
+              <w:t xml:space="preserve">Zero exceptions for interactive accounts</w:t>
+            </w:r>
+          </w:p>
+        </w:tc>
+      </w:tr>
+      <w:tr>
+        <w:tc>
+          <w:tcPr>
+            <w:tcW w:type="dxa" w:w="3120"/>
+            <w:tcBorders>
+              <w:top w:val="single" w:color="CCCCCC" w:sz="1"/>
+              <w:left w:val="single" w:color="CCCCCC" w:sz="1"/>
+              <w:bottom w:val="single" w:color="CCCCCC" w:sz="1"/>
+              <w:right w:val="single" w:color="CCCCCC" w:sz="1"/>
+            </w:tcBorders>
+            <w:shd w:fill="FFFFFF" w:val="clear"/>
+            <w:tcMar>
+              <w:top w:type="dxa" w:w="60"/>
+              <w:left w:type="dxa" w:w="100"/>
+              <w:bottom w:type="dxa" w:w="60"/>
+              <w:right w:type="dxa" w:w="100"/>
+            </w:tcMar>
+          </w:tcPr>
+          <w:p>
+            <w:r>
+              <w:rPr>
+                <w:rFonts w:ascii="Calibri" w:cs="Calibri" w:eastAsia="Calibri" w:hAnsi="Calibri"/>
+                <w:b/>
+                <w:bCs/>
+                <w:color w:val="37474F"/>
+                <w:sz w:val="18"/>
+                <w:szCs w:val="18"/>
+              </w:rPr>
+              <w:t xml:space="preserve">Service accounts with static long-lived credentials</w:t>
+            </w:r>
+          </w:p>
+        </w:tc>
+        <w:tc>
+          <w:tcPr>
+            <w:tcW w:type="dxa" w:w="3120"/>
+            <w:tcBorders>
+              <w:top w:val="single" w:color="CCCCCC" w:sz="1"/>
+              <w:left w:val="single" w:color="CCCCCC" w:sz="1"/>
+              <w:bottom w:val="single" w:color="CCCCCC" w:sz="1"/>
+              <w:right w:val="single" w:color="CCCCCC" w:sz="1"/>
+            </w:tcBorders>
+            <w:shd w:fill="FFFFFF" w:val="clear"/>
+            <w:tcMar>
+              <w:top w:type="dxa" w:w="60"/>
+              <w:left w:type="dxa" w:w="100"/>
+              <w:bottom w:type="dxa" w:w="60"/>
+              <w:right w:type="dxa" w:w="100"/>
+            </w:tcMar>
+          </w:tcPr>
+          <w:p>
+            <w:r>
+              <w:rPr>
+                <w:rFonts w:ascii="Calibri" w:cs="Calibri" w:eastAsia="Calibri" w:hAnsi="Calibri"/>
+                <w:b w:val="false"/>
+                <w:bCs w:val="false"/>
+                <w:color w:val="37474F"/>
+                <w:sz w:val="18"/>
+                <w:szCs w:val="18"/>
+              </w:rPr>
+              <w:t xml:space="preserve">0%</w:t>
+            </w:r>
+          </w:p>
+        </w:tc>
+        <w:tc>
+          <w:tcPr>
+            <w:tcW w:type="dxa" w:w="3120"/>
+            <w:tcBorders>
+              <w:top w:val="single" w:color="CCCCCC" w:sz="1"/>
+              <w:left w:val="single" w:color="CCCCCC" w:sz="1"/>
+              <w:bottom w:val="single" w:color="CCCCCC" w:sz="1"/>
+              <w:right w:val="single" w:color="CCCCCC" w:sz="1"/>
+            </w:tcBorders>
+            <w:shd w:fill="FFFFFF" w:val="clear"/>
+            <w:tcMar>
+              <w:top w:type="dxa" w:w="60"/>
+              <w:left w:type="dxa" w:w="100"/>
+              <w:bottom w:type="dxa" w:w="60"/>
+              <w:right w:type="dxa" w:w="100"/>
+            </w:tcMar>
+          </w:tcPr>
+          <w:p>
+            <w:r>
+              <w:rPr>
+                <w:rFonts w:ascii="Calibri" w:cs="Calibri" w:eastAsia="Calibri" w:hAnsi="Calibri"/>
+                <w:b w:val="false"/>
+                <w:bCs w:val="false"/>
+                <w:color w:val="37474F"/>
+                <w:sz w:val="18"/>
+                <w:szCs w:val="18"/>
+              </w:rPr>
+              <w:t xml:space="preserve">All replaced by workload identity or short-lived tokens</w:t>
+            </w:r>
+          </w:p>
+        </w:tc>
+      </w:tr>
+      <w:tr>
+        <w:tc>
+          <w:tcPr>
+            <w:tcW w:type="dxa" w:w="3120"/>
+            <w:tcBorders>
+              <w:top w:val="single" w:color="CCCCCC" w:sz="1"/>
+              <w:left w:val="single" w:color="CCCCCC" w:sz="1"/>
+              <w:bottom w:val="single" w:color="CCCCCC" w:sz="1"/>
+              <w:right w:val="single" w:color="CCCCCC" w:sz="1"/>
+            </w:tcBorders>
+            <w:shd w:fill="F5F6FA" w:val="clear"/>
+            <w:tcMar>
+              <w:top w:type="dxa" w:w="60"/>
+              <w:left w:type="dxa" w:w="100"/>
+              <w:bottom w:type="dxa" w:w="60"/>
+              <w:right w:type="dxa" w:w="100"/>
+            </w:tcMar>
+          </w:tcPr>
+          <w:p>
+            <w:r>
+              <w:rPr>
+                <w:rFonts w:ascii="Calibri" w:cs="Calibri" w:eastAsia="Calibri" w:hAnsi="Calibri"/>
+                <w:b/>
+                <w:bCs/>
+                <w:color w:val="37474F"/>
+                <w:sz w:val="18"/>
+                <w:szCs w:val="18"/>
+              </w:rPr>
+              <w:t xml:space="preserve">IAM roles with wildcard (*) actions in production</w:t>
+            </w:r>
+          </w:p>
+        </w:tc>
+        <w:tc>
+          <w:tcPr>
+            <w:tcW w:type="dxa" w:w="3120"/>
+            <w:tcBorders>
+              <w:top w:val="single" w:color="CCCCCC" w:sz="1"/>
+              <w:left w:val="single" w:color="CCCCCC" w:sz="1"/>
+              <w:bottom w:val="single" w:color="CCCCCC" w:sz="1"/>
+              <w:right w:val="single" w:color="CCCCCC" w:sz="1"/>
+            </w:tcBorders>
+            <w:shd w:fill="F5F6FA" w:val="clear"/>
+            <w:tcMar>
+              <w:top w:type="dxa" w:w="60"/>
+              <w:left w:type="dxa" w:w="100"/>
+              <w:bottom w:type="dxa" w:w="60"/>
+              <w:right w:type="dxa" w:w="100"/>
+            </w:tcMar>
+          </w:tcPr>
+          <w:p>
+            <w:r>
+              <w:rPr>
+                <w:rFonts w:ascii="Calibri" w:cs="Calibri" w:eastAsia="Calibri" w:hAnsi="Calibri"/>
+                <w:b w:val="false"/>
+                <w:bCs w:val="false"/>
+                <w:color w:val="37474F"/>
+                <w:sz w:val="18"/>
+                <w:szCs w:val="18"/>
+              </w:rPr>
+              <w:t xml:space="preserve">0%</w:t>
+            </w:r>
+          </w:p>
+        </w:tc>
+        <w:tc>
+          <w:tcPr>
+            <w:tcW w:type="dxa" w:w="3120"/>
+            <w:tcBorders>
+              <w:top w:val="single" w:color="CCCCCC" w:sz="1"/>
+              <w:left w:val="single" w:color="CCCCCC" w:sz="1"/>
+              <w:bottom w:val="single" w:color="CCCCCC" w:sz="1"/>
+              <w:right w:val="single" w:color="CCCCCC" w:sz="1"/>
+            </w:tcBorders>
+            <w:shd w:fill="F5F6FA" w:val="clear"/>
+            <w:tcMar>
+              <w:top w:type="dxa" w:w="60"/>
+              <w:left w:type="dxa" w:w="100"/>
+              <w:bottom w:type="dxa" w:w="60"/>
+              <w:right w:type="dxa" w:w="100"/>
+            </w:tcMar>
+          </w:tcPr>
+          <w:p>
+            <w:r>
+              <w:rPr>
+                <w:rFonts w:ascii="Calibri" w:cs="Calibri" w:eastAsia="Calibri" w:hAnsi="Calibri"/>
+                <w:b w:val="false"/>
+                <w:bCs w:val="false"/>
+                <w:color w:val="37474F"/>
+                <w:sz w:val="18"/>
+                <w:szCs w:val="18"/>
+              </w:rPr>
+              <w:t xml:space="preserve">Exception process required for any deviations</w:t>
+            </w:r>
+          </w:p>
+        </w:tc>
+      </w:tr>
+      <w:tr>
+        <w:tc>
+          <w:tcPr>
+            <w:tcW w:type="dxa" w:w="3120"/>
+            <w:tcBorders>
+              <w:top w:val="single" w:color="CCCCCC" w:sz="1"/>
+              <w:left w:val="single" w:color="CCCCCC" w:sz="1"/>
+              <w:bottom w:val="single" w:color="CCCCCC" w:sz="1"/>
+              <w:right w:val="single" w:color="CCCCCC" w:sz="1"/>
+            </w:tcBorders>
+            <w:shd w:fill="FFFFFF" w:val="clear"/>
+            <w:tcMar>
+              <w:top w:type="dxa" w:w="60"/>
+              <w:left w:type="dxa" w:w="100"/>
+              <w:bottom w:type="dxa" w:w="60"/>
+              <w:right w:type="dxa" w:w="100"/>
+            </w:tcMar>
+          </w:tcPr>
+          <w:p>
+            <w:r>
+              <w:rPr>
+                <w:rFonts w:ascii="Calibri" w:cs="Calibri" w:eastAsia="Calibri" w:hAnsi="Calibri"/>
+                <w:b/>
+                <w:bCs/>
+                <w:color w:val="37474F"/>
+                <w:sz w:val="18"/>
+                <w:szCs w:val="18"/>
+              </w:rPr>
+              <w:t xml:space="preserve">Privileged access reviews completed on schedule</w:t>
+            </w:r>
+          </w:p>
+        </w:tc>
+        <w:tc>
+          <w:tcPr>
+            <w:tcW w:type="dxa" w:w="3120"/>
+            <w:tcBorders>
+              <w:top w:val="single" w:color="CCCCCC" w:sz="1"/>
+              <w:left w:val="single" w:color="CCCCCC" w:sz="1"/>
+              <w:bottom w:val="single" w:color="CCCCCC" w:sz="1"/>
+              <w:right w:val="single" w:color="CCCCCC" w:sz="1"/>
+            </w:tcBorders>
+            <w:shd w:fill="FFFFFF" w:val="clear"/>
+            <w:tcMar>
+              <w:top w:type="dxa" w:w="60"/>
+              <w:left w:type="dxa" w:w="100"/>
+              <w:bottom w:type="dxa" w:w="60"/>
+              <w:right w:type="dxa" w:w="100"/>
+            </w:tcMar>
+          </w:tcPr>
+          <w:p>
+            <w:r>
+              <w:rPr>
+                <w:rFonts w:ascii="Calibri" w:cs="Calibri" w:eastAsia="Calibri" w:hAnsi="Calibri"/>
+                <w:b w:val="false"/>
+                <w:bCs w:val="false"/>
+                <w:color w:val="37474F"/>
+                <w:sz w:val="18"/>
+                <w:szCs w:val="18"/>
+              </w:rPr>
+              <w:t xml:space="preserve">100%</w:t>
+            </w:r>
+          </w:p>
+        </w:tc>
+        <w:tc>
+          <w:tcPr>
+            <w:tcW w:type="dxa" w:w="3120"/>
+            <w:tcBorders>
+              <w:top w:val="single" w:color="CCCCCC" w:sz="1"/>
+              <w:left w:val="single" w:color="CCCCCC" w:sz="1"/>
+              <w:bottom w:val="single" w:color="CCCCCC" w:sz="1"/>
+              <w:right w:val="single" w:color="CCCCCC" w:sz="1"/>
+            </w:tcBorders>
+            <w:shd w:fill="FFFFFF" w:val="clear"/>
+            <w:tcMar>
+              <w:top w:type="dxa" w:w="60"/>
+              <w:left w:type="dxa" w:w="100"/>
+              <w:bottom w:type="dxa" w:w="60"/>
+              <w:right w:type="dxa" w:w="100"/>
+            </w:tcMar>
+          </w:tcPr>
+          <w:p>
+            <w:r>
+              <w:rPr>
+                <w:rFonts w:ascii="Calibri" w:cs="Calibri" w:eastAsia="Calibri" w:hAnsi="Calibri"/>
+                <w:b w:val="false"/>
+                <w:bCs w:val="false"/>
+                <w:color w:val="37474F"/>
+                <w:sz w:val="18"/>
+                <w:szCs w:val="18"/>
+              </w:rPr>
+              <w:t xml:space="preserve">Quarterly at minimum for all privileged roles</w:t>
+            </w:r>
+          </w:p>
+        </w:tc>
+      </w:tr>
+      <w:tr>
+        <w:tc>
+          <w:tcPr>
+            <w:tcW w:type="dxa" w:w="3120"/>
+            <w:tcBorders>
+              <w:top w:val="single" w:color="CCCCCC" w:sz="1"/>
+              <w:left w:val="single" w:color="CCCCCC" w:sz="1"/>
+              <w:bottom w:val="single" w:color="CCCCCC" w:sz="1"/>
+              <w:right w:val="single" w:color="CCCCCC" w:sz="1"/>
+            </w:tcBorders>
+            <w:shd w:fill="F5F6FA" w:val="clear"/>
+            <w:tcMar>
+              <w:top w:type="dxa" w:w="60"/>
+              <w:left w:type="dxa" w:w="100"/>
+              <w:bottom w:type="dxa" w:w="60"/>
+              <w:right w:type="dxa" w:w="100"/>
+            </w:tcMar>
+          </w:tcPr>
+          <w:p>
+            <w:r>
+              <w:rPr>
+                <w:rFonts w:ascii="Calibri" w:cs="Calibri" w:eastAsia="Calibri" w:hAnsi="Calibri"/>
+                <w:b/>
+                <w:bCs/>
+                <w:color w:val="37474F"/>
+                <w:sz w:val="18"/>
+                <w:szCs w:val="18"/>
+              </w:rPr>
+              <w:t xml:space="preserve">Mean time to revoke departed user access</w:t>
+            </w:r>
+          </w:p>
+        </w:tc>
+        <w:tc>
+          <w:tcPr>
+            <w:tcW w:type="dxa" w:w="3120"/>
+            <w:tcBorders>
+              <w:top w:val="single" w:color="CCCCCC" w:sz="1"/>
+              <w:left w:val="single" w:color="CCCCCC" w:sz="1"/>
+              <w:bottom w:val="single" w:color="CCCCCC" w:sz="1"/>
+              <w:right w:val="single" w:color="CCCCCC" w:sz="1"/>
+            </w:tcBorders>
+            <w:shd w:fill="F5F6FA" w:val="clear"/>
+            <w:tcMar>
+              <w:top w:type="dxa" w:w="60"/>
+              <w:left w:type="dxa" w:w="100"/>
+              <w:bottom w:type="dxa" w:w="60"/>
+              <w:right w:type="dxa" w:w="100"/>
+            </w:tcMar>
+          </w:tcPr>
+          <w:p>
+            <w:r>
+              <w:rPr>
+                <w:rFonts w:ascii="Calibri" w:cs="Calibri" w:eastAsia="Calibri" w:hAnsi="Calibri"/>
+                <w:b w:val="false"/>
+                <w:bCs w:val="false"/>
+                <w:color w:val="37474F"/>
+                <w:sz w:val="18"/>
+                <w:szCs w:val="18"/>
+              </w:rPr>
+              <w:t xml:space="preserve">&lt; 4 hours</w:t>
+            </w:r>
+          </w:p>
+        </w:tc>
+        <w:tc>
+          <w:tcPr>
+            <w:tcW w:type="dxa" w:w="3120"/>
+            <w:tcBorders>
+              <w:top w:val="single" w:color="CCCCCC" w:sz="1"/>
+              <w:left w:val="single" w:color="CCCCCC" w:sz="1"/>
+              <w:bottom w:val="single" w:color="CCCCCC" w:sz="1"/>
+              <w:right w:val="single" w:color="CCCCCC" w:sz="1"/>
+            </w:tcBorders>
+            <w:shd w:fill="F5F6FA" w:val="clear"/>
+            <w:tcMar>
+              <w:top w:type="dxa" w:w="60"/>
+              <w:left w:type="dxa" w:w="100"/>
+              <w:bottom w:type="dxa" w:w="60"/>
+              <w:right w:type="dxa" w:w="100"/>
+            </w:tcMar>
+          </w:tcPr>
+          <w:p>
+            <w:r>
+              <w:rPr>
+                <w:rFonts w:ascii="Calibri" w:cs="Calibri" w:eastAsia="Calibri" w:hAnsi="Calibri"/>
+                <w:b w:val="false"/>
+                <w:bCs w:val="false"/>
+                <w:color w:val="37474F"/>
+                <w:sz w:val="18"/>
+                <w:szCs w:val="18"/>
+              </w:rPr>
+              <w:t xml:space="preserve">Automated off-boarding triggers preferred</w:t>
+            </w:r>
+          </w:p>
+        </w:tc>
+      </w:tr>
+    </w:tbl>
+    <w:p>
+      <w:r>
+        <w:t xml:space="preserve"/>
+      </w:r>
+    </w:p>
+    <w:p>
+      <w:pPr>
+        <w:pStyle w:val="Heading2"/>
+      </w:pPr>
+      <w:r>
+        <w:rPr>
+          <w:rFonts w:ascii="Arial" w:cs="Arial" w:eastAsia="Arial" w:hAnsi="Arial"/>
+          <w:b/>
+          <w:bCs/>
+          <w:color w:val="1565C0"/>
+          <w:sz w:val="26"/>
+          <w:szCs w:val="26"/>
+        </w:rPr>
+        <w:t xml:space="preserve">11.2 Detection and Response</w:t>
+      </w:r>
+    </w:p>
+    <w:tbl>
+      <w:tblPr>
+        <w:tblW w:type="dxa" w:w="9360"/>
+        <w:tblBorders>
+          <w:top w:val="single" w:color="auto" w:sz="4"/>
+          <w:left w:val="single" w:color="auto" w:sz="4"/>
+          <w:bottom w:val="single" w:color="auto" w:sz="4"/>
+          <w:right w:val="single" w:color="auto" w:sz="4"/>
+          <w:insideH w:val="single" w:color="auto" w:sz="4"/>
+          <w:insideV w:val="single" w:color="auto" w:sz="4"/>
+        </w:tblBorders>
+      </w:tblPr>
+      <w:tblGrid>
+        <w:gridCol w:w="3120"/>
+        <w:gridCol w:w="3120"/>
+        <w:gridCol w:w="3120"/>
+      </w:tblGrid>
+      <w:tr>
+        <w:tc>
+          <w:tcPr>
+            <w:tcW w:type="dxa" w:w="3120"/>
+            <w:tcBorders>
+              <w:top w:val="single" w:color="CCCCCC" w:sz="1"/>
+              <w:left w:val="single" w:color="CCCCCC" w:sz="1"/>
+              <w:bottom w:val="single" w:color="CCCCCC" w:sz="1"/>
+              <w:right w:val="single" w:color="CCCCCC" w:sz="1"/>
+            </w:tcBorders>
+            <w:shd w:fill="0F4C75" w:val="clear"/>
+            <w:tcMar>
+              <w:top w:type="dxa" w:w="60"/>
+              <w:left w:type="dxa" w:w="100"/>
+              <w:bottom w:type="dxa" w:w="60"/>
+              <w:right w:type="dxa" w:w="100"/>
+            </w:tcMar>
+          </w:tcPr>
+          <w:p>
+            <w:r>
+              <w:rPr>
+                <w:rFonts w:ascii="Arial" w:cs="Arial" w:eastAsia="Arial" w:hAnsi="Arial"/>
+                <w:b/>
+                <w:bCs/>
+                <w:color w:val="FFFFFF"/>
+                <w:sz w:val="19"/>
+                <w:szCs w:val="19"/>
+              </w:rPr>
+              <w:t xml:space="preserve">Metric</w:t>
+            </w:r>
+          </w:p>
+        </w:tc>
+        <w:tc>
+          <w:tcPr>
+            <w:tcW w:type="dxa" w:w="3120"/>
+            <w:tcBorders>
+              <w:top w:val="single" w:color="CCCCCC" w:sz="1"/>
+              <w:left w:val="single" w:color="CCCCCC" w:sz="1"/>
+              <w:bottom w:val="single" w:color="CCCCCC" w:sz="1"/>
+              <w:right w:val="single" w:color="CCCCCC" w:sz="1"/>
+            </w:tcBorders>
+            <w:shd w:fill="0F4C75" w:val="clear"/>
+            <w:tcMar>
+              <w:top w:type="dxa" w:w="60"/>
+              <w:left w:type="dxa" w:w="100"/>
+              <w:bottom w:type="dxa" w:w="60"/>
+              <w:right w:type="dxa" w:w="100"/>
+            </w:tcMar>
+          </w:tcPr>
+          <w:p>
+            <w:r>
+              <w:rPr>
+                <w:rFonts w:ascii="Arial" w:cs="Arial" w:eastAsia="Arial" w:hAnsi="Arial"/>
+                <w:b/>
+                <w:bCs/>
+                <w:color w:val="FFFFFF"/>
+                <w:sz w:val="19"/>
+                <w:szCs w:val="19"/>
+              </w:rPr>
+              <w:t xml:space="preserve">Target</w:t>
+            </w:r>
+          </w:p>
+        </w:tc>
+        <w:tc>
+          <w:tcPr>
+            <w:tcW w:type="dxa" w:w="3120"/>
+            <w:tcBorders>
+              <w:top w:val="single" w:color="CCCCCC" w:sz="1"/>
+              <w:left w:val="single" w:color="CCCCCC" w:sz="1"/>
+              <w:bottom w:val="single" w:color="CCCCCC" w:sz="1"/>
+              <w:right w:val="single" w:color="CCCCCC" w:sz="1"/>
+            </w:tcBorders>
+            <w:shd w:fill="0F4C75" w:val="clear"/>
+            <w:tcMar>
+              <w:top w:type="dxa" w:w="60"/>
+              <w:left w:type="dxa" w:w="100"/>
+              <w:bottom w:type="dxa" w:w="60"/>
+              <w:right w:type="dxa" w:w="100"/>
+            </w:tcMar>
+          </w:tcPr>
+          <w:p>
+            <w:r>
+              <w:rPr>
+                <w:rFonts w:ascii="Arial" w:cs="Arial" w:eastAsia="Arial" w:hAnsi="Arial"/>
+                <w:b/>
+                <w:bCs/>
+                <w:color w:val="FFFFFF"/>
+                <w:sz w:val="19"/>
+                <w:szCs w:val="19"/>
+              </w:rPr>
+              <w:t xml:space="preserve">Notes</w:t>
+            </w:r>
+          </w:p>
+        </w:tc>
+      </w:tr>
+      <w:tr>
+        <w:tc>
+          <w:tcPr>
+            <w:tcW w:type="dxa" w:w="3120"/>
+            <w:tcBorders>
+              <w:top w:val="single" w:color="CCCCCC" w:sz="1"/>
+              <w:left w:val="single" w:color="CCCCCC" w:sz="1"/>
+              <w:bottom w:val="single" w:color="CCCCCC" w:sz="1"/>
+              <w:right w:val="single" w:color="CCCCCC" w:sz="1"/>
+            </w:tcBorders>
+            <w:shd w:fill="F5F6FA" w:val="clear"/>
+            <w:tcMar>
+              <w:top w:type="dxa" w:w="60"/>
+              <w:left w:type="dxa" w:w="100"/>
+              <w:bottom w:type="dxa" w:w="60"/>
+              <w:right w:type="dxa" w:w="100"/>
+            </w:tcMar>
+          </w:tcPr>
+          <w:p>
+            <w:r>
+              <w:rPr>
+                <w:rFonts w:ascii="Calibri" w:cs="Calibri" w:eastAsia="Calibri" w:hAnsi="Calibri"/>
+                <w:b/>
+                <w:bCs/>
+                <w:color w:val="37474F"/>
+                <w:sz w:val="18"/>
+                <w:szCs w:val="18"/>
+              </w:rPr>
+              <w:t xml:space="preserve">Critical findings in CSPM unresolved &gt; 7 days</w:t>
+            </w:r>
+          </w:p>
+        </w:tc>
+        <w:tc>
+          <w:tcPr>
+            <w:tcW w:type="dxa" w:w="3120"/>
+            <w:tcBorders>
+              <w:top w:val="single" w:color="CCCCCC" w:sz="1"/>
+              <w:left w:val="single" w:color="CCCCCC" w:sz="1"/>
+              <w:bottom w:val="single" w:color="CCCCCC" w:sz="1"/>
+              <w:right w:val="single" w:color="CCCCCC" w:sz="1"/>
+            </w:tcBorders>
+            <w:shd w:fill="F5F6FA" w:val="clear"/>
+            <w:tcMar>
+              <w:top w:type="dxa" w:w="60"/>
+              <w:left w:type="dxa" w:w="100"/>
+              <w:bottom w:type="dxa" w:w="60"/>
+              <w:right w:type="dxa" w:w="100"/>
+            </w:tcMar>
+          </w:tcPr>
+          <w:p>
+            <w:r>
+              <w:rPr>
+                <w:rFonts w:ascii="Calibri" w:cs="Calibri" w:eastAsia="Calibri" w:hAnsi="Calibri"/>
+                <w:b w:val="false"/>
+                <w:bCs w:val="false"/>
+                <w:color w:val="37474F"/>
+                <w:sz w:val="18"/>
+                <w:szCs w:val="18"/>
+              </w:rPr>
+              <w:t xml:space="preserve">0%</w:t>
+            </w:r>
+          </w:p>
+        </w:tc>
+        <w:tc>
+          <w:tcPr>
+            <w:tcW w:type="dxa" w:w="3120"/>
+            <w:tcBorders>
+              <w:top w:val="single" w:color="CCCCCC" w:sz="1"/>
+              <w:left w:val="single" w:color="CCCCCC" w:sz="1"/>
+              <w:bottom w:val="single" w:color="CCCCCC" w:sz="1"/>
+              <w:right w:val="single" w:color="CCCCCC" w:sz="1"/>
+            </w:tcBorders>
+            <w:shd w:fill="F5F6FA" w:val="clear"/>
+            <w:tcMar>
+              <w:top w:type="dxa" w:w="60"/>
+              <w:left w:type="dxa" w:w="100"/>
+              <w:bottom w:type="dxa" w:w="60"/>
+              <w:right w:type="dxa" w:w="100"/>
+            </w:tcMar>
+          </w:tcPr>
+          <w:p>
+            <w:r>
+              <w:rPr>
+                <w:rFonts w:ascii="Calibri" w:cs="Calibri" w:eastAsia="Calibri" w:hAnsi="Calibri"/>
+                <w:b w:val="false"/>
+                <w:bCs w:val="false"/>
+                <w:color w:val="37474F"/>
+                <w:sz w:val="18"/>
+                <w:szCs w:val="18"/>
+              </w:rPr>
+              <w:t xml:space="preserve">Auto-remediation preferred for common misconfigs</w:t>
+            </w:r>
+          </w:p>
+        </w:tc>
+      </w:tr>
+      <w:tr>
+        <w:tc>
+          <w:tcPr>
+            <w:tcW w:type="dxa" w:w="3120"/>
+            <w:tcBorders>
+              <w:top w:val="single" w:color="CCCCCC" w:sz="1"/>
+              <w:left w:val="single" w:color="CCCCCC" w:sz="1"/>
+              <w:bottom w:val="single" w:color="CCCCCC" w:sz="1"/>
+              <w:right w:val="single" w:color="CCCCCC" w:sz="1"/>
+            </w:tcBorders>
+            <w:shd w:fill="FFFFFF" w:val="clear"/>
+            <w:tcMar>
+              <w:top w:type="dxa" w:w="60"/>
+              <w:left w:type="dxa" w:w="100"/>
+              <w:bottom w:type="dxa" w:w="60"/>
+              <w:right w:type="dxa" w:w="100"/>
+            </w:tcMar>
+          </w:tcPr>
+          <w:p>
+            <w:r>
+              <w:rPr>
+                <w:rFonts w:ascii="Calibri" w:cs="Calibri" w:eastAsia="Calibri" w:hAnsi="Calibri"/>
+                <w:b/>
+                <w:bCs/>
+                <w:color w:val="37474F"/>
+                <w:sz w:val="18"/>
+                <w:szCs w:val="18"/>
+              </w:rPr>
+              <w:t xml:space="preserve">High-severity SIEM alerts with no triage action</w:t>
+            </w:r>
+          </w:p>
+        </w:tc>
+        <w:tc>
+          <w:tcPr>
+            <w:tcW w:type="dxa" w:w="3120"/>
+            <w:tcBorders>
+              <w:top w:val="single" w:color="CCCCCC" w:sz="1"/>
+              <w:left w:val="single" w:color="CCCCCC" w:sz="1"/>
+              <w:bottom w:val="single" w:color="CCCCCC" w:sz="1"/>
+              <w:right w:val="single" w:color="CCCCCC" w:sz="1"/>
+            </w:tcBorders>
+            <w:shd w:fill="FFFFFF" w:val="clear"/>
+            <w:tcMar>
+              <w:top w:type="dxa" w:w="60"/>
+              <w:left w:type="dxa" w:w="100"/>
+              <w:bottom w:type="dxa" w:w="60"/>
+              <w:right w:type="dxa" w:w="100"/>
+            </w:tcMar>
+          </w:tcPr>
+          <w:p>
+            <w:r>
+              <w:rPr>
+                <w:rFonts w:ascii="Calibri" w:cs="Calibri" w:eastAsia="Calibri" w:hAnsi="Calibri"/>
+                <w:b w:val="false"/>
+                <w:bCs w:val="false"/>
+                <w:color w:val="37474F"/>
+                <w:sz w:val="18"/>
+                <w:szCs w:val="18"/>
+              </w:rPr>
+              <w:t xml:space="preserve">0%</w:t>
+            </w:r>
+          </w:p>
+        </w:tc>
+        <w:tc>
+          <w:tcPr>
+            <w:tcW w:type="dxa" w:w="3120"/>
+            <w:tcBorders>
+              <w:top w:val="single" w:color="CCCCCC" w:sz="1"/>
+              <w:left w:val="single" w:color="CCCCCC" w:sz="1"/>
+              <w:bottom w:val="single" w:color="CCCCCC" w:sz="1"/>
+              <w:right w:val="single" w:color="CCCCCC" w:sz="1"/>
+            </w:tcBorders>
+            <w:shd w:fill="FFFFFF" w:val="clear"/>
+            <w:tcMar>
+              <w:top w:type="dxa" w:w="60"/>
+              <w:left w:type="dxa" w:w="100"/>
+              <w:bottom w:type="dxa" w:w="60"/>
+              <w:right w:type="dxa" w:w="100"/>
+            </w:tcMar>
+          </w:tcPr>
+          <w:p>
+            <w:r>
+              <w:rPr>
+                <w:rFonts w:ascii="Calibri" w:cs="Calibri" w:eastAsia="Calibri" w:hAnsi="Calibri"/>
+                <w:b w:val="false"/>
+                <w:bCs w:val="false"/>
+                <w:color w:val="37474F"/>
+                <w:sz w:val="18"/>
+                <w:szCs w:val="18"/>
+              </w:rPr>
+              <w:t xml:space="preserve">Triage SLA: 4 hours for high severity</w:t>
+            </w:r>
+          </w:p>
+        </w:tc>
+      </w:tr>
+      <w:tr>
+        <w:tc>
+          <w:tcPr>
+            <w:tcW w:type="dxa" w:w="3120"/>
+            <w:tcBorders>
+              <w:top w:val="single" w:color="CCCCCC" w:sz="1"/>
+              <w:left w:val="single" w:color="CCCCCC" w:sz="1"/>
+              <w:bottom w:val="single" w:color="CCCCCC" w:sz="1"/>
+              <w:right w:val="single" w:color="CCCCCC" w:sz="1"/>
+            </w:tcBorders>
+            <w:shd w:fill="F5F6FA" w:val="clear"/>
+            <w:tcMar>
+              <w:top w:type="dxa" w:w="60"/>
+              <w:left w:type="dxa" w:w="100"/>
+              <w:bottom w:type="dxa" w:w="60"/>
+              <w:right w:type="dxa" w:w="100"/>
+            </w:tcMar>
+          </w:tcPr>
+          <w:p>
+            <w:r>
+              <w:rPr>
+                <w:rFonts w:ascii="Calibri" w:cs="Calibri" w:eastAsia="Calibri" w:hAnsi="Calibri"/>
+                <w:b/>
+                <w:bCs/>
+                <w:color w:val="37474F"/>
+                <w:sz w:val="18"/>
+                <w:szCs w:val="18"/>
+              </w:rPr>
+              <w:t xml:space="preserve">Mean time to detect (MTTD) cloud security incidents</w:t>
+            </w:r>
+          </w:p>
+        </w:tc>
+        <w:tc>
+          <w:tcPr>
+            <w:tcW w:type="dxa" w:w="3120"/>
+            <w:tcBorders>
+              <w:top w:val="single" w:color="CCCCCC" w:sz="1"/>
+              <w:left w:val="single" w:color="CCCCCC" w:sz="1"/>
+              <w:bottom w:val="single" w:color="CCCCCC" w:sz="1"/>
+              <w:right w:val="single" w:color="CCCCCC" w:sz="1"/>
+            </w:tcBorders>
+            <w:shd w:fill="F5F6FA" w:val="clear"/>
+            <w:tcMar>
+              <w:top w:type="dxa" w:w="60"/>
+              <w:left w:type="dxa" w:w="100"/>
+              <w:bottom w:type="dxa" w:w="60"/>
+              <w:right w:type="dxa" w:w="100"/>
+            </w:tcMar>
+          </w:tcPr>
+          <w:p>
+            <w:r>
+              <w:rPr>
+                <w:rFonts w:ascii="Calibri" w:cs="Calibri" w:eastAsia="Calibri" w:hAnsi="Calibri"/>
+                <w:b w:val="false"/>
+                <w:bCs w:val="false"/>
+                <w:color w:val="37474F"/>
+                <w:sz w:val="18"/>
+                <w:szCs w:val="18"/>
+              </w:rPr>
+              <w:t xml:space="preserve">&lt; 1 hour</w:t>
+            </w:r>
+          </w:p>
+        </w:tc>
+        <w:tc>
+          <w:tcPr>
+            <w:tcW w:type="dxa" w:w="3120"/>
+            <w:tcBorders>
+              <w:top w:val="single" w:color="CCCCCC" w:sz="1"/>
+              <w:left w:val="single" w:color="CCCCCC" w:sz="1"/>
+              <w:bottom w:val="single" w:color="CCCCCC" w:sz="1"/>
+              <w:right w:val="single" w:color="CCCCCC" w:sz="1"/>
+            </w:tcBorders>
+            <w:shd w:fill="F5F6FA" w:val="clear"/>
+            <w:tcMar>
+              <w:top w:type="dxa" w:w="60"/>
+              <w:left w:type="dxa" w:w="100"/>
+              <w:bottom w:type="dxa" w:w="60"/>
+              <w:right w:type="dxa" w:w="100"/>
+            </w:tcMar>
+          </w:tcPr>
+          <w:p>
+            <w:r>
+              <w:rPr>
+                <w:rFonts w:ascii="Calibri" w:cs="Calibri" w:eastAsia="Calibri" w:hAnsi="Calibri"/>
+                <w:b w:val="false"/>
+                <w:bCs w:val="false"/>
+                <w:color w:val="37474F"/>
+                <w:sz w:val="18"/>
+                <w:szCs w:val="18"/>
+              </w:rPr>
+              <w:t xml:space="preserve">Measured from first signal to alert</w:t>
+            </w:r>
+          </w:p>
+        </w:tc>
+      </w:tr>
+      <w:tr>
+        <w:tc>
+          <w:tcPr>
+            <w:tcW w:type="dxa" w:w="3120"/>
+            <w:tcBorders>
+              <w:top w:val="single" w:color="CCCCCC" w:sz="1"/>
+              <w:left w:val="single" w:color="CCCCCC" w:sz="1"/>
+              <w:bottom w:val="single" w:color="CCCCCC" w:sz="1"/>
+              <w:right w:val="single" w:color="CCCCCC" w:sz="1"/>
+            </w:tcBorders>
+            <w:shd w:fill="FFFFFF" w:val="clear"/>
+            <w:tcMar>
+              <w:top w:type="dxa" w:w="60"/>
+              <w:left w:type="dxa" w:w="100"/>
+              <w:bottom w:type="dxa" w:w="60"/>
+              <w:right w:type="dxa" w:w="100"/>
+            </w:tcMar>
+          </w:tcPr>
+          <w:p>
+            <w:r>
+              <w:rPr>
+                <w:rFonts w:ascii="Calibri" w:cs="Calibri" w:eastAsia="Calibri" w:hAnsi="Calibri"/>
+                <w:b/>
+                <w:bCs/>
+                <w:color w:val="37474F"/>
+                <w:sz w:val="18"/>
+                <w:szCs w:val="18"/>
+              </w:rPr>
+              <w:t xml:space="preserve">Mean time to respond (MTTR) to critical incidents</w:t>
+            </w:r>
+          </w:p>
+        </w:tc>
+        <w:tc>
+          <w:tcPr>
+            <w:tcW w:type="dxa" w:w="3120"/>
+            <w:tcBorders>
+              <w:top w:val="single" w:color="CCCCCC" w:sz="1"/>
+              <w:left w:val="single" w:color="CCCCCC" w:sz="1"/>
+              <w:bottom w:val="single" w:color="CCCCCC" w:sz="1"/>
+              <w:right w:val="single" w:color="CCCCCC" w:sz="1"/>
+            </w:tcBorders>
+            <w:shd w:fill="FFFFFF" w:val="clear"/>
+            <w:tcMar>
+              <w:top w:type="dxa" w:w="60"/>
+              <w:left w:type="dxa" w:w="100"/>
+              <w:bottom w:type="dxa" w:w="60"/>
+              <w:right w:type="dxa" w:w="100"/>
+            </w:tcMar>
+          </w:tcPr>
+          <w:p>
+            <w:r>
+              <w:rPr>
+                <w:rFonts w:ascii="Calibri" w:cs="Calibri" w:eastAsia="Calibri" w:hAnsi="Calibri"/>
+                <w:b w:val="false"/>
+                <w:bCs w:val="false"/>
+                <w:color w:val="37474F"/>
+                <w:sz w:val="18"/>
+                <w:szCs w:val="18"/>
+              </w:rPr>
+              <w:t xml:space="preserve">&lt; 4 hours</w:t>
+            </w:r>
+          </w:p>
+        </w:tc>
+        <w:tc>
+          <w:tcPr>
+            <w:tcW w:type="dxa" w:w="3120"/>
+            <w:tcBorders>
+              <w:top w:val="single" w:color="CCCCCC" w:sz="1"/>
+              <w:left w:val="single" w:color="CCCCCC" w:sz="1"/>
+              <w:bottom w:val="single" w:color="CCCCCC" w:sz="1"/>
+              <w:right w:val="single" w:color="CCCCCC" w:sz="1"/>
+            </w:tcBorders>
+            <w:shd w:fill="FFFFFF" w:val="clear"/>
+            <w:tcMar>
+              <w:top w:type="dxa" w:w="60"/>
+              <w:left w:type="dxa" w:w="100"/>
+              <w:bottom w:type="dxa" w:w="60"/>
+              <w:right w:type="dxa" w:w="100"/>
+            </w:tcMar>
+          </w:tcPr>
+          <w:p>
+            <w:r>
+              <w:rPr>
+                <w:rFonts w:ascii="Calibri" w:cs="Calibri" w:eastAsia="Calibri" w:hAnsi="Calibri"/>
+                <w:b w:val="false"/>
+                <w:bCs w:val="false"/>
+                <w:color w:val="37474F"/>
+                <w:sz w:val="18"/>
+                <w:szCs w:val="18"/>
+              </w:rPr>
+              <w:t xml:space="preserve">Measured from alert to containment</w:t>
+            </w:r>
+          </w:p>
+        </w:tc>
+      </w:tr>
+      <w:tr>
+        <w:tc>
+          <w:tcPr>
+            <w:tcW w:type="dxa" w:w="3120"/>
+            <w:tcBorders>
+              <w:top w:val="single" w:color="CCCCCC" w:sz="1"/>
+              <w:left w:val="single" w:color="CCCCCC" w:sz="1"/>
+              <w:bottom w:val="single" w:color="CCCCCC" w:sz="1"/>
+              <w:right w:val="single" w:color="CCCCCC" w:sz="1"/>
+            </w:tcBorders>
+            <w:shd w:fill="F5F6FA" w:val="clear"/>
+            <w:tcMar>
+              <w:top w:type="dxa" w:w="60"/>
+              <w:left w:type="dxa" w:w="100"/>
+              <w:bottom w:type="dxa" w:w="60"/>
+              <w:right w:type="dxa" w:w="100"/>
+            </w:tcMar>
+          </w:tcPr>
+          <w:p>
+            <w:r>
+              <w:rPr>
+                <w:rFonts w:ascii="Calibri" w:cs="Calibri" w:eastAsia="Calibri" w:hAnsi="Calibri"/>
+                <w:b/>
+                <w:bCs/>
+                <w:color w:val="37474F"/>
+                <w:sz w:val="18"/>
+                <w:szCs w:val="18"/>
+              </w:rPr>
+              <w:t xml:space="preserve">Audit log coverage across all accounts and regions</w:t>
+            </w:r>
+          </w:p>
+        </w:tc>
+        <w:tc>
+          <w:tcPr>
+            <w:tcW w:type="dxa" w:w="3120"/>
+            <w:tcBorders>
+              <w:top w:val="single" w:color="CCCCCC" w:sz="1"/>
+              <w:left w:val="single" w:color="CCCCCC" w:sz="1"/>
+              <w:bottom w:val="single" w:color="CCCCCC" w:sz="1"/>
+              <w:right w:val="single" w:color="CCCCCC" w:sz="1"/>
+            </w:tcBorders>
+            <w:shd w:fill="F5F6FA" w:val="clear"/>
+            <w:tcMar>
+              <w:top w:type="dxa" w:w="60"/>
+              <w:left w:type="dxa" w:w="100"/>
+              <w:bottom w:type="dxa" w:w="60"/>
+              <w:right w:type="dxa" w:w="100"/>
+            </w:tcMar>
+          </w:tcPr>
+          <w:p>
+            <w:r>
+              <w:rPr>
+                <w:rFonts w:ascii="Calibri" w:cs="Calibri" w:eastAsia="Calibri" w:hAnsi="Calibri"/>
+                <w:b w:val="false"/>
+                <w:bCs w:val="false"/>
+                <w:color w:val="37474F"/>
+                <w:sz w:val="18"/>
+                <w:szCs w:val="18"/>
+              </w:rPr>
+              <w:t xml:space="preserve">100%</w:t>
+            </w:r>
+          </w:p>
+        </w:tc>
+        <w:tc>
+          <w:tcPr>
+            <w:tcW w:type="dxa" w:w="3120"/>
+            <w:tcBorders>
+              <w:top w:val="single" w:color="CCCCCC" w:sz="1"/>
+              <w:left w:val="single" w:color="CCCCCC" w:sz="1"/>
+              <w:bottom w:val="single" w:color="CCCCCC" w:sz="1"/>
+              <w:right w:val="single" w:color="CCCCCC" w:sz="1"/>
+            </w:tcBorders>
+            <w:shd w:fill="F5F6FA" w:val="clear"/>
+            <w:tcMar>
+              <w:top w:type="dxa" w:w="60"/>
+              <w:left w:type="dxa" w:w="100"/>
+              <w:bottom w:type="dxa" w:w="60"/>
+              <w:right w:type="dxa" w:w="100"/>
+            </w:tcMar>
+          </w:tcPr>
+          <w:p>
+            <w:r>
+              <w:rPr>
+                <w:rFonts w:ascii="Calibri" w:cs="Calibri" w:eastAsia="Calibri" w:hAnsi="Calibri"/>
+                <w:b w:val="false"/>
+                <w:bCs w:val="false"/>
+                <w:color w:val="37474F"/>
+                <w:sz w:val="18"/>
+                <w:szCs w:val="18"/>
+              </w:rPr>
+              <w:t xml:space="preserve">CloudTrail / Diagnostic Settings / Cloud Audit Logs enabled</w:t>
+            </w:r>
+          </w:p>
+        </w:tc>
+      </w:tr>
+    </w:tbl>
+    <w:p>
+      <w:r>
+        <w:t xml:space="preserve"/>
+      </w:r>
+    </w:p>
+    <w:p>
+      <w:pPr>
+        <w:pStyle w:val="Heading2"/>
+      </w:pPr>
+      <w:r>
+        <w:rPr>
+          <w:rFonts w:ascii="Arial" w:cs="Arial" w:eastAsia="Arial" w:hAnsi="Arial"/>
+          <w:b/>
+          <w:bCs/>
+          <w:color w:val="1565C0"/>
+          <w:sz w:val="26"/>
+          <w:szCs w:val="26"/>
+        </w:rPr>
+        <w:t xml:space="preserve">11.3 Data Protection and Posture</w:t>
+      </w:r>
+    </w:p>
+    <w:tbl>
+      <w:tblPr>
+        <w:tblW w:type="dxa" w:w="9360"/>
+        <w:tblBorders>
+          <w:top w:val="single" w:color="auto" w:sz="4"/>
+          <w:left w:val="single" w:color="auto" w:sz="4"/>
+          <w:bottom w:val="single" w:color="auto" w:sz="4"/>
+          <w:right w:val="single" w:color="auto" w:sz="4"/>
+          <w:insideH w:val="single" w:color="auto" w:sz="4"/>
+          <w:insideV w:val="single" w:color="auto" w:sz="4"/>
+        </w:tblBorders>
+      </w:tblPr>
+      <w:tblGrid>
+        <w:gridCol w:w="3120"/>
+        <w:gridCol w:w="3120"/>
+        <w:gridCol w:w="3120"/>
+      </w:tblGrid>
+      <w:tr>
+        <w:tc>
+          <w:tcPr>
+            <w:tcW w:type="dxa" w:w="3120"/>
+            <w:tcBorders>
+              <w:top w:val="single" w:color="CCCCCC" w:sz="1"/>
+              <w:left w:val="single" w:color="CCCCCC" w:sz="1"/>
+              <w:bottom w:val="single" w:color="CCCCCC" w:sz="1"/>
+              <w:right w:val="single" w:color="CCCCCC" w:sz="1"/>
+            </w:tcBorders>
+            <w:shd w:fill="0F4C75" w:val="clear"/>
+            <w:tcMar>
+              <w:top w:type="dxa" w:w="60"/>
+              <w:left w:type="dxa" w:w="100"/>
+              <w:bottom w:type="dxa" w:w="60"/>
+              <w:right w:type="dxa" w:w="100"/>
+            </w:tcMar>
+          </w:tcPr>
+          <w:p>
+            <w:r>
+              <w:rPr>
+                <w:rFonts w:ascii="Arial" w:cs="Arial" w:eastAsia="Arial" w:hAnsi="Arial"/>
+                <w:b/>
+                <w:bCs/>
+                <w:color w:val="FFFFFF"/>
+                <w:sz w:val="19"/>
+                <w:szCs w:val="19"/>
+              </w:rPr>
+              <w:t xml:space="preserve">Metric</w:t>
+            </w:r>
+          </w:p>
+        </w:tc>
+        <w:tc>
+          <w:tcPr>
+            <w:tcW w:type="dxa" w:w="3120"/>
+            <w:tcBorders>
+              <w:top w:val="single" w:color="CCCCCC" w:sz="1"/>
+              <w:left w:val="single" w:color="CCCCCC" w:sz="1"/>
+              <w:bottom w:val="single" w:color="CCCCCC" w:sz="1"/>
+              <w:right w:val="single" w:color="CCCCCC" w:sz="1"/>
+            </w:tcBorders>
+            <w:shd w:fill="0F4C75" w:val="clear"/>
+            <w:tcMar>
+              <w:top w:type="dxa" w:w="60"/>
+              <w:left w:type="dxa" w:w="100"/>
+              <w:bottom w:type="dxa" w:w="60"/>
+              <w:right w:type="dxa" w:w="100"/>
+            </w:tcMar>
+          </w:tcPr>
+          <w:p>
+            <w:r>
+              <w:rPr>
+                <w:rFonts w:ascii="Arial" w:cs="Arial" w:eastAsia="Arial" w:hAnsi="Arial"/>
+                <w:b/>
+                <w:bCs/>
+                <w:color w:val="FFFFFF"/>
+                <w:sz w:val="19"/>
+                <w:szCs w:val="19"/>
+              </w:rPr>
+              <w:t xml:space="preserve">Target</w:t>
+            </w:r>
+          </w:p>
+        </w:tc>
+        <w:tc>
+          <w:tcPr>
+            <w:tcW w:type="dxa" w:w="3120"/>
+            <w:tcBorders>
+              <w:top w:val="single" w:color="CCCCCC" w:sz="1"/>
+              <w:left w:val="single" w:color="CCCCCC" w:sz="1"/>
+              <w:bottom w:val="single" w:color="CCCCCC" w:sz="1"/>
+              <w:right w:val="single" w:color="CCCCCC" w:sz="1"/>
+            </w:tcBorders>
+            <w:shd w:fill="0F4C75" w:val="clear"/>
+            <w:tcMar>
+              <w:top w:type="dxa" w:w="60"/>
+              <w:left w:type="dxa" w:w="100"/>
+              <w:bottom w:type="dxa" w:w="60"/>
+              <w:right w:type="dxa" w:w="100"/>
+            </w:tcMar>
+          </w:tcPr>
+          <w:p>
+            <w:r>
+              <w:rPr>
+                <w:rFonts w:ascii="Arial" w:cs="Arial" w:eastAsia="Arial" w:hAnsi="Arial"/>
+                <w:b/>
+                <w:bCs/>
+                <w:color w:val="FFFFFF"/>
+                <w:sz w:val="19"/>
+                <w:szCs w:val="19"/>
+              </w:rPr>
+              <w:t xml:space="preserve">Notes</w:t>
+            </w:r>
+          </w:p>
+        </w:tc>
+      </w:tr>
+      <w:tr>
+        <w:tc>
+          <w:tcPr>
+            <w:tcW w:type="dxa" w:w="3120"/>
+            <w:tcBorders>
+              <w:top w:val="single" w:color="CCCCCC" w:sz="1"/>
+              <w:left w:val="single" w:color="CCCCCC" w:sz="1"/>
+              <w:bottom w:val="single" w:color="CCCCCC" w:sz="1"/>
+              <w:right w:val="single" w:color="CCCCCC" w:sz="1"/>
+            </w:tcBorders>
+            <w:shd w:fill="F5F6FA" w:val="clear"/>
+            <w:tcMar>
+              <w:top w:type="dxa" w:w="60"/>
+              <w:left w:type="dxa" w:w="100"/>
+              <w:bottom w:type="dxa" w:w="60"/>
+              <w:right w:type="dxa" w:w="100"/>
+            </w:tcMar>
+          </w:tcPr>
+          <w:p>
+            <w:r>
+              <w:rPr>
+                <w:rFonts w:ascii="Calibri" w:cs="Calibri" w:eastAsia="Calibri" w:hAnsi="Calibri"/>
+                <w:b/>
+                <w:bCs/>
+                <w:color w:val="37474F"/>
+                <w:sz w:val="18"/>
+                <w:szCs w:val="18"/>
+              </w:rPr>
+              <w:t xml:space="preserve">Publicly accessible storage buckets</w:t>
+            </w:r>
+          </w:p>
+        </w:tc>
+        <w:tc>
+          <w:tcPr>
+            <w:tcW w:type="dxa" w:w="3120"/>
+            <w:tcBorders>
+              <w:top w:val="single" w:color="CCCCCC" w:sz="1"/>
+              <w:left w:val="single" w:color="CCCCCC" w:sz="1"/>
+              <w:bottom w:val="single" w:color="CCCCCC" w:sz="1"/>
+              <w:right w:val="single" w:color="CCCCCC" w:sz="1"/>
+            </w:tcBorders>
+            <w:shd w:fill="F5F6FA" w:val="clear"/>
+            <w:tcMar>
+              <w:top w:type="dxa" w:w="60"/>
+              <w:left w:type="dxa" w:w="100"/>
+              <w:bottom w:type="dxa" w:w="60"/>
+              <w:right w:type="dxa" w:w="100"/>
+            </w:tcMar>
+          </w:tcPr>
+          <w:p>
+            <w:r>
+              <w:rPr>
+                <w:rFonts w:ascii="Calibri" w:cs="Calibri" w:eastAsia="Calibri" w:hAnsi="Calibri"/>
+                <w:b w:val="false"/>
+                <w:bCs w:val="false"/>
+                <w:color w:val="37474F"/>
+                <w:sz w:val="18"/>
+                <w:szCs w:val="18"/>
+              </w:rPr>
+              <w:t xml:space="preserve">0%</w:t>
+            </w:r>
+          </w:p>
+        </w:tc>
+        <w:tc>
+          <w:tcPr>
+            <w:tcW w:type="dxa" w:w="3120"/>
+            <w:tcBorders>
+              <w:top w:val="single" w:color="CCCCCC" w:sz="1"/>
+              <w:left w:val="single" w:color="CCCCCC" w:sz="1"/>
+              <w:bottom w:val="single" w:color="CCCCCC" w:sz="1"/>
+              <w:right w:val="single" w:color="CCCCCC" w:sz="1"/>
+            </w:tcBorders>
+            <w:shd w:fill="F5F6FA" w:val="clear"/>
+            <w:tcMar>
+              <w:top w:type="dxa" w:w="60"/>
+              <w:left w:type="dxa" w:w="100"/>
+              <w:bottom w:type="dxa" w:w="60"/>
+              <w:right w:type="dxa" w:w="100"/>
+            </w:tcMar>
+          </w:tcPr>
+          <w:p>
+            <w:r>
+              <w:rPr>
+                <w:rFonts w:ascii="Calibri" w:cs="Calibri" w:eastAsia="Calibri" w:hAnsi="Calibri"/>
+                <w:b w:val="false"/>
+                <w:bCs w:val="false"/>
+                <w:color w:val="37474F"/>
+                <w:sz w:val="18"/>
+                <w:szCs w:val="18"/>
+              </w:rPr>
+              <w:t xml:space="preserve">S3 Block Public Access / GCS Uniform Bucket-Level Access / Azure Defender</w:t>
+            </w:r>
+          </w:p>
+        </w:tc>
+      </w:tr>
+      <w:tr>
+        <w:tc>
+          <w:tcPr>
+            <w:tcW w:type="dxa" w:w="3120"/>
+            <w:tcBorders>
+              <w:top w:val="single" w:color="CCCCCC" w:sz="1"/>
+              <w:left w:val="single" w:color="CCCCCC" w:sz="1"/>
+              <w:bottom w:val="single" w:color="CCCCCC" w:sz="1"/>
+              <w:right w:val="single" w:color="CCCCCC" w:sz="1"/>
+            </w:tcBorders>
+            <w:shd w:fill="FFFFFF" w:val="clear"/>
+            <w:tcMar>
+              <w:top w:type="dxa" w:w="60"/>
+              <w:left w:type="dxa" w:w="100"/>
+              <w:bottom w:type="dxa" w:w="60"/>
+              <w:right w:type="dxa" w:w="100"/>
+            </w:tcMar>
+          </w:tcPr>
+          <w:p>
+            <w:r>
+              <w:rPr>
+                <w:rFonts w:ascii="Calibri" w:cs="Calibri" w:eastAsia="Calibri" w:hAnsi="Calibri"/>
+                <w:b/>
+                <w:bCs/>
+                <w:color w:val="37474F"/>
+                <w:sz w:val="18"/>
+                <w:szCs w:val="18"/>
+              </w:rPr>
+              <w:t xml:space="preserve">Sensitive data stores without encryption at rest</w:t>
+            </w:r>
+          </w:p>
+        </w:tc>
+        <w:tc>
+          <w:tcPr>
+            <w:tcW w:type="dxa" w:w="3120"/>
+            <w:tcBorders>
+              <w:top w:val="single" w:color="CCCCCC" w:sz="1"/>
+              <w:left w:val="single" w:color="CCCCCC" w:sz="1"/>
+              <w:bottom w:val="single" w:color="CCCCCC" w:sz="1"/>
+              <w:right w:val="single" w:color="CCCCCC" w:sz="1"/>
+            </w:tcBorders>
+            <w:shd w:fill="FFFFFF" w:val="clear"/>
+            <w:tcMar>
+              <w:top w:type="dxa" w:w="60"/>
+              <w:left w:type="dxa" w:w="100"/>
+              <w:bottom w:type="dxa" w:w="60"/>
+              <w:right w:type="dxa" w:w="100"/>
+            </w:tcMar>
+          </w:tcPr>
+          <w:p>
+            <w:r>
+              <w:rPr>
+                <w:rFonts w:ascii="Calibri" w:cs="Calibri" w:eastAsia="Calibri" w:hAnsi="Calibri"/>
+                <w:b w:val="false"/>
+                <w:bCs w:val="false"/>
+                <w:color w:val="37474F"/>
+                <w:sz w:val="18"/>
+                <w:szCs w:val="18"/>
+              </w:rPr>
+              <w:t xml:space="preserve">0%</w:t>
+            </w:r>
+          </w:p>
+        </w:tc>
+        <w:tc>
+          <w:tcPr>
+            <w:tcW w:type="dxa" w:w="3120"/>
+            <w:tcBorders>
+              <w:top w:val="single" w:color="CCCCCC" w:sz="1"/>
+              <w:left w:val="single" w:color="CCCCCC" w:sz="1"/>
+              <w:bottom w:val="single" w:color="CCCCCC" w:sz="1"/>
+              <w:right w:val="single" w:color="CCCCCC" w:sz="1"/>
+            </w:tcBorders>
+            <w:shd w:fill="FFFFFF" w:val="clear"/>
+            <w:tcMar>
+              <w:top w:type="dxa" w:w="60"/>
+              <w:left w:type="dxa" w:w="100"/>
+              <w:bottom w:type="dxa" w:w="60"/>
+              <w:right w:type="dxa" w:w="100"/>
+            </w:tcMar>
+          </w:tcPr>
+          <w:p>
+            <w:r>
+              <w:rPr>
+                <w:rFonts w:ascii="Calibri" w:cs="Calibri" w:eastAsia="Calibri" w:hAnsi="Calibri"/>
+                <w:b w:val="false"/>
+                <w:bCs w:val="false"/>
+                <w:color w:val="37474F"/>
+                <w:sz w:val="18"/>
+                <w:szCs w:val="18"/>
+              </w:rPr>
+              <w:t xml:space="preserve">Enforced via policy guardrails</w:t>
+            </w:r>
+          </w:p>
+        </w:tc>
+      </w:tr>
+      <w:tr>
+        <w:tc>
+          <w:tcPr>
+            <w:tcW w:type="dxa" w:w="3120"/>
+            <w:tcBorders>
+              <w:top w:val="single" w:color="CCCCCC" w:sz="1"/>
+              <w:left w:val="single" w:color="CCCCCC" w:sz="1"/>
+              <w:bottom w:val="single" w:color="CCCCCC" w:sz="1"/>
+              <w:right w:val="single" w:color="CCCCCC" w:sz="1"/>
+            </w:tcBorders>
+            <w:shd w:fill="F5F6FA" w:val="clear"/>
+            <w:tcMar>
+              <w:top w:type="dxa" w:w="60"/>
+              <w:left w:type="dxa" w:w="100"/>
+              <w:bottom w:type="dxa" w:w="60"/>
+              <w:right w:type="dxa" w:w="100"/>
+            </w:tcMar>
+          </w:tcPr>
+          <w:p>
+            <w:r>
+              <w:rPr>
+                <w:rFonts w:ascii="Calibri" w:cs="Calibri" w:eastAsia="Calibri" w:hAnsi="Calibri"/>
+                <w:b/>
+                <w:bCs/>
+                <w:color w:val="37474F"/>
+                <w:sz w:val="18"/>
+                <w:szCs w:val="18"/>
+              </w:rPr>
+              <w:t xml:space="preserve">Secrets found in code repositories or container images</w:t>
+            </w:r>
+          </w:p>
+        </w:tc>
+        <w:tc>
+          <w:tcPr>
+            <w:tcW w:type="dxa" w:w="3120"/>
+            <w:tcBorders>
+              <w:top w:val="single" w:color="CCCCCC" w:sz="1"/>
+              <w:left w:val="single" w:color="CCCCCC" w:sz="1"/>
+              <w:bottom w:val="single" w:color="CCCCCC" w:sz="1"/>
+              <w:right w:val="single" w:color="CCCCCC" w:sz="1"/>
+            </w:tcBorders>
+            <w:shd w:fill="F5F6FA" w:val="clear"/>
+            <w:tcMar>
+              <w:top w:type="dxa" w:w="60"/>
+              <w:left w:type="dxa" w:w="100"/>
+              <w:bottom w:type="dxa" w:w="60"/>
+              <w:right w:type="dxa" w:w="100"/>
+            </w:tcMar>
+          </w:tcPr>
+          <w:p>
+            <w:r>
+              <w:rPr>
+                <w:rFonts w:ascii="Calibri" w:cs="Calibri" w:eastAsia="Calibri" w:hAnsi="Calibri"/>
+                <w:b w:val="false"/>
+                <w:bCs w:val="false"/>
+                <w:color w:val="37474F"/>
+                <w:sz w:val="18"/>
+                <w:szCs w:val="18"/>
+              </w:rPr>
+              <w:t xml:space="preserve">0%</w:t>
+            </w:r>
+          </w:p>
+        </w:tc>
+        <w:tc>
+          <w:tcPr>
+            <w:tcW w:type="dxa" w:w="3120"/>
+            <w:tcBorders>
+              <w:top w:val="single" w:color="CCCCCC" w:sz="1"/>
+              <w:left w:val="single" w:color="CCCCCC" w:sz="1"/>
+              <w:bottom w:val="single" w:color="CCCCCC" w:sz="1"/>
+              <w:right w:val="single" w:color="CCCCCC" w:sz="1"/>
+            </w:tcBorders>
+            <w:shd w:fill="F5F6FA" w:val="clear"/>
+            <w:tcMar>
+              <w:top w:type="dxa" w:w="60"/>
+              <w:left w:type="dxa" w:w="100"/>
+              <w:bottom w:type="dxa" w:w="60"/>
+              <w:right w:type="dxa" w:w="100"/>
+            </w:tcMar>
+          </w:tcPr>
+          <w:p>
+            <w:r>
+              <w:rPr>
+                <w:rFonts w:ascii="Calibri" w:cs="Calibri" w:eastAsia="Calibri" w:hAnsi="Calibri"/>
+                <w:b w:val="false"/>
+                <w:bCs w:val="false"/>
+                <w:color w:val="37474F"/>
+                <w:sz w:val="18"/>
+                <w:szCs w:val="18"/>
+              </w:rPr>
+              <w:t xml:space="preserve">Secret scanning enabled in CI and repo platform</w:t>
+            </w:r>
+          </w:p>
+        </w:tc>
+      </w:tr>
+      <w:tr>
+        <w:tc>
+          <w:tcPr>
+            <w:tcW w:type="dxa" w:w="3120"/>
+            <w:tcBorders>
+              <w:top w:val="single" w:color="CCCCCC" w:sz="1"/>
+              <w:left w:val="single" w:color="CCCCCC" w:sz="1"/>
+              <w:bottom w:val="single" w:color="CCCCCC" w:sz="1"/>
+              <w:right w:val="single" w:color="CCCCCC" w:sz="1"/>
+            </w:tcBorders>
+            <w:shd w:fill="FFFFFF" w:val="clear"/>
+            <w:tcMar>
+              <w:top w:type="dxa" w:w="60"/>
+              <w:left w:type="dxa" w:w="100"/>
+              <w:bottom w:type="dxa" w:w="60"/>
+              <w:right w:type="dxa" w:w="100"/>
+            </w:tcMar>
+          </w:tcPr>
+          <w:p>
+            <w:r>
+              <w:rPr>
+                <w:rFonts w:ascii="Calibri" w:cs="Calibri" w:eastAsia="Calibri" w:hAnsi="Calibri"/>
+                <w:b/>
+                <w:bCs/>
+                <w:color w:val="37474F"/>
+                <w:sz w:val="18"/>
+                <w:szCs w:val="18"/>
+              </w:rPr>
+              <w:t xml:space="preserve">CMK rotation compliance (annual or per policy)</w:t>
+            </w:r>
+          </w:p>
+        </w:tc>
+        <w:tc>
+          <w:tcPr>
+            <w:tcW w:type="dxa" w:w="3120"/>
+            <w:tcBorders>
+              <w:top w:val="single" w:color="CCCCCC" w:sz="1"/>
+              <w:left w:val="single" w:color="CCCCCC" w:sz="1"/>
+              <w:bottom w:val="single" w:color="CCCCCC" w:sz="1"/>
+              <w:right w:val="single" w:color="CCCCCC" w:sz="1"/>
+            </w:tcBorders>
+            <w:shd w:fill="FFFFFF" w:val="clear"/>
+            <w:tcMar>
+              <w:top w:type="dxa" w:w="60"/>
+              <w:left w:type="dxa" w:w="100"/>
+              <w:bottom w:type="dxa" w:w="60"/>
+              <w:right w:type="dxa" w:w="100"/>
+            </w:tcMar>
+          </w:tcPr>
+          <w:p>
+            <w:r>
+              <w:rPr>
+                <w:rFonts w:ascii="Calibri" w:cs="Calibri" w:eastAsia="Calibri" w:hAnsi="Calibri"/>
+                <w:b w:val="false"/>
+                <w:bCs w:val="false"/>
+                <w:color w:val="37474F"/>
+                <w:sz w:val="18"/>
+                <w:szCs w:val="18"/>
+              </w:rPr>
+              <w:t xml:space="preserve">100%</w:t>
+            </w:r>
+          </w:p>
+        </w:tc>
+        <w:tc>
+          <w:tcPr>
+            <w:tcW w:type="dxa" w:w="3120"/>
+            <w:tcBorders>
+              <w:top w:val="single" w:color="CCCCCC" w:sz="1"/>
+              <w:left w:val="single" w:color="CCCCCC" w:sz="1"/>
+              <w:bottom w:val="single" w:color="CCCCCC" w:sz="1"/>
+              <w:right w:val="single" w:color="CCCCCC" w:sz="1"/>
+            </w:tcBorders>
+            <w:shd w:fill="FFFFFF" w:val="clear"/>
+            <w:tcMar>
+              <w:top w:type="dxa" w:w="60"/>
+              <w:left w:type="dxa" w:w="100"/>
+              <w:bottom w:type="dxa" w:w="60"/>
+              <w:right w:type="dxa" w:w="100"/>
+            </w:tcMar>
+          </w:tcPr>
+          <w:p>
+            <w:r>
+              <w:rPr>
+                <w:rFonts w:ascii="Calibri" w:cs="Calibri" w:eastAsia="Calibri" w:hAnsi="Calibri"/>
+                <w:b w:val="false"/>
+                <w:bCs w:val="false"/>
+                <w:color w:val="37474F"/>
+                <w:sz w:val="18"/>
+                <w:szCs w:val="18"/>
+              </w:rPr>
+              <w:t xml:space="preserve">Automated rotation enforced via KMS policy</w:t>
+            </w:r>
+          </w:p>
+        </w:tc>
+      </w:tr>
+      <w:tr>
+        <w:tc>
+          <w:tcPr>
+            <w:tcW w:type="dxa" w:w="3120"/>
+            <w:tcBorders>
+              <w:top w:val="single" w:color="CCCCCC" w:sz="1"/>
+              <w:left w:val="single" w:color="CCCCCC" w:sz="1"/>
+              <w:bottom w:val="single" w:color="CCCCCC" w:sz="1"/>
+              <w:right w:val="single" w:color="CCCCCC" w:sz="1"/>
+            </w:tcBorders>
+            <w:shd w:fill="F5F6FA" w:val="clear"/>
+            <w:tcMar>
+              <w:top w:type="dxa" w:w="60"/>
+              <w:left w:type="dxa" w:w="100"/>
+              <w:bottom w:type="dxa" w:w="60"/>
+              <w:right w:type="dxa" w:w="100"/>
+            </w:tcMar>
+          </w:tcPr>
+          <w:p>
+            <w:r>
+              <w:rPr>
+                <w:rFonts w:ascii="Calibri" w:cs="Calibri" w:eastAsia="Calibri" w:hAnsi="Calibri"/>
+                <w:b/>
+                <w:bCs/>
+                <w:color w:val="37474F"/>
+                <w:sz w:val="18"/>
+                <w:szCs w:val="18"/>
+              </w:rPr>
+              <w:t xml:space="preserve">DSPM scan coverage over production data stores</w:t>
+            </w:r>
+          </w:p>
+        </w:tc>
+        <w:tc>
+          <w:tcPr>
+            <w:tcW w:type="dxa" w:w="3120"/>
+            <w:tcBorders>
+              <w:top w:val="single" w:color="CCCCCC" w:sz="1"/>
+              <w:left w:val="single" w:color="CCCCCC" w:sz="1"/>
+              <w:bottom w:val="single" w:color="CCCCCC" w:sz="1"/>
+              <w:right w:val="single" w:color="CCCCCC" w:sz="1"/>
+            </w:tcBorders>
+            <w:shd w:fill="F5F6FA" w:val="clear"/>
+            <w:tcMar>
+              <w:top w:type="dxa" w:w="60"/>
+              <w:left w:type="dxa" w:w="100"/>
+              <w:bottom w:type="dxa" w:w="60"/>
+              <w:right w:type="dxa" w:w="100"/>
+            </w:tcMar>
+          </w:tcPr>
+          <w:p>
+            <w:r>
+              <w:rPr>
+                <w:rFonts w:ascii="Calibri" w:cs="Calibri" w:eastAsia="Calibri" w:hAnsi="Calibri"/>
+                <w:b w:val="false"/>
+                <w:bCs w:val="false"/>
+                <w:color w:val="37474F"/>
+                <w:sz w:val="18"/>
+                <w:szCs w:val="18"/>
+              </w:rPr>
+              <w:t xml:space="preserve">&gt; 95%</w:t>
+            </w:r>
+          </w:p>
+        </w:tc>
+        <w:tc>
+          <w:tcPr>
+            <w:tcW w:type="dxa" w:w="3120"/>
+            <w:tcBorders>
+              <w:top w:val="single" w:color="CCCCCC" w:sz="1"/>
+              <w:left w:val="single" w:color="CCCCCC" w:sz="1"/>
+              <w:bottom w:val="single" w:color="CCCCCC" w:sz="1"/>
+              <w:right w:val="single" w:color="CCCCCC" w:sz="1"/>
+            </w:tcBorders>
+            <w:shd w:fill="F5F6FA" w:val="clear"/>
+            <w:tcMar>
+              <w:top w:type="dxa" w:w="60"/>
+              <w:left w:type="dxa" w:w="100"/>
+              <w:bottom w:type="dxa" w:w="60"/>
+              <w:right w:type="dxa" w:w="100"/>
+            </w:tcMar>
+          </w:tcPr>
+          <w:p>
+            <w:r>
+              <w:rPr>
+                <w:rFonts w:ascii="Calibri" w:cs="Calibri" w:eastAsia="Calibri" w:hAnsi="Calibri"/>
+                <w:b w:val="false"/>
+                <w:bCs w:val="false"/>
+                <w:color w:val="37474F"/>
+                <w:sz w:val="18"/>
+                <w:szCs w:val="18"/>
+              </w:rPr>
+              <w:t xml:space="preserve">Remaining 5% documented with compensating controls</w:t>
+            </w:r>
+          </w:p>
+        </w:tc>
+      </w:tr>
+    </w:tbl>
+    <w:p>
+      <w:r>
+        <w:t xml:space="preserve"/>
+      </w:r>
+    </w:p>
+    <w:p>
+      <w:pPr>
+        <w:pStyle w:val="Heading2"/>
+      </w:pPr>
+      <w:r>
+        <w:rPr>
+          <w:rFonts w:ascii="Arial" w:cs="Arial" w:eastAsia="Arial" w:hAnsi="Arial"/>
+          <w:b/>
+          <w:bCs/>
+          <w:color w:val="1565C0"/>
+          <w:sz w:val="26"/>
+          <w:szCs w:val="26"/>
+        </w:rPr>
+        <w:t xml:space="preserve">11.4 Supply Chain and Build Integrity</w:t>
+      </w:r>
+    </w:p>
+    <w:p>
+      <w:pPr>
+        <w:pStyle w:val="ListParagraph"/>
+        <w:numPr>
+          <w:ilvl w:val="0"/>
+          <w:numId w:val="2"/>
+        </w:numPr>
+        <w:spacing w:after="30" w:before="30"/>
+      </w:pPr>
+      <w:r>
+        <w:rPr>
+          <w:rFonts w:ascii="Calibri" w:cs="Calibri" w:eastAsia="Calibri" w:hAnsi="Calibri"/>
+          <w:color w:val="37474F"/>
+          <w:sz w:val="20"/>
+          <w:szCs w:val="20"/>
+        </w:rPr>
+        <w:t xml:space="preserve">Build pipeline SLSA Level: Target Level 3 for all production artifacts. Measure percentage of pipelines meeting this bar.</w:t>
+      </w:r>
+    </w:p>
+    <w:p>
+      <w:pPr>
+        <w:pStyle w:val="ListParagraph"/>
+        <w:numPr>
+          <w:ilvl w:val="0"/>
+          <w:numId w:val="2"/>
+        </w:numPr>
+        <w:spacing w:after="30" w:before="30"/>
+      </w:pPr>
+      <w:r>
+        <w:rPr>
+          <w:rFonts w:ascii="Calibri" w:cs="Calibri" w:eastAsia="Calibri" w:hAnsi="Calibri"/>
+          <w:color w:val="37474F"/>
+          <w:sz w:val="20"/>
+          <w:szCs w:val="20"/>
+        </w:rPr>
+        <w:t xml:space="preserve">Artifact signature verification: 100% of container images verified via Cosign or equivalent before deployment to production.</w:t>
+      </w:r>
+    </w:p>
+    <w:p>
+      <w:pPr>
+        <w:pStyle w:val="ListParagraph"/>
+        <w:numPr>
+          <w:ilvl w:val="0"/>
+          <w:numId w:val="2"/>
+        </w:numPr>
+        <w:spacing w:after="30" w:before="30"/>
+      </w:pPr>
+      <w:r>
+        <w:rPr>
+          <w:rFonts w:ascii="Calibri" w:cs="Calibri" w:eastAsia="Calibri" w:hAnsi="Calibri"/>
+          <w:color w:val="37474F"/>
+          <w:sz w:val="20"/>
+          <w:szCs w:val="20"/>
+        </w:rPr>
+        <w:t xml:space="preserve">Dependency vulnerability scan pass rate: Critical and high vulnerabilities in dependencies must be resolved before production promotion.</w:t>
+      </w:r>
+    </w:p>
+    <w:p>
+      <w:pPr>
+        <w:pStyle w:val="ListParagraph"/>
+        <w:numPr>
+          <w:ilvl w:val="0"/>
+          <w:numId w:val="2"/>
+        </w:numPr>
+        <w:spacing w:after="30" w:before="30"/>
+      </w:pPr>
+      <w:r>
+        <w:rPr>
+          <w:rFonts w:ascii="Calibri" w:cs="Calibri" w:eastAsia="Calibri" w:hAnsi="Calibri"/>
+          <w:color w:val="37474F"/>
+          <w:sz w:val="20"/>
+          <w:szCs w:val="20"/>
+        </w:rPr>
+        <w:t xml:space="preserve">IaC policy scan pass rate: 100% of infrastructure-as-code changes scanned against security policy before merge.</w:t>
+      </w:r>
+    </w:p>
+    <w:p>
+      <w:pPr>
+        <w:pStyle w:val="ListParagraph"/>
+        <w:numPr>
+          <w:ilvl w:val="0"/>
+          <w:numId w:val="2"/>
+        </w:numPr>
+        <w:spacing w:after="30" w:before="30"/>
+      </w:pPr>
+      <w:r>
+        <w:rPr>
+          <w:rFonts w:ascii="Calibri" w:cs="Calibri" w:eastAsia="Calibri" w:hAnsi="Calibri"/>
+          <w:color w:val="37474F"/>
+          <w:sz w:val="20"/>
+          <w:szCs w:val="20"/>
+        </w:rPr>
+        <w:t xml:space="preserve">SBOM generation coverage: 100% of production services generating machine-readable SBOM per build.</w:t>
+      </w:r>
+    </w:p>
+    <w:tbl>
+      <w:tblPr>
+        <w:tblW w:type="dxa" w:w="9360"/>
+        <w:tblBorders>
+          <w:top w:val="single" w:color="auto" w:sz="4"/>
+          <w:left w:val="single" w:color="auto" w:sz="4"/>
+          <w:bottom w:val="single" w:color="auto" w:sz="4"/>
+          <w:right w:val="single" w:color="auto" w:sz="4"/>
+          <w:insideH w:val="single" w:color="auto" w:sz="4"/>
+          <w:insideV w:val="single" w:color="auto" w:sz="4"/>
+        </w:tblBorders>
+      </w:tblPr>
+      <w:tblGrid>
+        <w:gridCol w:w="9360"/>
+      </w:tblGrid>
+      <w:tr>
+        <w:tc>
+          <w:tcPr>
+            <w:tcW w:type="dxa" w:w="9360"/>
+            <w:tcBorders>
+              <w:top w:val="single" w:color="CCCCCC" w:sz="1"/>
+              <w:left w:val="single" w:color="F4A261" w:sz="8"/>
+              <w:bottom w:val="single" w:color="CCCCCC" w:sz="1"/>
+              <w:right w:val="none" w:color="FFFFFF" w:sz="0"/>
+            </w:tcBorders>
+            <w:shd w:fill="F0F4F8" w:val="clear"/>
+            <w:tcMar>
+              <w:top w:type="dxa" w:w="80"/>
+              <w:left w:type="dxa" w:w="160"/>
+              <w:bottom w:type="dxa" w:w="80"/>
+              <w:right w:type="dxa" w:w="160"/>
+            </w:tcMar>
+          </w:tcPr>
+          <w:p>
+            <w:pPr>
+              <w:spacing w:after="0" w:before="0"/>
+            </w:pPr>
+            <w:r>
+              <w:rPr>
+                <w:rFonts w:ascii="Calibri" w:cs="Calibri" w:eastAsia="Calibri" w:hAnsi="Calibri"/>
+                <w:color w:val="37474F"/>
+                <w:sz w:val="19"/>
+                <w:szCs w:val="19"/>
+              </w:rPr>
+              <w:t xml:space="preserve">Metrics without ownership are decorative. Assign a named owner per metric, define remediation SLAs, and integrate metrics into security reviews and quarterly reporting.</w:t>
             </w:r>
           </w:p>
         </w:tc>

</xml_diff>

<commit_message>
docs(cloud): add Section 5 Advanced Security Domains + Key Takeaways
New Section 5: Advanced Security Domains with 7 subsections:
- 5.1 Machine Identity Governance (inventory, no static creds, lifecycle, detection)
- 5.2 Service-to-Service Zero Trust (SPIFFE/SPIRE, Istio mTLS, egress control)
- 5.3 Dynamic Secrets Architecture (Vault, short TTLs, cloud-native rotation)
- 5.4 DSPM (Discover → Classify → Monitor, Wiz/Varonis/Purview)
- 5.5 Runtime Threat Detection (GuardDuty/Defender/SCC, Falco, UEBA)
- 5.6 Software Supply Chain Security (SCA, Sigstore/Cosign, SBOM, SLSA L3)
- 5.7 Centralized Identity and Logging Architecture (IdP federation, SIEM, retention)

Renumbered existing sections 5-11 → 6-12 for consistency.
Added Key Takeaways section (8 strategic principles) before Attribution.
Document now 816 paragraphs (was 731).
</commit_message>
<xml_diff>
--- a/Cloud/cloud_security_architecture.docx
+++ b/Cloud/cloud_security_architecture.docx
@@ -7447,7 +7447,7 @@
           <w:sz w:val="32"/>
           <w:szCs w:val="32"/>
         </w:rPr>
-        <w:t xml:space="preserve">5. Multi-Cloud Zero Trust Architecture</w:t>
+        <w:t xml:space="preserve">5. Advanced Security Domains</w:t>
       </w:r>
     </w:p>
     <w:p>
@@ -7465,7 +7465,7 @@
           <w:sz w:val="22"/>
           <w:szCs w:val="22"/>
         </w:rPr>
-        <w:t xml:space="preserve">Operating across AWS, Azure, and GCP requires a unified Zero Trust architecture that bridges cloud-native identity systems, establishes consistent network isolation, and centralizes detection. The four pillars of multi-cloud Zero Trust are:</w:t>
+        <w:t xml:space="preserve">Beyond foundational cloud-native controls, production environments require dedicated treatment of workload identity, service-to-service trust, secrets lifecycle, data posture, runtime defense, software supply chain integrity, and centralized observability. These domains cut across all three major cloud providers and must be addressed with cross-cutting architecture rather than per-cloud point solutions.</w:t>
       </w:r>
     </w:p>
     <w:p>
@@ -7481,7 +7481,7 @@
           <w:sz w:val="26"/>
           <w:szCs w:val="26"/>
         </w:rPr>
-        <w:t xml:space="preserve">5.1 Unified Identity</w:t>
+        <w:t xml:space="preserve">5.1 Machine Identity Governance</w:t>
       </w:r>
     </w:p>
     <w:p>
@@ -7499,102 +7499,102 @@
           <w:sz w:val="22"/>
           <w:szCs w:val="22"/>
         </w:rPr>
-        <w:t xml:space="preserve">A single Identity Provider federates to all three cloud IAM systems. This ensures consistent authentication policies (MFA, Conditional Access) and a single audit trail.</w:t>
-      </w:r>
-    </w:p>
-    <w:p>
-      <w:pPr>
-        <w:pStyle w:val="ListParagraph"/>
-        <w:numPr>
-          <w:ilvl w:val="0"/>
-          <w:numId w:val="2"/>
-        </w:numPr>
-        <w:spacing w:after="30" w:before="30"/>
-      </w:pPr>
-      <w:r>
-        <w:rPr>
-          <w:rFonts w:ascii="Calibri" w:cs="Calibri" w:eastAsia="Calibri" w:hAnsi="Calibri"/>
-          <w:color w:val="37474F"/>
-          <w:sz w:val="20"/>
-          <w:szCs w:val="20"/>
-        </w:rPr>
-        <w:t xml:space="preserve">Central IdP: Microsoft Entra ID or Okta. All human identities authenticate through the central IdP.</w:t>
-      </w:r>
-    </w:p>
-    <w:p>
-      <w:pPr>
-        <w:pStyle w:val="ListParagraph"/>
-        <w:numPr>
-          <w:ilvl w:val="0"/>
-          <w:numId w:val="2"/>
-        </w:numPr>
-        <w:spacing w:after="30" w:before="30"/>
-      </w:pPr>
-      <w:r>
-        <w:rPr>
-          <w:rFonts w:ascii="Calibri" w:cs="Calibri" w:eastAsia="Calibri" w:hAnsi="Calibri"/>
-          <w:color w:val="37474F"/>
-          <w:sz w:val="20"/>
-          <w:szCs w:val="20"/>
-        </w:rPr>
-        <w:t xml:space="preserve">AWS: SAML 2.0 or OIDC federation to IAM Identity Center (AWS SSO). Users get permission sets, not direct IAM roles.</w:t>
-      </w:r>
-    </w:p>
-    <w:p>
-      <w:pPr>
-        <w:pStyle w:val="ListParagraph"/>
-        <w:numPr>
-          <w:ilvl w:val="0"/>
-          <w:numId w:val="2"/>
-        </w:numPr>
-        <w:spacing w:after="30" w:before="30"/>
-      </w:pPr>
-      <w:r>
-        <w:rPr>
-          <w:rFonts w:ascii="Calibri" w:cs="Calibri" w:eastAsia="Calibri" w:hAnsi="Calibri"/>
-          <w:color w:val="37474F"/>
-          <w:sz w:val="20"/>
-          <w:szCs w:val="20"/>
-        </w:rPr>
-        <w:t xml:space="preserve">Azure: Entra ID is native. Ensure all external identities also federate through central IdP.</w:t>
-      </w:r>
-    </w:p>
-    <w:p>
-      <w:pPr>
-        <w:pStyle w:val="ListParagraph"/>
-        <w:numPr>
-          <w:ilvl w:val="0"/>
-          <w:numId w:val="2"/>
-        </w:numPr>
-        <w:spacing w:after="30" w:before="30"/>
-      </w:pPr>
-      <w:r>
-        <w:rPr>
-          <w:rFonts w:ascii="Calibri" w:cs="Calibri" w:eastAsia="Calibri" w:hAnsi="Calibri"/>
-          <w:color w:val="37474F"/>
-          <w:sz w:val="20"/>
-          <w:szCs w:val="20"/>
-        </w:rPr>
-        <w:t xml:space="preserve">GCP: Google Workspace with Cloud Identity, or SAML federation from Entra ID / Okta to Cloud Identity.</w:t>
-      </w:r>
-    </w:p>
-    <w:p>
-      <w:pPr>
-        <w:pStyle w:val="ListParagraph"/>
-        <w:numPr>
-          <w:ilvl w:val="0"/>
-          <w:numId w:val="2"/>
-        </w:numPr>
-        <w:spacing w:after="30" w:before="30"/>
-      </w:pPr>
-      <w:r>
-        <w:rPr>
-          <w:rFonts w:ascii="Calibri" w:cs="Calibri" w:eastAsia="Calibri" w:hAnsi="Calibri"/>
-          <w:color w:val="37474F"/>
-          <w:sz w:val="20"/>
-          <w:szCs w:val="20"/>
-        </w:rPr>
-        <w:t xml:space="preserve">Workload-to-workload: Use OIDC/SAML token exchange between cloud boundaries (AWS → GCP via Workload Identity Federation).</w:t>
+        <w:t xml:space="preserve">Machine identities — service accounts, workload identities, CI/CD pipelines, Kubernetes pods, and compute instances — now outnumber human identities by an order of magnitude in most enterprise cloud environments. Poor machine identity hygiene is the primary enabler of lateral movement and privilege escalation.</w:t>
+      </w:r>
+    </w:p>
+    <w:p>
+      <w:pPr>
+        <w:pStyle w:val="ListParagraph"/>
+        <w:numPr>
+          <w:ilvl w:val="0"/>
+          <w:numId w:val="2"/>
+        </w:numPr>
+        <w:spacing w:after="30" w:before="30"/>
+      </w:pPr>
+      <w:r>
+        <w:rPr>
+          <w:rFonts w:ascii="Calibri" w:cs="Calibri" w:eastAsia="Calibri" w:hAnsi="Calibri"/>
+          <w:color w:val="37474F"/>
+          <w:sz w:val="20"/>
+          <w:szCs w:val="20"/>
+        </w:rPr>
+        <w:t xml:space="preserve">Inventory: maintain a live registry of every machine identity, its trust anchor (OIDC issuer, IAM role, managed identity), owning team, and last-used timestamp. Automate discovery via cloud IAM APIs on a daily schedule.</w:t>
+      </w:r>
+    </w:p>
+    <w:p>
+      <w:pPr>
+        <w:pStyle w:val="ListParagraph"/>
+        <w:numPr>
+          <w:ilvl w:val="0"/>
+          <w:numId w:val="2"/>
+        </w:numPr>
+        <w:spacing w:after="30" w:before="30"/>
+      </w:pPr>
+      <w:r>
+        <w:rPr>
+          <w:rFonts w:ascii="Calibri" w:cs="Calibri" w:eastAsia="Calibri" w:hAnsi="Calibri"/>
+          <w:color w:val="37474F"/>
+          <w:sz w:val="20"/>
+          <w:szCs w:val="20"/>
+        </w:rPr>
+        <w:t xml:space="preserve">No static credentials: prohibit long-lived access keys for any machine identity. Use IRSA (AWS), Workload Identity (GCP), and Managed Identities (Azure) exclusively. Enforce with AWS Org Policy (iam:CreateAccessKey deny), GCP Org Policy (iam.disableServiceAccountKeyCreation), and Azure Policy.</w:t>
+      </w:r>
+    </w:p>
+    <w:p>
+      <w:pPr>
+        <w:pStyle w:val="ListParagraph"/>
+        <w:numPr>
+          <w:ilvl w:val="0"/>
+          <w:numId w:val="2"/>
+        </w:numPr>
+        <w:spacing w:after="30" w:before="30"/>
+      </w:pPr>
+      <w:r>
+        <w:rPr>
+          <w:rFonts w:ascii="Calibri" w:cs="Calibri" w:eastAsia="Calibri" w:hAnsi="Calibri"/>
+          <w:color w:val="37474F"/>
+          <w:sz w:val="20"/>
+          <w:szCs w:val="20"/>
+        </w:rPr>
+        <w:t xml:space="preserve">Lifecycle management: service accounts must have a defined owner, a documented purpose, and an expiry review date. Decommission immediately on workload retirement. Automate alerts for service accounts unused for 90 days.</w:t>
+      </w:r>
+    </w:p>
+    <w:p>
+      <w:pPr>
+        <w:pStyle w:val="ListParagraph"/>
+        <w:numPr>
+          <w:ilvl w:val="0"/>
+          <w:numId w:val="2"/>
+        </w:numPr>
+        <w:spacing w:after="30" w:before="30"/>
+      </w:pPr>
+      <w:r>
+        <w:rPr>
+          <w:rFonts w:ascii="Calibri" w:cs="Calibri" w:eastAsia="Calibri" w:hAnsi="Calibri"/>
+          <w:color w:val="37474F"/>
+          <w:sz w:val="20"/>
+          <w:szCs w:val="20"/>
+        </w:rPr>
+        <w:t xml:space="preserve">Least privilege: machine identity permissions must be bounded to the specific APIs, resources, and conditions required. Use IAM condition keys (aws:RequestedRegion, resource tags) and GCP IAM conditions to scope beyond role level.</w:t>
+      </w:r>
+    </w:p>
+    <w:p>
+      <w:pPr>
+        <w:pStyle w:val="ListParagraph"/>
+        <w:numPr>
+          <w:ilvl w:val="0"/>
+          <w:numId w:val="2"/>
+        </w:numPr>
+        <w:spacing w:after="30" w:before="30"/>
+      </w:pPr>
+      <w:r>
+        <w:rPr>
+          <w:rFonts w:ascii="Calibri" w:cs="Calibri" w:eastAsia="Calibri" w:hAnsi="Calibri"/>
+          <w:color w:val="37474F"/>
+          <w:sz w:val="20"/>
+          <w:szCs w:val="20"/>
+        </w:rPr>
+        <w:t xml:space="preserve">Detection: alert on: service account key creation events, cross-account AssumeRole from unusual source IPs, token requests outside expected CIDR, and service account impersonation (GCP).</w:t>
       </w:r>
     </w:p>
     <w:p>
@@ -7615,83 +7615,120 @@
           <w:sz w:val="26"/>
           <w:szCs w:val="26"/>
         </w:rPr>
-        <w:t xml:space="preserve">5.2 Workload Identity Cross-Cloud</w:t>
-      </w:r>
-    </w:p>
-    <w:p>
-      <w:pPr>
-        <w:pStyle w:val="ListParagraph"/>
-        <w:numPr>
-          <w:ilvl w:val="0"/>
-          <w:numId w:val="2"/>
-        </w:numPr>
-        <w:spacing w:after="30" w:before="30"/>
-      </w:pPr>
-      <w:r>
-        <w:rPr>
-          <w:rFonts w:ascii="Calibri" w:cs="Calibri" w:eastAsia="Calibri" w:hAnsi="Calibri"/>
-          <w:color w:val="37474F"/>
-          <w:sz w:val="20"/>
-          <w:szCs w:val="20"/>
-        </w:rPr>
-        <w:t xml:space="preserve">AWS → GCP: AWS EC2/EKS workloads use IRSA/Instance Profile to get AWS STS token; exchange for GCP Workload Identity token via federation.</w:t>
-      </w:r>
-    </w:p>
-    <w:p>
-      <w:pPr>
-        <w:pStyle w:val="ListParagraph"/>
-        <w:numPr>
-          <w:ilvl w:val="0"/>
-          <w:numId w:val="2"/>
-        </w:numPr>
-        <w:spacing w:after="30" w:before="30"/>
-      </w:pPr>
-      <w:r>
-        <w:rPr>
-          <w:rFonts w:ascii="Calibri" w:cs="Calibri" w:eastAsia="Calibri" w:hAnsi="Calibri"/>
-          <w:color w:val="37474F"/>
-          <w:sz w:val="20"/>
-          <w:szCs w:val="20"/>
-        </w:rPr>
-        <w:t xml:space="preserve">GitHub Actions → All clouds: OIDC token from GitHub Actions federated to all three clouds. No static credentials in GitHub Secrets.</w:t>
-      </w:r>
-    </w:p>
-    <w:p>
-      <w:pPr>
-        <w:pStyle w:val="ListParagraph"/>
-        <w:numPr>
-          <w:ilvl w:val="0"/>
-          <w:numId w:val="2"/>
-        </w:numPr>
-        <w:spacing w:after="30" w:before="30"/>
-      </w:pPr>
-      <w:r>
-        <w:rPr>
-          <w:rFonts w:ascii="Calibri" w:cs="Calibri" w:eastAsia="Calibri" w:hAnsi="Calibri"/>
-          <w:color w:val="37474F"/>
-          <w:sz w:val="20"/>
-          <w:szCs w:val="20"/>
-        </w:rPr>
-        <w:t xml:space="preserve">Vault (HashiCorp): deploy Vault with cloud-native auto-unseal (AWS KMS / Azure Key Vault / GCP KMS). Vault handles secret lifecycle across all providers.</w:t>
-      </w:r>
-    </w:p>
-    <w:p>
-      <w:pPr>
-        <w:pStyle w:val="ListParagraph"/>
-        <w:numPr>
-          <w:ilvl w:val="0"/>
-          <w:numId w:val="2"/>
-        </w:numPr>
-        <w:spacing w:after="30" w:before="30"/>
-      </w:pPr>
-      <w:r>
-        <w:rPr>
-          <w:rFonts w:ascii="Calibri" w:cs="Calibri" w:eastAsia="Calibri" w:hAnsi="Calibri"/>
-          <w:color w:val="37474F"/>
-          <w:sz w:val="20"/>
-          <w:szCs w:val="20"/>
-        </w:rPr>
-        <w:t xml:space="preserve">No shared secrets between clouds: each cloud-to-cloud trust relationship uses token federation, not static keys.</w:t>
+        <w:t xml:space="preserve">5.2 Service-to-Service Zero Trust</w:t>
+      </w:r>
+    </w:p>
+    <w:p>
+      <w:pPr>
+        <w:spacing w:after="100" w:before="60"/>
+      </w:pPr>
+      <w:r>
+        <w:rPr>
+          <w:rFonts w:ascii="Calibri" w:cs="Calibri" w:eastAsia="Calibri" w:hAnsi="Calibri"/>
+          <w:b w:val="false"/>
+          <w:bCs w:val="false"/>
+          <w:i w:val="false"/>
+          <w:iCs w:val="false"/>
+          <w:color w:val="37474F"/>
+          <w:sz w:val="22"/>
+          <w:szCs w:val="22"/>
+        </w:rPr>
+        <w:t xml:space="preserve">Within and across clusters, services must authenticate each other cryptographically. Implicit network trust ("anything inside the VPC is trusted") is a well-documented attack enabler. Service mesh with mutual TLS provides the correct trust model.</w:t>
+      </w:r>
+    </w:p>
+    <w:p>
+      <w:pPr>
+        <w:pStyle w:val="ListParagraph"/>
+        <w:numPr>
+          <w:ilvl w:val="0"/>
+          <w:numId w:val="2"/>
+        </w:numPr>
+        <w:spacing w:after="30" w:before="30"/>
+      </w:pPr>
+      <w:r>
+        <w:rPr>
+          <w:rFonts w:ascii="Calibri" w:cs="Calibri" w:eastAsia="Calibri" w:hAnsi="Calibri"/>
+          <w:color w:val="37474F"/>
+          <w:sz w:val="20"/>
+          <w:szCs w:val="20"/>
+        </w:rPr>
+        <w:t xml:space="preserve">SPIFFE/SPIRE: use SPIFFE (Secure Production Identity Framework For Everyone) as the identity standard. Every workload gets a SPIFFE Verifiable Identity Document (SVID) tied to its deployment identity, not its network address.</w:t>
+      </w:r>
+    </w:p>
+    <w:p>
+      <w:pPr>
+        <w:pStyle w:val="ListParagraph"/>
+        <w:numPr>
+          <w:ilvl w:val="0"/>
+          <w:numId w:val="2"/>
+        </w:numPr>
+        <w:spacing w:after="30" w:before="30"/>
+      </w:pPr>
+      <w:r>
+        <w:rPr>
+          <w:rFonts w:ascii="Calibri" w:cs="Calibri" w:eastAsia="Calibri" w:hAnsi="Calibri"/>
+          <w:color w:val="37474F"/>
+          <w:sz w:val="20"/>
+          <w:szCs w:val="20"/>
+        </w:rPr>
+        <w:t xml:space="preserve">Service mesh: deploy Istio or Linkerd with strict mTLS mode. All pod-to-pod communication must be encrypted and mutually authenticated. Permissive mode is a migration tool only — never leave in production.</w:t>
+      </w:r>
+    </w:p>
+    <w:p>
+      <w:pPr>
+        <w:pStyle w:val="ListParagraph"/>
+        <w:numPr>
+          <w:ilvl w:val="0"/>
+          <w:numId w:val="2"/>
+        </w:numPr>
+        <w:spacing w:after="30" w:before="30"/>
+      </w:pPr>
+      <w:r>
+        <w:rPr>
+          <w:rFonts w:ascii="Calibri" w:cs="Calibri" w:eastAsia="Calibri" w:hAnsi="Calibri"/>
+          <w:color w:val="37474F"/>
+          <w:sz w:val="20"/>
+          <w:szCs w:val="20"/>
+        </w:rPr>
+        <w:t xml:space="preserve">Authorization policy: define Istio AuthorizationPolicy or Linkerd ServiceProfile resources for every service. Specify allowed source principals, HTTP methods, and paths. Default-deny for all unspecified paths.</w:t>
+      </w:r>
+    </w:p>
+    <w:p>
+      <w:pPr>
+        <w:pStyle w:val="ListParagraph"/>
+        <w:numPr>
+          <w:ilvl w:val="0"/>
+          <w:numId w:val="2"/>
+        </w:numPr>
+        <w:spacing w:after="30" w:before="30"/>
+      </w:pPr>
+      <w:r>
+        <w:rPr>
+          <w:rFonts w:ascii="Calibri" w:cs="Calibri" w:eastAsia="Calibri" w:hAnsi="Calibri"/>
+          <w:color w:val="37474F"/>
+          <w:sz w:val="20"/>
+          <w:szCs w:val="20"/>
+        </w:rPr>
+        <w:t xml:space="preserve">Egress control: route all outbound traffic through a dedicated egress gateway. No direct internet egress from application pods. Apply egress AuthorizationPolicy to restrict destination hosts.</w:t>
+      </w:r>
+    </w:p>
+    <w:p>
+      <w:pPr>
+        <w:pStyle w:val="ListParagraph"/>
+        <w:numPr>
+          <w:ilvl w:val="0"/>
+          <w:numId w:val="2"/>
+        </w:numPr>
+        <w:spacing w:after="30" w:before="30"/>
+      </w:pPr>
+      <w:r>
+        <w:rPr>
+          <w:rFonts w:ascii="Calibri" w:cs="Calibri" w:eastAsia="Calibri" w:hAnsi="Calibri"/>
+          <w:color w:val="37474F"/>
+          <w:sz w:val="20"/>
+          <w:szCs w:val="20"/>
+        </w:rPr>
+        <w:t xml:space="preserve">Readiness assessment: service mesh adds control-plane reliability requirements, certificate rotation complexity, and observability overhead. Assess team readiness before mandating mesh adoption. Phased rollout starting with highest-risk namespaces is appropriate.</w:t>
       </w:r>
     </w:p>
     <w:p>
@@ -7712,102 +7749,120 @@
           <w:sz w:val="26"/>
           <w:szCs w:val="26"/>
         </w:rPr>
-        <w:t xml:space="preserve">5.3 Private Cross-Cloud Connectivity</w:t>
-      </w:r>
-    </w:p>
-    <w:p>
-      <w:pPr>
-        <w:pStyle w:val="ListParagraph"/>
-        <w:numPr>
-          <w:ilvl w:val="0"/>
-          <w:numId w:val="2"/>
-        </w:numPr>
-        <w:spacing w:after="30" w:before="30"/>
-      </w:pPr>
-      <w:r>
-        <w:rPr>
-          <w:rFonts w:ascii="Calibri" w:cs="Calibri" w:eastAsia="Calibri" w:hAnsi="Calibri"/>
-          <w:color w:val="37474F"/>
-          <w:sz w:val="20"/>
-          <w:szCs w:val="20"/>
-        </w:rPr>
-        <w:t xml:space="preserve">AWS ↔ Azure: Azure ExpressRoute + AWS Direct Connect via transit provider (Equinix). Or Aviatrix multi-cloud networking for BGP-based routing.</w:t>
-      </w:r>
-    </w:p>
-    <w:p>
-      <w:pPr>
-        <w:pStyle w:val="ListParagraph"/>
-        <w:numPr>
-          <w:ilvl w:val="0"/>
-          <w:numId w:val="2"/>
-        </w:numPr>
-        <w:spacing w:after="30" w:before="30"/>
-      </w:pPr>
-      <w:r>
-        <w:rPr>
-          <w:rFonts w:ascii="Calibri" w:cs="Calibri" w:eastAsia="Calibri" w:hAnsi="Calibri"/>
-          <w:color w:val="37474F"/>
-          <w:sz w:val="20"/>
-          <w:szCs w:val="20"/>
-        </w:rPr>
-        <w:t xml:space="preserve">AWS ↔ GCP: Partner Interconnect + Direct Connect via carrier. No site-to-site VPN over public internet for production traffic.</w:t>
-      </w:r>
-    </w:p>
-    <w:p>
-      <w:pPr>
-        <w:pStyle w:val="ListParagraph"/>
-        <w:numPr>
-          <w:ilvl w:val="0"/>
-          <w:numId w:val="2"/>
-        </w:numPr>
-        <w:spacing w:after="30" w:before="30"/>
-      </w:pPr>
-      <w:r>
-        <w:rPr>
-          <w:rFonts w:ascii="Calibri" w:cs="Calibri" w:eastAsia="Calibri" w:hAnsi="Calibri"/>
-          <w:color w:val="37474F"/>
-          <w:sz w:val="20"/>
-          <w:szCs w:val="20"/>
-        </w:rPr>
-        <w:t xml:space="preserve">GCP ↔ Azure: Azure ExpressRoute + GCP Dedicated Interconnect via co-location facility.</w:t>
-      </w:r>
-    </w:p>
-    <w:p>
-      <w:pPr>
-        <w:pStyle w:val="ListParagraph"/>
-        <w:numPr>
-          <w:ilvl w:val="0"/>
-          <w:numId w:val="2"/>
-        </w:numPr>
-        <w:spacing w:after="30" w:before="30"/>
-      </w:pPr>
-      <w:r>
-        <w:rPr>
-          <w:rFonts w:ascii="Calibri" w:cs="Calibri" w:eastAsia="Calibri" w:hAnsi="Calibri"/>
-          <w:color w:val="37474F"/>
-          <w:sz w:val="20"/>
-          <w:szCs w:val="20"/>
-        </w:rPr>
-        <w:t xml:space="preserve">Zero trust overlay: Aviatrix or Illumio for microsegmentation and encrypted east-west traffic across cloud boundaries.</w:t>
-      </w:r>
-    </w:p>
-    <w:p>
-      <w:pPr>
-        <w:pStyle w:val="ListParagraph"/>
-        <w:numPr>
-          <w:ilvl w:val="0"/>
-          <w:numId w:val="2"/>
-        </w:numPr>
-        <w:spacing w:after="30" w:before="30"/>
-      </w:pPr>
-      <w:r>
-        <w:rPr>
-          <w:rFonts w:ascii="Calibri" w:cs="Calibri" w:eastAsia="Calibri" w:hAnsi="Calibri"/>
-          <w:color w:val="37474F"/>
-          <w:sz w:val="20"/>
-          <w:szCs w:val="20"/>
-        </w:rPr>
-        <w:t xml:space="preserve">DNS: centralized private DNS resolution with forwarding zones per provider. No public DNS for internal service communication.</w:t>
+        <w:t xml:space="preserve">5.3 Dynamic Secrets Architecture</w:t>
+      </w:r>
+    </w:p>
+    <w:p>
+      <w:pPr>
+        <w:spacing w:after="100" w:before="60"/>
+      </w:pPr>
+      <w:r>
+        <w:rPr>
+          <w:rFonts w:ascii="Calibri" w:cs="Calibri" w:eastAsia="Calibri" w:hAnsi="Calibri"/>
+          <w:b w:val="false"/>
+          <w:bCs w:val="false"/>
+          <w:i w:val="false"/>
+          <w:iCs w:val="false"/>
+          <w:color w:val="37474F"/>
+          <w:sz w:val="22"/>
+          <w:szCs w:val="22"/>
+        </w:rPr>
+        <w:t xml:space="preserve">Static secrets — database passwords, API keys, TLS certificates — are a perennial source of breaches. They are shared, rotated infrequently, and accumulate in configuration files, environment variables, and CI/CD pipelines. The correct architecture generates short-lived, scoped credentials on demand and delivers them to workloads without persisting them.</w:t>
+      </w:r>
+    </w:p>
+    <w:p>
+      <w:pPr>
+        <w:pStyle w:val="ListParagraph"/>
+        <w:numPr>
+          <w:ilvl w:val="0"/>
+          <w:numId w:val="2"/>
+        </w:numPr>
+        <w:spacing w:after="30" w:before="30"/>
+      </w:pPr>
+      <w:r>
+        <w:rPr>
+          <w:rFonts w:ascii="Calibri" w:cs="Calibri" w:eastAsia="Calibri" w:hAnsi="Calibri"/>
+          <w:color w:val="37474F"/>
+          <w:sz w:val="20"/>
+          <w:szCs w:val="20"/>
+        </w:rPr>
+        <w:t xml:space="preserve">HashiCorp Vault: deploy Vault with cloud-native auto-unseal (AWS KMS, Azure Key Vault, GCP KMS). Use Vault dynamic secrets engines: database (Postgres, MySQL, MSSQL), AWS IAM, Azure, GCP, PKI, and SSH.</w:t>
+      </w:r>
+    </w:p>
+    <w:p>
+      <w:pPr>
+        <w:pStyle w:val="ListParagraph"/>
+        <w:numPr>
+          <w:ilvl w:val="0"/>
+          <w:numId w:val="2"/>
+        </w:numPr>
+        <w:spacing w:after="30" w:before="30"/>
+      </w:pPr>
+      <w:r>
+        <w:rPr>
+          <w:rFonts w:ascii="Calibri" w:cs="Calibri" w:eastAsia="Calibri" w:hAnsi="Calibri"/>
+          <w:color w:val="37474F"/>
+          <w:sz w:val="20"/>
+          <w:szCs w:val="20"/>
+        </w:rPr>
+        <w:t xml:space="preserve">Vault Agent / VSO: use Vault Agent sidecar or the Vault Secrets Operator (Kubernetes) to inject secrets into pods as files or environment variables at startup. Never pass secrets via image environment variables baked at build time.</w:t>
+      </w:r>
+    </w:p>
+    <w:p>
+      <w:pPr>
+        <w:pStyle w:val="ListParagraph"/>
+        <w:numPr>
+          <w:ilvl w:val="0"/>
+          <w:numId w:val="2"/>
+        </w:numPr>
+        <w:spacing w:after="30" w:before="30"/>
+      </w:pPr>
+      <w:r>
+        <w:rPr>
+          <w:rFonts w:ascii="Calibri" w:cs="Calibri" w:eastAsia="Calibri" w:hAnsi="Calibri"/>
+          <w:color w:val="37474F"/>
+          <w:sz w:val="20"/>
+          <w:szCs w:val="20"/>
+        </w:rPr>
+        <w:t xml:space="preserve">Short TTLs: database credentials should have TTLs of 1–24 hours. PKI certificates for internal services: 24–72 hours. Rotate automatically — no human intervention in the steady state.</w:t>
+      </w:r>
+    </w:p>
+    <w:p>
+      <w:pPr>
+        <w:pStyle w:val="ListParagraph"/>
+        <w:numPr>
+          <w:ilvl w:val="0"/>
+          <w:numId w:val="2"/>
+        </w:numPr>
+        <w:spacing w:after="30" w:before="30"/>
+      </w:pPr>
+      <w:r>
+        <w:rPr>
+          <w:rFonts w:ascii="Calibri" w:cs="Calibri" w:eastAsia="Calibri" w:hAnsi="Calibri"/>
+          <w:color w:val="37474F"/>
+          <w:sz w:val="20"/>
+          <w:szCs w:val="20"/>
+        </w:rPr>
+        <w:t xml:space="preserve">Cloud-native alternatives: AWS Secrets Manager with automatic rotation, Azure Key Vault with rotation policies, GCP Secret Manager with version pinning. Use Vault for cross-cloud unification; use cloud-native for cloud-specific workloads where Vault is unavailable.</w:t>
+      </w:r>
+    </w:p>
+    <w:p>
+      <w:pPr>
+        <w:pStyle w:val="ListParagraph"/>
+        <w:numPr>
+          <w:ilvl w:val="0"/>
+          <w:numId w:val="2"/>
+        </w:numPr>
+        <w:spacing w:after="30" w:before="30"/>
+      </w:pPr>
+      <w:r>
+        <w:rPr>
+          <w:rFonts w:ascii="Calibri" w:cs="Calibri" w:eastAsia="Calibri" w:hAnsi="Calibri"/>
+          <w:color w:val="37474F"/>
+          <w:sz w:val="20"/>
+          <w:szCs w:val="20"/>
+        </w:rPr>
+        <w:t xml:space="preserve">Audit: all secret accesses must be logged with principal identity, secret path, and timestamp. Use Vault audit log or cloud-native audit trails. Alert on unexpected secret access patterns.</w:t>
       </w:r>
     </w:p>
     <w:p>
@@ -7828,7 +7883,1150 @@
           <w:sz w:val="26"/>
           <w:szCs w:val="26"/>
         </w:rPr>
-        <w:t xml:space="preserve">5.4 Multi-Cloud Security Operations Stack</w:t>
+        <w:t xml:space="preserve">5.4 Data Security Posture Management (DSPM)</w:t>
+      </w:r>
+    </w:p>
+    <w:p>
+      <w:pPr>
+        <w:spacing w:after="100" w:before="60"/>
+      </w:pPr>
+      <w:r>
+        <w:rPr>
+          <w:rFonts w:ascii="Calibri" w:cs="Calibri" w:eastAsia="Calibri" w:hAnsi="Calibri"/>
+          <w:b w:val="false"/>
+          <w:bCs w:val="false"/>
+          <w:i w:val="false"/>
+          <w:iCs w:val="false"/>
+          <w:color w:val="37474F"/>
+          <w:sz w:val="22"/>
+          <w:szCs w:val="22"/>
+        </w:rPr>
+        <w:t xml:space="preserve">Data sprawl across cloud storage — S3, Azure Blob, GCS, RDS, BigQuery, Snowflake — creates an enormous and largely unmapped sensitive-data footprint. DSPM tools continuously discover, classify, and monitor this footprint, providing the data-layer visibility that CSPM misses.</w:t>
+      </w:r>
+    </w:p>
+    <w:p>
+      <w:pPr>
+        <w:pStyle w:val="ListParagraph"/>
+        <w:numPr>
+          <w:ilvl w:val="0"/>
+          <w:numId w:val="2"/>
+        </w:numPr>
+        <w:spacing w:after="30" w:before="30"/>
+      </w:pPr>
+      <w:r>
+        <w:rPr>
+          <w:rFonts w:ascii="Calibri" w:cs="Calibri" w:eastAsia="Calibri" w:hAnsi="Calibri"/>
+          <w:color w:val="37474F"/>
+          <w:sz w:val="20"/>
+          <w:szCs w:val="20"/>
+        </w:rPr>
+        <w:t xml:space="preserve">Discover: automated, continuous scanning of all cloud storage and database services to build a data inventory. Include structured (databases, data warehouses) and unstructured (object storage, file shares) storage.</w:t>
+      </w:r>
+    </w:p>
+    <w:p>
+      <w:pPr>
+        <w:pStyle w:val="ListParagraph"/>
+        <w:numPr>
+          <w:ilvl w:val="0"/>
+          <w:numId w:val="2"/>
+        </w:numPr>
+        <w:spacing w:after="30" w:before="30"/>
+      </w:pPr>
+      <w:r>
+        <w:rPr>
+          <w:rFonts w:ascii="Calibri" w:cs="Calibri" w:eastAsia="Calibri" w:hAnsi="Calibri"/>
+          <w:color w:val="37474F"/>
+          <w:sz w:val="20"/>
+          <w:szCs w:val="20"/>
+        </w:rPr>
+        <w:t xml:space="preserve">Classify: apply classification labels (PII, PHI, PCI, confidential, internal, public) using regex, ML classifiers, and custom patterns. Map classifications to regulatory obligations (GDPR, HIPAA, PCI-DSS).</w:t>
+      </w:r>
+    </w:p>
+    <w:p>
+      <w:pPr>
+        <w:pStyle w:val="ListParagraph"/>
+        <w:numPr>
+          <w:ilvl w:val="0"/>
+          <w:numId w:val="2"/>
+        </w:numPr>
+        <w:spacing w:after="30" w:before="30"/>
+      </w:pPr>
+      <w:r>
+        <w:rPr>
+          <w:rFonts w:ascii="Calibri" w:cs="Calibri" w:eastAsia="Calibri" w:hAnsi="Calibri"/>
+          <w:color w:val="37474F"/>
+          <w:sz w:val="20"/>
+          <w:szCs w:val="20"/>
+        </w:rPr>
+        <w:t xml:space="preserve">Monitor: alert on data flows that violate classification policies — PII in non-encrypted storage, PHI accessible from non-production accounts, confidential data in public buckets.</w:t>
+      </w:r>
+    </w:p>
+    <w:p>
+      <w:pPr>
+        <w:pStyle w:val="ListParagraph"/>
+        <w:numPr>
+          <w:ilvl w:val="0"/>
+          <w:numId w:val="2"/>
+        </w:numPr>
+        <w:spacing w:after="30" w:before="30"/>
+      </w:pPr>
+      <w:r>
+        <w:rPr>
+          <w:rFonts w:ascii="Calibri" w:cs="Calibri" w:eastAsia="Calibri" w:hAnsi="Calibri"/>
+          <w:color w:val="37474F"/>
+          <w:sz w:val="20"/>
+          <w:szCs w:val="20"/>
+        </w:rPr>
+        <w:t xml:space="preserve">Tooling: Wiz DSPM, Varonis, Cyera, BigID, or Microsoft Purview (Azure-native). Integrate DSPM findings into the central CSPM dashboard for unified risk view.</w:t>
+      </w:r>
+    </w:p>
+    <w:p>
+      <w:pPr>
+        <w:pStyle w:val="ListParagraph"/>
+        <w:numPr>
+          <w:ilvl w:val="0"/>
+          <w:numId w:val="2"/>
+        </w:numPr>
+        <w:spacing w:after="30" w:before="30"/>
+      </w:pPr>
+      <w:r>
+        <w:rPr>
+          <w:rFonts w:ascii="Calibri" w:cs="Calibri" w:eastAsia="Calibri" w:hAnsi="Calibri"/>
+          <w:color w:val="37474F"/>
+          <w:sz w:val="20"/>
+          <w:szCs w:val="20"/>
+        </w:rPr>
+        <w:t xml:space="preserve">Remediation: DSPM findings must trigger a defined remediation workflow: owner notification, 30-day SLA for critical findings (public PII), 90-day SLA for high findings. Track remediation rate as a security KPI.</w:t>
+      </w:r>
+    </w:p>
+    <w:p>
+      <w:r>
+        <w:t xml:space="preserve"/>
+      </w:r>
+    </w:p>
+    <w:p>
+      <w:pPr>
+        <w:pStyle w:val="Heading2"/>
+      </w:pPr>
+      <w:r>
+        <w:rPr>
+          <w:rFonts w:ascii="Arial" w:cs="Arial" w:eastAsia="Arial" w:hAnsi="Arial"/>
+          <w:b/>
+          <w:bCs/>
+          <w:color w:val="1565C0"/>
+          <w:sz w:val="26"/>
+          <w:szCs w:val="26"/>
+        </w:rPr>
+        <w:t xml:space="preserve">5.5 Runtime Threat Detection</w:t>
+      </w:r>
+    </w:p>
+    <w:p>
+      <w:pPr>
+        <w:spacing w:after="100" w:before="60"/>
+      </w:pPr>
+      <w:r>
+        <w:rPr>
+          <w:rFonts w:ascii="Calibri" w:cs="Calibri" w:eastAsia="Calibri" w:hAnsi="Calibri"/>
+          <w:b w:val="false"/>
+          <w:bCs w:val="false"/>
+          <w:i w:val="false"/>
+          <w:iCs w:val="false"/>
+          <w:color w:val="37474F"/>
+          <w:sz w:val="22"/>
+          <w:szCs w:val="22"/>
+        </w:rPr>
+        <w:t xml:space="preserve">Static controls (IAM policies, network rules, image scanning) prevent known-bad configurations. Runtime detection catches attackers operating within the bounds of what was initially permitted — through compromised workloads, stolen credentials, or novel attack paths not yet encoded in policy.</w:t>
+      </w:r>
+    </w:p>
+    <w:p>
+      <w:pPr>
+        <w:pStyle w:val="ListParagraph"/>
+        <w:numPr>
+          <w:ilvl w:val="0"/>
+          <w:numId w:val="2"/>
+        </w:numPr>
+        <w:spacing w:after="30" w:before="30"/>
+      </w:pPr>
+      <w:r>
+        <w:rPr>
+          <w:rFonts w:ascii="Calibri" w:cs="Calibri" w:eastAsia="Calibri" w:hAnsi="Calibri"/>
+          <w:color w:val="37474F"/>
+          <w:sz w:val="20"/>
+          <w:szCs w:val="20"/>
+        </w:rPr>
+        <w:t xml:space="preserve">Log-based detection: cloud provider security services (AWS GuardDuty, Azure Defender for Cloud, GCP Threat Intelligence) analyze control-plane API logs for anomalous patterns — credential exfiltration, unusual cross-region activity, API calls from Tor exit nodes.</w:t>
+      </w:r>
+    </w:p>
+    <w:p>
+      <w:pPr>
+        <w:pStyle w:val="ListParagraph"/>
+        <w:numPr>
+          <w:ilvl w:val="0"/>
+          <w:numId w:val="2"/>
+        </w:numPr>
+        <w:spacing w:after="30" w:before="30"/>
+      </w:pPr>
+      <w:r>
+        <w:rPr>
+          <w:rFonts w:ascii="Calibri" w:cs="Calibri" w:eastAsia="Calibri" w:hAnsi="Calibri"/>
+          <w:color w:val="37474F"/>
+          <w:sz w:val="20"/>
+          <w:szCs w:val="20"/>
+        </w:rPr>
+        <w:t xml:space="preserve">Kernel-level detection: Falco (CNCF) provides real-time syscall inspection for containers. Rules detect: container escape attempts, shell spawning in production pods, unexpected binary execution, sensitive file reads (/etc/shadow, cloud credential files).</w:t>
+      </w:r>
+    </w:p>
+    <w:p>
+      <w:pPr>
+        <w:pStyle w:val="ListParagraph"/>
+        <w:numPr>
+          <w:ilvl w:val="0"/>
+          <w:numId w:val="2"/>
+        </w:numPr>
+        <w:spacing w:after="30" w:before="30"/>
+      </w:pPr>
+      <w:r>
+        <w:rPr>
+          <w:rFonts w:ascii="Calibri" w:cs="Calibri" w:eastAsia="Calibri" w:hAnsi="Calibri"/>
+          <w:color w:val="37474F"/>
+          <w:sz w:val="20"/>
+          <w:szCs w:val="20"/>
+        </w:rPr>
+        <w:t xml:space="preserve">UEBA: User and Entity Behavior Analytics identifies deviations from established behavioral baselines — a service account that suddenly calls List/Get across all S3 buckets, or a principal logging in from an anomalous geography.</w:t>
+      </w:r>
+    </w:p>
+    <w:p>
+      <w:pPr>
+        <w:pStyle w:val="ListParagraph"/>
+        <w:numPr>
+          <w:ilvl w:val="0"/>
+          <w:numId w:val="2"/>
+        </w:numPr>
+        <w:spacing w:after="30" w:before="30"/>
+      </w:pPr>
+      <w:r>
+        <w:rPr>
+          <w:rFonts w:ascii="Calibri" w:cs="Calibri" w:eastAsia="Calibri" w:hAnsi="Calibri"/>
+          <w:color w:val="37474F"/>
+          <w:sz w:val="20"/>
+          <w:szCs w:val="20"/>
+        </w:rPr>
+        <w:t xml:space="preserve">Alert fidelity: tune detection rules to reduce false positive rate below 5% for critical alerts. High false-positive rates cause alert fatigue and missed real incidents. Maintain tuning log with rationale for each suppression.</w:t>
+      </w:r>
+    </w:p>
+    <w:p>
+      <w:pPr>
+        <w:pStyle w:val="ListParagraph"/>
+        <w:numPr>
+          <w:ilvl w:val="0"/>
+          <w:numId w:val="2"/>
+        </w:numPr>
+        <w:spacing w:after="30" w:before="30"/>
+      </w:pPr>
+      <w:r>
+        <w:rPr>
+          <w:rFonts w:ascii="Calibri" w:cs="Calibri" w:eastAsia="Calibri" w:hAnsi="Calibri"/>
+          <w:color w:val="37474F"/>
+          <w:sz w:val="20"/>
+          <w:szCs w:val="20"/>
+        </w:rPr>
+        <w:t xml:space="preserve">Response automation: wire GuardDuty/Defender/SCC findings to SOAR playbooks for automated response: isolate compromised instance, revoke credentials, snapshot disk for forensics. Human review required before permanent action.</w:t>
+      </w:r>
+    </w:p>
+    <w:p>
+      <w:r>
+        <w:t xml:space="preserve"/>
+      </w:r>
+    </w:p>
+    <w:p>
+      <w:pPr>
+        <w:pStyle w:val="Heading2"/>
+      </w:pPr>
+      <w:r>
+        <w:rPr>
+          <w:rFonts w:ascii="Arial" w:cs="Arial" w:eastAsia="Arial" w:hAnsi="Arial"/>
+          <w:b/>
+          <w:bCs/>
+          <w:color w:val="1565C0"/>
+          <w:sz w:val="26"/>
+          <w:szCs w:val="26"/>
+        </w:rPr>
+        <w:t xml:space="preserve">5.6 Software Supply Chain Security</w:t>
+      </w:r>
+    </w:p>
+    <w:p>
+      <w:pPr>
+        <w:spacing w:after="100" w:before="60"/>
+      </w:pPr>
+      <w:r>
+        <w:rPr>
+          <w:rFonts w:ascii="Calibri" w:cs="Calibri" w:eastAsia="Calibri" w:hAnsi="Calibri"/>
+          <w:b w:val="false"/>
+          <w:bCs w:val="false"/>
+          <w:i w:val="false"/>
+          <w:iCs w:val="false"/>
+          <w:color w:val="37474F"/>
+          <w:sz w:val="22"/>
+          <w:szCs w:val="22"/>
+        </w:rPr>
+        <w:t xml:space="preserve">The supply chain attack surface spans source code, dependencies, build pipelines, container registries, and deployment infrastructure. Compromise at any stage propagates to production. A defense-in-depth supply chain strategy addresses each stage independently.</w:t>
+      </w:r>
+    </w:p>
+    <w:p>
+      <w:pPr>
+        <w:pStyle w:val="ListParagraph"/>
+        <w:numPr>
+          <w:ilvl w:val="0"/>
+          <w:numId w:val="2"/>
+        </w:numPr>
+        <w:spacing w:after="30" w:before="30"/>
+      </w:pPr>
+      <w:r>
+        <w:rPr>
+          <w:rFonts w:ascii="Calibri" w:cs="Calibri" w:eastAsia="Calibri" w:hAnsi="Calibri"/>
+          <w:color w:val="37474F"/>
+          <w:sz w:val="20"/>
+          <w:szCs w:val="20"/>
+        </w:rPr>
+        <w:t xml:space="preserve">Source integrity: branch protection on all production branches (required PR reviews, signed commits via Gitleaks or GPG, no force-push). Secrets scanning pre-commit (git-secrets, Gitleaks) and in CI.</w:t>
+      </w:r>
+    </w:p>
+    <w:p>
+      <w:pPr>
+        <w:pStyle w:val="ListParagraph"/>
+        <w:numPr>
+          <w:ilvl w:val="0"/>
+          <w:numId w:val="2"/>
+        </w:numPr>
+        <w:spacing w:after="30" w:before="30"/>
+      </w:pPr>
+      <w:r>
+        <w:rPr>
+          <w:rFonts w:ascii="Calibri" w:cs="Calibri" w:eastAsia="Calibri" w:hAnsi="Calibri"/>
+          <w:color w:val="37474F"/>
+          <w:sz w:val="20"/>
+          <w:szCs w:val="20"/>
+        </w:rPr>
+        <w:t xml:space="preserve">Dependency management: software composition analysis (SCA) on every pull request — Snyk, Dependabot, or OWASP Dependency-Check. Block merge on critical CVEs. Pin dependency versions and review dependency updates via automated PRs.</w:t>
+      </w:r>
+    </w:p>
+    <w:p>
+      <w:pPr>
+        <w:pStyle w:val="ListParagraph"/>
+        <w:numPr>
+          <w:ilvl w:val="0"/>
+          <w:numId w:val="2"/>
+        </w:numPr>
+        <w:spacing w:after="30" w:before="30"/>
+      </w:pPr>
+      <w:r>
+        <w:rPr>
+          <w:rFonts w:ascii="Calibri" w:cs="Calibri" w:eastAsia="Calibri" w:hAnsi="Calibri"/>
+          <w:color w:val="37474F"/>
+          <w:sz w:val="20"/>
+          <w:szCs w:val="20"/>
+        </w:rPr>
+        <w:t xml:space="preserve">Build pipeline hardening: CI/CD runners must be ephemeral (no persistent state between builds). Secrets injected via OIDC token exchange, not static secrets. Builds must be hermetic and reproducible. Sign all build artifacts.</w:t>
+      </w:r>
+    </w:p>
+    <w:p>
+      <w:pPr>
+        <w:pStyle w:val="ListParagraph"/>
+        <w:numPr>
+          <w:ilvl w:val="0"/>
+          <w:numId w:val="2"/>
+        </w:numPr>
+        <w:spacing w:after="30" w:before="30"/>
+      </w:pPr>
+      <w:r>
+        <w:rPr>
+          <w:rFonts w:ascii="Calibri" w:cs="Calibri" w:eastAsia="Calibri" w:hAnsi="Calibri"/>
+          <w:color w:val="37474F"/>
+          <w:sz w:val="20"/>
+          <w:szCs w:val="20"/>
+        </w:rPr>
+        <w:t xml:space="preserve">Artifact signing and verification: sign container images and binaries with Sigstore/Cosign using OIDC-based keyless signing. Verify signatures at deploy time via admission controller (Kyverno, Gatekeeper, or OPA). Reject unsigned or unverified images.</w:t>
+      </w:r>
+    </w:p>
+    <w:p>
+      <w:pPr>
+        <w:pStyle w:val="ListParagraph"/>
+        <w:numPr>
+          <w:ilvl w:val="0"/>
+          <w:numId w:val="2"/>
+        </w:numPr>
+        <w:spacing w:after="30" w:before="30"/>
+      </w:pPr>
+      <w:r>
+        <w:rPr>
+          <w:rFonts w:ascii="Calibri" w:cs="Calibri" w:eastAsia="Calibri" w:hAnsi="Calibri"/>
+          <w:color w:val="37474F"/>
+          <w:sz w:val="20"/>
+          <w:szCs w:val="20"/>
+        </w:rPr>
+        <w:t xml:space="preserve">SBOM: generate a Software Bill of Materials (SBOM) in CycloneDX or SPDX format for every production build. Ingest SBOMs into a vulnerability management platform for continuous monitoring against new CVEs.</w:t>
+      </w:r>
+    </w:p>
+    <w:p>
+      <w:pPr>
+        <w:pStyle w:val="ListParagraph"/>
+        <w:numPr>
+          <w:ilvl w:val="0"/>
+          <w:numId w:val="2"/>
+        </w:numPr>
+        <w:spacing w:after="30" w:before="30"/>
+      </w:pPr>
+      <w:r>
+        <w:rPr>
+          <w:rFonts w:ascii="Calibri" w:cs="Calibri" w:eastAsia="Calibri" w:hAnsi="Calibri"/>
+          <w:color w:val="37474F"/>
+          <w:sz w:val="20"/>
+          <w:szCs w:val="20"/>
+        </w:rPr>
+        <w:t xml:space="preserve">SLSA Framework: target SLSA Level 3 for all production services. Level 3 requires: version-controlled build definitions, isolated build environment, signed provenance, and two-party review. SLSA Level 1 (any provenance) is the minimum acceptable baseline.</w:t>
+      </w:r>
+    </w:p>
+    <w:p>
+      <w:r>
+        <w:t xml:space="preserve"/>
+      </w:r>
+    </w:p>
+    <w:p>
+      <w:pPr>
+        <w:pStyle w:val="Heading2"/>
+      </w:pPr>
+      <w:r>
+        <w:rPr>
+          <w:rFonts w:ascii="Arial" w:cs="Arial" w:eastAsia="Arial" w:hAnsi="Arial"/>
+          <w:b/>
+          <w:bCs/>
+          <w:color w:val="1565C0"/>
+          <w:sz w:val="26"/>
+          <w:szCs w:val="26"/>
+        </w:rPr>
+        <w:t xml:space="preserve">5.7 Centralized Identity and Logging Architecture</w:t>
+      </w:r>
+    </w:p>
+    <w:p>
+      <w:pPr>
+        <w:spacing w:after="100" w:before="60"/>
+      </w:pPr>
+      <w:r>
+        <w:rPr>
+          <w:rFonts w:ascii="Calibri" w:cs="Calibri" w:eastAsia="Calibri" w:hAnsi="Calibri"/>
+          <w:b w:val="false"/>
+          <w:bCs w:val="false"/>
+          <w:i w:val="false"/>
+          <w:iCs w:val="false"/>
+          <w:color w:val="37474F"/>
+          <w:sz w:val="22"/>
+          <w:szCs w:val="22"/>
+        </w:rPr>
+        <w:t xml:space="preserve">Effective security operations depend on a consistent identity plane and a complete, tamper-evident log record spanning all cloud providers. Fragmented identity and siloed logs are the two most common reasons that incidents go undetected or uninvestigated.</w:t>
+      </w:r>
+    </w:p>
+    <w:p>
+      <w:pPr>
+        <w:pStyle w:val="Heading3"/>
+      </w:pPr>
+      <w:r>
+        <w:rPr>
+          <w:rFonts w:ascii="Arial" w:cs="Arial" w:eastAsia="Arial" w:hAnsi="Arial"/>
+          <w:b/>
+          <w:bCs/>
+          <w:color w:val="37474F"/>
+          <w:sz w:val="22"/>
+          <w:szCs w:val="22"/>
+        </w:rPr>
+        <w:t xml:space="preserve">Identity Federation Architecture</w:t>
+      </w:r>
+    </w:p>
+    <w:p>
+      <w:pPr>
+        <w:spacing w:after="100" w:before="60"/>
+      </w:pPr>
+      <w:r>
+        <w:rPr>
+          <w:rFonts w:ascii="Calibri" w:cs="Calibri" w:eastAsia="Calibri" w:hAnsi="Calibri"/>
+          <w:b w:val="false"/>
+          <w:bCs w:val="false"/>
+          <w:i w:val="false"/>
+          <w:iCs w:val="false"/>
+          <w:color w:val="37474F"/>
+          <w:sz w:val="22"/>
+          <w:szCs w:val="22"/>
+        </w:rPr>
+        <w:t xml:space="preserve">A single authoritative Identity Provider (IdP) must federate to all cloud IAM systems. This eliminates per-cloud identity silos, enforces consistent authentication policy, and provides a unified audit trail for all human and workload access.</w:t>
+      </w:r>
+    </w:p>
+    <w:p>
+      <w:pPr>
+        <w:pStyle w:val="ListParagraph"/>
+        <w:numPr>
+          <w:ilvl w:val="0"/>
+          <w:numId w:val="2"/>
+        </w:numPr>
+        <w:spacing w:after="30" w:before="30"/>
+      </w:pPr>
+      <w:r>
+        <w:rPr>
+          <w:rFonts w:ascii="Calibri" w:cs="Calibri" w:eastAsia="Calibri" w:hAnsi="Calibri"/>
+          <w:color w:val="37474F"/>
+          <w:sz w:val="20"/>
+          <w:szCs w:val="20"/>
+        </w:rPr>
+        <w:t xml:space="preserve">Central IdP: Microsoft Entra ID or Okta serves as the authoritative identity store. All human identities are provisioned and deprovisioned through the IdP. SCIM 2.0 provisioning to all cloud directories.</w:t>
+      </w:r>
+    </w:p>
+    <w:p>
+      <w:pPr>
+        <w:pStyle w:val="ListParagraph"/>
+        <w:numPr>
+          <w:ilvl w:val="0"/>
+          <w:numId w:val="2"/>
+        </w:numPr>
+        <w:spacing w:after="30" w:before="30"/>
+      </w:pPr>
+      <w:r>
+        <w:rPr>
+          <w:rFonts w:ascii="Calibri" w:cs="Calibri" w:eastAsia="Calibri" w:hAnsi="Calibri"/>
+          <w:color w:val="37474F"/>
+          <w:sz w:val="20"/>
+          <w:szCs w:val="20"/>
+        </w:rPr>
+        <w:t xml:space="preserve">AWS federation: SAML 2.0 or OIDC to IAM Identity Center (AWS SSO). Users receive permission sets mapped to IAM roles — no direct IAM user accounts in any AWS account.</w:t>
+      </w:r>
+    </w:p>
+    <w:p>
+      <w:pPr>
+        <w:pStyle w:val="ListParagraph"/>
+        <w:numPr>
+          <w:ilvl w:val="0"/>
+          <w:numId w:val="2"/>
+        </w:numPr>
+        <w:spacing w:after="30" w:before="30"/>
+      </w:pPr>
+      <w:r>
+        <w:rPr>
+          <w:rFonts w:ascii="Calibri" w:cs="Calibri" w:eastAsia="Calibri" w:hAnsi="Calibri"/>
+          <w:color w:val="37474F"/>
+          <w:sz w:val="20"/>
+          <w:szCs w:val="20"/>
+        </w:rPr>
+        <w:t xml:space="preserve">Azure federation: Entra ID is native. All external identities (contractors, partners) must federate through Entra ID B2B — no local Azure AD accounts.</w:t>
+      </w:r>
+    </w:p>
+    <w:p>
+      <w:pPr>
+        <w:pStyle w:val="ListParagraph"/>
+        <w:numPr>
+          <w:ilvl w:val="0"/>
+          <w:numId w:val="2"/>
+        </w:numPr>
+        <w:spacing w:after="30" w:before="30"/>
+      </w:pPr>
+      <w:r>
+        <w:rPr>
+          <w:rFonts w:ascii="Calibri" w:cs="Calibri" w:eastAsia="Calibri" w:hAnsi="Calibri"/>
+          <w:color w:val="37474F"/>
+          <w:sz w:val="20"/>
+          <w:szCs w:val="20"/>
+        </w:rPr>
+        <w:t xml:space="preserve">GCP federation: SAML federation from Entra ID or Okta to Cloud Identity. Cloud Identity handles GCP IAM group membership. Google Workspace for GCP-native teams.</w:t>
+      </w:r>
+    </w:p>
+    <w:p>
+      <w:pPr>
+        <w:pStyle w:val="ListParagraph"/>
+        <w:numPr>
+          <w:ilvl w:val="0"/>
+          <w:numId w:val="2"/>
+        </w:numPr>
+        <w:spacing w:after="30" w:before="30"/>
+      </w:pPr>
+      <w:r>
+        <w:rPr>
+          <w:rFonts w:ascii="Calibri" w:cs="Calibri" w:eastAsia="Calibri" w:hAnsi="Calibri"/>
+          <w:color w:val="37474F"/>
+          <w:sz w:val="20"/>
+          <w:szCs w:val="20"/>
+        </w:rPr>
+        <w:t xml:space="preserve">Workload identity federation: AWS IRSA and EKS Pod Identity, GCP Workload Identity, Azure Managed Identity. Cross-cloud token exchange (AWS STS → GCP STS) for multi-cloud workloads. No static credentials in any cross-cloud integration.</w:t>
+      </w:r>
+    </w:p>
+    <w:p>
+      <w:r>
+        <w:t xml:space="preserve"/>
+      </w:r>
+    </w:p>
+    <w:p>
+      <w:pPr>
+        <w:pStyle w:val="Heading3"/>
+      </w:pPr>
+      <w:r>
+        <w:rPr>
+          <w:rFonts w:ascii="Arial" w:cs="Arial" w:eastAsia="Arial" w:hAnsi="Arial"/>
+          <w:b/>
+          <w:bCs/>
+          <w:color w:val="37474F"/>
+          <w:sz w:val="22"/>
+          <w:szCs w:val="22"/>
+        </w:rPr>
+        <w:t xml:space="preserve">Centralized SIEM and Log Aggregation</w:t>
+      </w:r>
+    </w:p>
+    <w:p>
+      <w:pPr>
+        <w:spacing w:after="100" w:before="60"/>
+      </w:pPr>
+      <w:r>
+        <w:rPr>
+          <w:rFonts w:ascii="Calibri" w:cs="Calibri" w:eastAsia="Calibri" w:hAnsi="Calibri"/>
+          <w:b w:val="false"/>
+          <w:bCs w:val="false"/>
+          <w:i w:val="false"/>
+          <w:iCs w:val="false"/>
+          <w:color w:val="37474F"/>
+          <w:sz w:val="22"/>
+          <w:szCs w:val="22"/>
+        </w:rPr>
+        <w:t xml:space="preserve">All security-relevant logs must flow to a centralized SIEM with defined retention, normalization, and detection rule coverage. Partial log coverage is operationally equivalent to no coverage for the events that are missing.</w:t>
+      </w:r>
+    </w:p>
+    <w:p>
+      <w:pPr>
+        <w:pStyle w:val="ListParagraph"/>
+        <w:numPr>
+          <w:ilvl w:val="0"/>
+          <w:numId w:val="2"/>
+        </w:numPr>
+        <w:spacing w:after="30" w:before="30"/>
+      </w:pPr>
+      <w:r>
+        <w:rPr>
+          <w:rFonts w:ascii="Calibri" w:cs="Calibri" w:eastAsia="Calibri" w:hAnsi="Calibri"/>
+          <w:color w:val="37474F"/>
+          <w:sz w:val="20"/>
+          <w:szCs w:val="20"/>
+        </w:rPr>
+        <w:t xml:space="preserve">Log sources — AWS: CloudTrail (all regions, all accounts via Org Trail), VPC Flow Logs, GuardDuty findings, Config events, EKS audit logs, WAF logs. Route via Kinesis Firehose or S3 → SIEM connector.</w:t>
+      </w:r>
+    </w:p>
+    <w:p>
+      <w:pPr>
+        <w:pStyle w:val="ListParagraph"/>
+        <w:numPr>
+          <w:ilvl w:val="0"/>
+          <w:numId w:val="2"/>
+        </w:numPr>
+        <w:spacing w:after="30" w:before="30"/>
+      </w:pPr>
+      <w:r>
+        <w:rPr>
+          <w:rFonts w:ascii="Calibri" w:cs="Calibri" w:eastAsia="Calibri" w:hAnsi="Calibri"/>
+          <w:color w:val="37474F"/>
+          <w:sz w:val="20"/>
+          <w:szCs w:val="20"/>
+        </w:rPr>
+        <w:t xml:space="preserve">Log sources — Azure: Entra ID sign-in and audit logs, Activity Log, Defender for Cloud alerts, NSG Flow Logs, AKS audit logs. Route via Diagnostic Settings → Event Hub → SIEM connector.</w:t>
+      </w:r>
+    </w:p>
+    <w:p>
+      <w:pPr>
+        <w:pStyle w:val="ListParagraph"/>
+        <w:numPr>
+          <w:ilvl w:val="0"/>
+          <w:numId w:val="2"/>
+        </w:numPr>
+        <w:spacing w:after="30" w:before="30"/>
+      </w:pPr>
+      <w:r>
+        <w:rPr>
+          <w:rFonts w:ascii="Calibri" w:cs="Calibri" w:eastAsia="Calibri" w:hAnsi="Calibri"/>
+          <w:color w:val="37474F"/>
+          <w:sz w:val="20"/>
+          <w:szCs w:val="20"/>
+        </w:rPr>
+        <w:t xml:space="preserve">Log sources — GCP: Cloud Audit Logs (Admin Activity, Data Access), VPC Flow Logs, SCC findings, GKE audit logs. Route via Log Router sink → Pub/Sub → SIEM connector.</w:t>
+      </w:r>
+    </w:p>
+    <w:p>
+      <w:pPr>
+        <w:pStyle w:val="ListParagraph"/>
+        <w:numPr>
+          <w:ilvl w:val="0"/>
+          <w:numId w:val="2"/>
+        </w:numPr>
+        <w:spacing w:after="30" w:before="30"/>
+      </w:pPr>
+      <w:r>
+        <w:rPr>
+          <w:rFonts w:ascii="Calibri" w:cs="Calibri" w:eastAsia="Calibri" w:hAnsi="Calibri"/>
+          <w:color w:val="37474F"/>
+          <w:sz w:val="20"/>
+          <w:szCs w:val="20"/>
+        </w:rPr>
+        <w:t xml:space="preserve">SIEM platform: Microsoft Sentinel (native multi-cloud connectors, UEBA, SOAR integration) or Chronicle SIEM (Google, excellent GCP integration, petabyte-scale ingestion). Both support YARA-L and KQL detection respectively.</w:t>
+      </w:r>
+    </w:p>
+    <w:p>
+      <w:pPr>
+        <w:pStyle w:val="ListParagraph"/>
+        <w:numPr>
+          <w:ilvl w:val="0"/>
+          <w:numId w:val="2"/>
+        </w:numPr>
+        <w:spacing w:after="30" w:before="30"/>
+      </w:pPr>
+      <w:r>
+        <w:rPr>
+          <w:rFonts w:ascii="Calibri" w:cs="Calibri" w:eastAsia="Calibri" w:hAnsi="Calibri"/>
+          <w:color w:val="37474F"/>
+          <w:sz w:val="20"/>
+          <w:szCs w:val="20"/>
+        </w:rPr>
+        <w:t xml:space="preserve">Log retention: hot tier (queryable) 90 days minimum; cold tier (archived, restorable within 24h) 12 months minimum; legal hold tier (immutable) per regulatory requirement (HIPAA: 6 years, PCI: 12 months, GDPR: purpose-limited).</w:t>
+      </w:r>
+    </w:p>
+    <w:p>
+      <w:pPr>
+        <w:pStyle w:val="ListParagraph"/>
+        <w:numPr>
+          <w:ilvl w:val="0"/>
+          <w:numId w:val="2"/>
+        </w:numPr>
+        <w:spacing w:after="30" w:before="30"/>
+      </w:pPr>
+      <w:r>
+        <w:rPr>
+          <w:rFonts w:ascii="Calibri" w:cs="Calibri" w:eastAsia="Calibri" w:hAnsi="Calibri"/>
+          <w:color w:val="37474F"/>
+          <w:sz w:val="20"/>
+          <w:szCs w:val="20"/>
+        </w:rPr>
+        <w:t xml:space="preserve">Normalization: normalize all log sources to a common schema (OCSF or Elastic Common Schema) before ingestion. Non-normalized logs make cross-source correlation unreliable.</w:t>
+      </w:r>
+    </w:p>
+    <w:p>
+      <w:pPr>
+        <w:pStyle w:val="ListParagraph"/>
+        <w:numPr>
+          <w:ilvl w:val="0"/>
+          <w:numId w:val="2"/>
+        </w:numPr>
+        <w:spacing w:after="30" w:before="30"/>
+      </w:pPr>
+      <w:r>
+        <w:rPr>
+          <w:rFonts w:ascii="Calibri" w:cs="Calibri" w:eastAsia="Calibri" w:hAnsi="Calibri"/>
+          <w:color w:val="37474F"/>
+          <w:sz w:val="20"/>
+          <w:szCs w:val="20"/>
+        </w:rPr>
+        <w:t xml:space="preserve">Log integrity: enable immutable log storage (S3 Object Lock, Azure Blob WORM, GCS Bucket Lock). Logs must be tamper-evident — hash-chain or cloud-native log integrity features must be enabled for all forensically-relevant sources.</w:t>
+      </w:r>
+    </w:p>
+    <w:p>
+      <w:r>
+        <w:t xml:space="preserve"/>
+      </w:r>
+    </w:p>
+    <w:p>
+      <w:pPr>
+        <w:pStyle w:val="Heading1"/>
+        <w:pageBreakBefore/>
+      </w:pPr>
+      <w:r>
+        <w:rPr>
+          <w:rFonts w:ascii="Arial" w:cs="Arial" w:eastAsia="Arial" w:hAnsi="Arial"/>
+          <w:b/>
+          <w:bCs/>
+          <w:color w:val="0F4C75"/>
+          <w:sz w:val="32"/>
+          <w:szCs w:val="32"/>
+        </w:rPr>
+        <w:t xml:space="preserve">6. Multi-Cloud Zero Trust Architecture</w:t>
+      </w:r>
+    </w:p>
+    <w:p>
+      <w:pPr>
+        <w:spacing w:after="100" w:before="60"/>
+      </w:pPr>
+      <w:r>
+        <w:rPr>
+          <w:rFonts w:ascii="Calibri" w:cs="Calibri" w:eastAsia="Calibri" w:hAnsi="Calibri"/>
+          <w:b w:val="false"/>
+          <w:bCs w:val="false"/>
+          <w:i w:val="false"/>
+          <w:iCs w:val="false"/>
+          <w:color w:val="37474F"/>
+          <w:sz w:val="22"/>
+          <w:szCs w:val="22"/>
+        </w:rPr>
+        <w:t xml:space="preserve">Operating across AWS, Azure, and GCP requires a unified Zero Trust architecture that bridges cloud-native identity systems, establishes consistent network isolation, and centralizes detection. The four pillars of multi-cloud Zero Trust are:</w:t>
+      </w:r>
+    </w:p>
+    <w:p>
+      <w:pPr>
+        <w:pStyle w:val="Heading2"/>
+      </w:pPr>
+      <w:r>
+        <w:rPr>
+          <w:rFonts w:ascii="Arial" w:cs="Arial" w:eastAsia="Arial" w:hAnsi="Arial"/>
+          <w:b/>
+          <w:bCs/>
+          <w:color w:val="1565C0"/>
+          <w:sz w:val="26"/>
+          <w:szCs w:val="26"/>
+        </w:rPr>
+        <w:t xml:space="preserve">6.1 Unified Identity</w:t>
+      </w:r>
+    </w:p>
+    <w:p>
+      <w:pPr>
+        <w:spacing w:after="100" w:before="60"/>
+      </w:pPr>
+      <w:r>
+        <w:rPr>
+          <w:rFonts w:ascii="Calibri" w:cs="Calibri" w:eastAsia="Calibri" w:hAnsi="Calibri"/>
+          <w:b w:val="false"/>
+          <w:bCs w:val="false"/>
+          <w:i w:val="false"/>
+          <w:iCs w:val="false"/>
+          <w:color w:val="37474F"/>
+          <w:sz w:val="22"/>
+          <w:szCs w:val="22"/>
+        </w:rPr>
+        <w:t xml:space="preserve">A single Identity Provider federates to all three cloud IAM systems. This ensures consistent authentication policies (MFA, Conditional Access) and a single audit trail.</w:t>
+      </w:r>
+    </w:p>
+    <w:p>
+      <w:pPr>
+        <w:pStyle w:val="ListParagraph"/>
+        <w:numPr>
+          <w:ilvl w:val="0"/>
+          <w:numId w:val="2"/>
+        </w:numPr>
+        <w:spacing w:after="30" w:before="30"/>
+      </w:pPr>
+      <w:r>
+        <w:rPr>
+          <w:rFonts w:ascii="Calibri" w:cs="Calibri" w:eastAsia="Calibri" w:hAnsi="Calibri"/>
+          <w:color w:val="37474F"/>
+          <w:sz w:val="20"/>
+          <w:szCs w:val="20"/>
+        </w:rPr>
+        <w:t xml:space="preserve">Central IdP: Microsoft Entra ID or Okta. All human identities authenticate through the central IdP.</w:t>
+      </w:r>
+    </w:p>
+    <w:p>
+      <w:pPr>
+        <w:pStyle w:val="ListParagraph"/>
+        <w:numPr>
+          <w:ilvl w:val="0"/>
+          <w:numId w:val="2"/>
+        </w:numPr>
+        <w:spacing w:after="30" w:before="30"/>
+      </w:pPr>
+      <w:r>
+        <w:rPr>
+          <w:rFonts w:ascii="Calibri" w:cs="Calibri" w:eastAsia="Calibri" w:hAnsi="Calibri"/>
+          <w:color w:val="37474F"/>
+          <w:sz w:val="20"/>
+          <w:szCs w:val="20"/>
+        </w:rPr>
+        <w:t xml:space="preserve">AWS: SAML 2.0 or OIDC federation to IAM Identity Center (AWS SSO). Users get permission sets, not direct IAM roles.</w:t>
+      </w:r>
+    </w:p>
+    <w:p>
+      <w:pPr>
+        <w:pStyle w:val="ListParagraph"/>
+        <w:numPr>
+          <w:ilvl w:val="0"/>
+          <w:numId w:val="2"/>
+        </w:numPr>
+        <w:spacing w:after="30" w:before="30"/>
+      </w:pPr>
+      <w:r>
+        <w:rPr>
+          <w:rFonts w:ascii="Calibri" w:cs="Calibri" w:eastAsia="Calibri" w:hAnsi="Calibri"/>
+          <w:color w:val="37474F"/>
+          <w:sz w:val="20"/>
+          <w:szCs w:val="20"/>
+        </w:rPr>
+        <w:t xml:space="preserve">Azure: Entra ID is native. Ensure all external identities also federate through central IdP.</w:t>
+      </w:r>
+    </w:p>
+    <w:p>
+      <w:pPr>
+        <w:pStyle w:val="ListParagraph"/>
+        <w:numPr>
+          <w:ilvl w:val="0"/>
+          <w:numId w:val="2"/>
+        </w:numPr>
+        <w:spacing w:after="30" w:before="30"/>
+      </w:pPr>
+      <w:r>
+        <w:rPr>
+          <w:rFonts w:ascii="Calibri" w:cs="Calibri" w:eastAsia="Calibri" w:hAnsi="Calibri"/>
+          <w:color w:val="37474F"/>
+          <w:sz w:val="20"/>
+          <w:szCs w:val="20"/>
+        </w:rPr>
+        <w:t xml:space="preserve">GCP: Google Workspace with Cloud Identity, or SAML federation from Entra ID / Okta to Cloud Identity.</w:t>
+      </w:r>
+    </w:p>
+    <w:p>
+      <w:pPr>
+        <w:pStyle w:val="ListParagraph"/>
+        <w:numPr>
+          <w:ilvl w:val="0"/>
+          <w:numId w:val="2"/>
+        </w:numPr>
+        <w:spacing w:after="30" w:before="30"/>
+      </w:pPr>
+      <w:r>
+        <w:rPr>
+          <w:rFonts w:ascii="Calibri" w:cs="Calibri" w:eastAsia="Calibri" w:hAnsi="Calibri"/>
+          <w:color w:val="37474F"/>
+          <w:sz w:val="20"/>
+          <w:szCs w:val="20"/>
+        </w:rPr>
+        <w:t xml:space="preserve">Workload-to-workload: Use OIDC/SAML token exchange between cloud boundaries (AWS → GCP via Workload Identity Federation).</w:t>
+      </w:r>
+    </w:p>
+    <w:p>
+      <w:r>
+        <w:t xml:space="preserve"/>
+      </w:r>
+    </w:p>
+    <w:p>
+      <w:pPr>
+        <w:pStyle w:val="Heading2"/>
+      </w:pPr>
+      <w:r>
+        <w:rPr>
+          <w:rFonts w:ascii="Arial" w:cs="Arial" w:eastAsia="Arial" w:hAnsi="Arial"/>
+          <w:b/>
+          <w:bCs/>
+          <w:color w:val="1565C0"/>
+          <w:sz w:val="26"/>
+          <w:szCs w:val="26"/>
+        </w:rPr>
+        <w:t xml:space="preserve">6.2 Workload Identity Cross-Cloud</w:t>
+      </w:r>
+    </w:p>
+    <w:p>
+      <w:pPr>
+        <w:pStyle w:val="ListParagraph"/>
+        <w:numPr>
+          <w:ilvl w:val="0"/>
+          <w:numId w:val="2"/>
+        </w:numPr>
+        <w:spacing w:after="30" w:before="30"/>
+      </w:pPr>
+      <w:r>
+        <w:rPr>
+          <w:rFonts w:ascii="Calibri" w:cs="Calibri" w:eastAsia="Calibri" w:hAnsi="Calibri"/>
+          <w:color w:val="37474F"/>
+          <w:sz w:val="20"/>
+          <w:szCs w:val="20"/>
+        </w:rPr>
+        <w:t xml:space="preserve">AWS → GCP: AWS EC2/EKS workloads use IRSA/Instance Profile to get AWS STS token; exchange for GCP Workload Identity token via federation.</w:t>
+      </w:r>
+    </w:p>
+    <w:p>
+      <w:pPr>
+        <w:pStyle w:val="ListParagraph"/>
+        <w:numPr>
+          <w:ilvl w:val="0"/>
+          <w:numId w:val="2"/>
+        </w:numPr>
+        <w:spacing w:after="30" w:before="30"/>
+      </w:pPr>
+      <w:r>
+        <w:rPr>
+          <w:rFonts w:ascii="Calibri" w:cs="Calibri" w:eastAsia="Calibri" w:hAnsi="Calibri"/>
+          <w:color w:val="37474F"/>
+          <w:sz w:val="20"/>
+          <w:szCs w:val="20"/>
+        </w:rPr>
+        <w:t xml:space="preserve">GitHub Actions → All clouds: OIDC token from GitHub Actions federated to all three clouds. No static credentials in GitHub Secrets.</w:t>
+      </w:r>
+    </w:p>
+    <w:p>
+      <w:pPr>
+        <w:pStyle w:val="ListParagraph"/>
+        <w:numPr>
+          <w:ilvl w:val="0"/>
+          <w:numId w:val="2"/>
+        </w:numPr>
+        <w:spacing w:after="30" w:before="30"/>
+      </w:pPr>
+      <w:r>
+        <w:rPr>
+          <w:rFonts w:ascii="Calibri" w:cs="Calibri" w:eastAsia="Calibri" w:hAnsi="Calibri"/>
+          <w:color w:val="37474F"/>
+          <w:sz w:val="20"/>
+          <w:szCs w:val="20"/>
+        </w:rPr>
+        <w:t xml:space="preserve">Vault (HashiCorp): deploy Vault with cloud-native auto-unseal (AWS KMS / Azure Key Vault / GCP KMS). Vault handles secret lifecycle across all providers.</w:t>
+      </w:r>
+    </w:p>
+    <w:p>
+      <w:pPr>
+        <w:pStyle w:val="ListParagraph"/>
+        <w:numPr>
+          <w:ilvl w:val="0"/>
+          <w:numId w:val="2"/>
+        </w:numPr>
+        <w:spacing w:after="30" w:before="30"/>
+      </w:pPr>
+      <w:r>
+        <w:rPr>
+          <w:rFonts w:ascii="Calibri" w:cs="Calibri" w:eastAsia="Calibri" w:hAnsi="Calibri"/>
+          <w:color w:val="37474F"/>
+          <w:sz w:val="20"/>
+          <w:szCs w:val="20"/>
+        </w:rPr>
+        <w:t xml:space="preserve">No shared secrets between clouds: each cloud-to-cloud trust relationship uses token federation, not static keys.</w:t>
+      </w:r>
+    </w:p>
+    <w:p>
+      <w:r>
+        <w:t xml:space="preserve"/>
+      </w:r>
+    </w:p>
+    <w:p>
+      <w:pPr>
+        <w:pStyle w:val="Heading2"/>
+      </w:pPr>
+      <w:r>
+        <w:rPr>
+          <w:rFonts w:ascii="Arial" w:cs="Arial" w:eastAsia="Arial" w:hAnsi="Arial"/>
+          <w:b/>
+          <w:bCs/>
+          <w:color w:val="1565C0"/>
+          <w:sz w:val="26"/>
+          <w:szCs w:val="26"/>
+        </w:rPr>
+        <w:t xml:space="preserve">6.3 Private Cross-Cloud Connectivity</w:t>
+      </w:r>
+    </w:p>
+    <w:p>
+      <w:pPr>
+        <w:pStyle w:val="ListParagraph"/>
+        <w:numPr>
+          <w:ilvl w:val="0"/>
+          <w:numId w:val="2"/>
+        </w:numPr>
+        <w:spacing w:after="30" w:before="30"/>
+      </w:pPr>
+      <w:r>
+        <w:rPr>
+          <w:rFonts w:ascii="Calibri" w:cs="Calibri" w:eastAsia="Calibri" w:hAnsi="Calibri"/>
+          <w:color w:val="37474F"/>
+          <w:sz w:val="20"/>
+          <w:szCs w:val="20"/>
+        </w:rPr>
+        <w:t xml:space="preserve">AWS ↔ Azure: Azure ExpressRoute + AWS Direct Connect via transit provider (Equinix). Or Aviatrix multi-cloud networking for BGP-based routing.</w:t>
+      </w:r>
+    </w:p>
+    <w:p>
+      <w:pPr>
+        <w:pStyle w:val="ListParagraph"/>
+        <w:numPr>
+          <w:ilvl w:val="0"/>
+          <w:numId w:val="2"/>
+        </w:numPr>
+        <w:spacing w:after="30" w:before="30"/>
+      </w:pPr>
+      <w:r>
+        <w:rPr>
+          <w:rFonts w:ascii="Calibri" w:cs="Calibri" w:eastAsia="Calibri" w:hAnsi="Calibri"/>
+          <w:color w:val="37474F"/>
+          <w:sz w:val="20"/>
+          <w:szCs w:val="20"/>
+        </w:rPr>
+        <w:t xml:space="preserve">AWS ↔ GCP: Partner Interconnect + Direct Connect via carrier. No site-to-site VPN over public internet for production traffic.</w:t>
+      </w:r>
+    </w:p>
+    <w:p>
+      <w:pPr>
+        <w:pStyle w:val="ListParagraph"/>
+        <w:numPr>
+          <w:ilvl w:val="0"/>
+          <w:numId w:val="2"/>
+        </w:numPr>
+        <w:spacing w:after="30" w:before="30"/>
+      </w:pPr>
+      <w:r>
+        <w:rPr>
+          <w:rFonts w:ascii="Calibri" w:cs="Calibri" w:eastAsia="Calibri" w:hAnsi="Calibri"/>
+          <w:color w:val="37474F"/>
+          <w:sz w:val="20"/>
+          <w:szCs w:val="20"/>
+        </w:rPr>
+        <w:t xml:space="preserve">GCP ↔ Azure: Azure ExpressRoute + GCP Dedicated Interconnect via co-location facility.</w:t>
+      </w:r>
+    </w:p>
+    <w:p>
+      <w:pPr>
+        <w:pStyle w:val="ListParagraph"/>
+        <w:numPr>
+          <w:ilvl w:val="0"/>
+          <w:numId w:val="2"/>
+        </w:numPr>
+        <w:spacing w:after="30" w:before="30"/>
+      </w:pPr>
+      <w:r>
+        <w:rPr>
+          <w:rFonts w:ascii="Calibri" w:cs="Calibri" w:eastAsia="Calibri" w:hAnsi="Calibri"/>
+          <w:color w:val="37474F"/>
+          <w:sz w:val="20"/>
+          <w:szCs w:val="20"/>
+        </w:rPr>
+        <w:t xml:space="preserve">Zero trust overlay: Aviatrix or Illumio for microsegmentation and encrypted east-west traffic across cloud boundaries.</w:t>
+      </w:r>
+    </w:p>
+    <w:p>
+      <w:pPr>
+        <w:pStyle w:val="ListParagraph"/>
+        <w:numPr>
+          <w:ilvl w:val="0"/>
+          <w:numId w:val="2"/>
+        </w:numPr>
+        <w:spacing w:after="30" w:before="30"/>
+      </w:pPr>
+      <w:r>
+        <w:rPr>
+          <w:rFonts w:ascii="Calibri" w:cs="Calibri" w:eastAsia="Calibri" w:hAnsi="Calibri"/>
+          <w:color w:val="37474F"/>
+          <w:sz w:val="20"/>
+          <w:szCs w:val="20"/>
+        </w:rPr>
+        <w:t xml:space="preserve">DNS: centralized private DNS resolution with forwarding zones per provider. No public DNS for internal service communication.</w:t>
+      </w:r>
+    </w:p>
+    <w:p>
+      <w:r>
+        <w:t xml:space="preserve"/>
+      </w:r>
+    </w:p>
+    <w:p>
+      <w:pPr>
+        <w:pStyle w:val="Heading2"/>
+      </w:pPr>
+      <w:r>
+        <w:rPr>
+          <w:rFonts w:ascii="Arial" w:cs="Arial" w:eastAsia="Arial" w:hAnsi="Arial"/>
+          <w:b/>
+          <w:bCs/>
+          <w:color w:val="1565C0"/>
+          <w:sz w:val="26"/>
+          <w:szCs w:val="26"/>
+        </w:rPr>
+        <w:t xml:space="preserve">6.4 Multi-Cloud Security Operations Stack</w:t>
       </w:r>
     </w:p>
     <w:p>
@@ -8370,7 +9568,7 @@
           <w:sz w:val="32"/>
           <w:szCs w:val="32"/>
         </w:rPr>
-        <w:t xml:space="preserve">6. MITRE ATT&amp;CK for Cloud Techniques</w:t>
+        <w:t xml:space="preserve">7. MITRE ATT&amp;CK for Cloud Techniques</w:t>
       </w:r>
     </w:p>
     <w:p>
@@ -10005,7 +11203,7 @@
           <w:sz w:val="32"/>
           <w:szCs w:val="32"/>
         </w:rPr>
-        <w:t xml:space="preserve">7. NIST SP 800-53 Rev 5 Control Mapping</w:t>
+        <w:t xml:space="preserve">8. NIST SP 800-53 Rev 5 Control Mapping</w:t>
       </w:r>
     </w:p>
     <w:p>
@@ -11797,7 +12995,7 @@
           <w:sz w:val="32"/>
           <w:szCs w:val="32"/>
         </w:rPr>
-        <w:t xml:space="preserve">8. Implementation Roadmap</w:t>
+        <w:t xml:space="preserve">9. Implementation Roadmap</w:t>
       </w:r>
     </w:p>
     <w:p>
@@ -13295,7 +14493,7 @@
           <w:sz w:val="32"/>
           <w:szCs w:val="32"/>
         </w:rPr>
-        <w:t xml:space="preserve">9. AI Security and LLM Governance</w:t>
+        <w:t xml:space="preserve">10. AI Security and LLM Governance</w:t>
       </w:r>
     </w:p>
     <w:p>
@@ -13592,7 +14790,7 @@
           <w:sz w:val="32"/>
           <w:szCs w:val="32"/>
         </w:rPr>
-        <w:t xml:space="preserve">10. Cloud Attack Path Analysis</w:t>
+        <w:t xml:space="preserve">11. Cloud Attack Path Analysis</w:t>
       </w:r>
     </w:p>
     <w:p>
@@ -13889,7 +15087,7 @@
           <w:sz w:val="32"/>
           <w:szCs w:val="32"/>
         </w:rPr>
-        <w:t xml:space="preserve">11. Operational Security Metrics</w:t>
+        <w:t xml:space="preserve">12. Operational Security Metrics</w:t>
       </w:r>
     </w:p>
     <w:p>
@@ -13928,7 +15126,7 @@
           <w:sz w:val="26"/>
           <w:szCs w:val="26"/>
         </w:rPr>
-        <w:t xml:space="preserve">11.1 Identity and Access</w:t>
+        <w:t xml:space="preserve">12.1 Identity and Access</w:t>
       </w:r>
     </w:p>
     <w:tbl>
@@ -14537,7 +15735,7 @@
           <w:sz w:val="26"/>
           <w:szCs w:val="26"/>
         </w:rPr>
-        <w:t xml:space="preserve">11.2 Detection and Response</w:t>
+        <w:t xml:space="preserve">12.2 Detection and Response</w:t>
       </w:r>
     </w:p>
     <w:tbl>
@@ -15146,7 +16344,7 @@
           <w:sz w:val="26"/>
           <w:szCs w:val="26"/>
         </w:rPr>
-        <w:t xml:space="preserve">11.3 Data Protection and Posture</w:t>
+        <w:t xml:space="preserve">12.3 Data Protection and Posture</w:t>
       </w:r>
     </w:p>
     <w:tbl>
@@ -15755,7 +16953,7 @@
           <w:sz w:val="26"/>
           <w:szCs w:val="26"/>
         </w:rPr>
-        <w:t xml:space="preserve">11.4 Supply Chain and Build Integrity</w:t>
+        <w:t xml:space="preserve">12.4 Supply Chain and Build Integrity</w:t>
       </w:r>
     </w:p>
     <w:p>
@@ -15898,6 +17096,258 @@
                 <w:szCs w:val="19"/>
               </w:rPr>
               <w:t xml:space="preserve">Metrics without ownership are decorative. Assign a named owner per metric, define remediation SLAs, and integrate metrics into security reviews and quarterly reporting.</w:t>
+            </w:r>
+          </w:p>
+        </w:tc>
+      </w:tr>
+    </w:tbl>
+    <w:p>
+      <w:r>
+        <w:t xml:space="preserve"/>
+      </w:r>
+    </w:p>
+    <w:p>
+      <w:pPr>
+        <w:pStyle w:val="Heading1"/>
+        <w:pageBreakBefore/>
+      </w:pPr>
+      <w:r>
+        <w:rPr>
+          <w:rFonts w:ascii="Arial" w:cs="Arial" w:eastAsia="Arial" w:hAnsi="Arial"/>
+          <w:b/>
+          <w:bCs/>
+          <w:color w:val="0F4C75"/>
+          <w:sz w:val="32"/>
+          <w:szCs w:val="32"/>
+        </w:rPr>
+        <w:t xml:space="preserve">Key Takeaways</w:t>
+      </w:r>
+    </w:p>
+    <w:p>
+      <w:pPr>
+        <w:spacing w:after="100" w:before="60"/>
+      </w:pPr>
+      <w:r>
+        <w:rPr>
+          <w:rFonts w:ascii="Calibri" w:cs="Calibri" w:eastAsia="Calibri" w:hAnsi="Calibri"/>
+          <w:b w:val="false"/>
+          <w:bCs w:val="false"/>
+          <w:i w:val="false"/>
+          <w:iCs w:val="false"/>
+          <w:color w:val="37474F"/>
+          <w:sz w:val="22"/>
+          <w:szCs w:val="22"/>
+        </w:rPr>
+        <w:t xml:space="preserve">Cloud security is not a configuration checklist. It is an engineering discipline requiring continuous architecture decisions, operational ownership, and measurement. The following principles synthesize the guidance in this document.</w:t>
+      </w:r>
+    </w:p>
+    <w:p>
+      <w:r>
+        <w:t xml:space="preserve"/>
+      </w:r>
+    </w:p>
+    <w:p>
+      <w:pPr>
+        <w:pStyle w:val="ListParagraph"/>
+        <w:numPr>
+          <w:ilvl w:val="0"/>
+          <w:numId w:val="2"/>
+        </w:numPr>
+        <w:spacing w:after="30" w:before="30"/>
+      </w:pPr>
+      <w:r>
+        <w:rPr>
+          <w:rFonts w:ascii="Calibri" w:cs="Calibri" w:eastAsia="Calibri" w:hAnsi="Calibri"/>
+          <w:color w:val="37474F"/>
+          <w:sz w:val="20"/>
+          <w:szCs w:val="20"/>
+        </w:rPr>
+        <w:t xml:space="preserve">Identity is the perimeter. Every access decision in cloud must be mediated by a verified, least-privileged identity — human or machine. MFA without exception, no static credentials, and continuous access reviews are non-negotiable baselines.</w:t>
+      </w:r>
+    </w:p>
+    <w:p>
+      <w:pPr>
+        <w:pStyle w:val="ListParagraph"/>
+        <w:numPr>
+          <w:ilvl w:val="0"/>
+          <w:numId w:val="2"/>
+        </w:numPr>
+        <w:spacing w:after="30" w:before="30"/>
+      </w:pPr>
+      <w:r>
+        <w:rPr>
+          <w:rFonts w:ascii="Calibri" w:cs="Calibri" w:eastAsia="Calibri" w:hAnsi="Calibri"/>
+          <w:color w:val="37474F"/>
+          <w:sz w:val="20"/>
+          <w:szCs w:val="20"/>
+        </w:rPr>
+        <w:t xml:space="preserve">Least privilege requires active maintenance. Permissions accumulate. IAM posture degrades over time without automated analysis and remediation. Treat permissive IAM as a critical finding, not a configuration debt item.</w:t>
+      </w:r>
+    </w:p>
+    <w:p>
+      <w:pPr>
+        <w:pStyle w:val="ListParagraph"/>
+        <w:numPr>
+          <w:ilvl w:val="0"/>
+          <w:numId w:val="2"/>
+        </w:numPr>
+        <w:spacing w:after="30" w:before="30"/>
+      </w:pPr>
+      <w:r>
+        <w:rPr>
+          <w:rFonts w:ascii="Calibri" w:cs="Calibri" w:eastAsia="Calibri" w:hAnsi="Calibri"/>
+          <w:color w:val="37474F"/>
+          <w:sz w:val="20"/>
+          <w:szCs w:val="20"/>
+        </w:rPr>
+        <w:t xml:space="preserve">Static controls are necessary but insufficient. Misconfigurations get through, zero-days happen, and insider threats operate within allowed permissions. Runtime detection, behavioral analytics, and incident response capability are required complements to preventive controls.</w:t>
+      </w:r>
+    </w:p>
+    <w:p>
+      <w:pPr>
+        <w:pStyle w:val="ListParagraph"/>
+        <w:numPr>
+          <w:ilvl w:val="0"/>
+          <w:numId w:val="2"/>
+        </w:numPr>
+        <w:spacing w:after="30" w:before="30"/>
+      </w:pPr>
+      <w:r>
+        <w:rPr>
+          <w:rFonts w:ascii="Calibri" w:cs="Calibri" w:eastAsia="Calibri" w:hAnsi="Calibri"/>
+          <w:color w:val="37474F"/>
+          <w:sz w:val="20"/>
+          <w:szCs w:val="20"/>
+        </w:rPr>
+        <w:t xml:space="preserve">Supply chain is the new perimeter. A secure runtime means nothing if the artifact running in it was compromised before deployment. SCA, artifact signing, SBOM, and SLSA Level 3 are not advanced practices — they are the minimum bar for production workloads.</w:t>
+      </w:r>
+    </w:p>
+    <w:p>
+      <w:pPr>
+        <w:pStyle w:val="ListParagraph"/>
+        <w:numPr>
+          <w:ilvl w:val="0"/>
+          <w:numId w:val="2"/>
+        </w:numPr>
+        <w:spacing w:after="30" w:before="30"/>
+      </w:pPr>
+      <w:r>
+        <w:rPr>
+          <w:rFonts w:ascii="Calibri" w:cs="Calibri" w:eastAsia="Calibri" w:hAnsi="Calibri"/>
+          <w:color w:val="37474F"/>
+          <w:sz w:val="20"/>
+          <w:szCs w:val="20"/>
+        </w:rPr>
+        <w:t xml:space="preserve">Complexity is a security liability. Controls too complex to operate consistently create their own risk surface. Mandate only what the organization can sustainably run. Operational sustainability is a security requirement, not an excuse.</w:t>
+      </w:r>
+    </w:p>
+    <w:p>
+      <w:pPr>
+        <w:pStyle w:val="ListParagraph"/>
+        <w:numPr>
+          <w:ilvl w:val="0"/>
+          <w:numId w:val="2"/>
+        </w:numPr>
+        <w:spacing w:after="30" w:before="30"/>
+      </w:pPr>
+      <w:r>
+        <w:rPr>
+          <w:rFonts w:ascii="Calibri" w:cs="Calibri" w:eastAsia="Calibri" w:hAnsi="Calibri"/>
+          <w:color w:val="37474F"/>
+          <w:sz w:val="20"/>
+          <w:szCs w:val="20"/>
+        </w:rPr>
+        <w:t xml:space="preserve">Centralized visibility is not optional. Siloed logs and fragmented identity planes make incident detection and response operationally impossible at scale. Invest in centralized SIEM, normalized log schemas, and a single authoritative IdP before adding more point solutions.</w:t>
+      </w:r>
+    </w:p>
+    <w:p>
+      <w:pPr>
+        <w:pStyle w:val="ListParagraph"/>
+        <w:numPr>
+          <w:ilvl w:val="0"/>
+          <w:numId w:val="2"/>
+        </w:numPr>
+        <w:spacing w:after="30" w:before="30"/>
+      </w:pPr>
+      <w:r>
+        <w:rPr>
+          <w:rFonts w:ascii="Calibri" w:cs="Calibri" w:eastAsia="Calibri" w:hAnsi="Calibri"/>
+          <w:color w:val="37474F"/>
+          <w:sz w:val="20"/>
+          <w:szCs w:val="20"/>
+        </w:rPr>
+        <w:t xml:space="preserve">Measure what you intend to improve. Adopt the metrics framework in Section 12. Assign owners. Define remediation SLAs. Review monthly. Security posture without measurement is theatre.</w:t>
+      </w:r>
+    </w:p>
+    <w:p>
+      <w:pPr>
+        <w:pStyle w:val="ListParagraph"/>
+        <w:numPr>
+          <w:ilvl w:val="0"/>
+          <w:numId w:val="2"/>
+        </w:numPr>
+        <w:spacing w:after="30" w:before="30"/>
+      </w:pPr>
+      <w:r>
+        <w:rPr>
+          <w:rFonts w:ascii="Calibri" w:cs="Calibri" w:eastAsia="Calibri" w:hAnsi="Calibri"/>
+          <w:color w:val="37474F"/>
+          <w:sz w:val="20"/>
+          <w:szCs w:val="20"/>
+        </w:rPr>
+        <w:t xml:space="preserve">Architecture must match your operational maturity. Service mesh, DSPM, and attack path analysis are powerful tools — and expensive failures if deployed without the team capability to operate them. Assess maturity honestly. Phase implementations accordingly.</w:t>
+      </w:r>
+    </w:p>
+    <w:p>
+      <w:r>
+        <w:t xml:space="preserve"/>
+      </w:r>
+    </w:p>
+    <w:tbl>
+      <w:tblPr>
+        <w:tblW w:type="dxa" w:w="9360"/>
+        <w:tblBorders>
+          <w:top w:val="single" w:color="auto" w:sz="4"/>
+          <w:left w:val="single" w:color="auto" w:sz="4"/>
+          <w:bottom w:val="single" w:color="auto" w:sz="4"/>
+          <w:right w:val="single" w:color="auto" w:sz="4"/>
+          <w:insideH w:val="single" w:color="auto" w:sz="4"/>
+          <w:insideV w:val="single" w:color="auto" w:sz="4"/>
+        </w:tblBorders>
+      </w:tblPr>
+      <w:tblGrid>
+        <w:gridCol w:w="9360"/>
+      </w:tblGrid>
+      <w:tr>
+        <w:tc>
+          <w:tcPr>
+            <w:tcW w:type="dxa" w:w="9360"/>
+            <w:tcBorders>
+              <w:top w:val="single" w:color="CCCCCC" w:sz="1"/>
+              <w:left w:val="single" w:color="F4A261" w:sz="8"/>
+              <w:bottom w:val="single" w:color="CCCCCC" w:sz="1"/>
+              <w:right w:val="none" w:color="FFFFFF" w:sz="0"/>
+            </w:tcBorders>
+            <w:shd w:fill="F0F4F8" w:val="clear"/>
+            <w:tcMar>
+              <w:top w:type="dxa" w:w="80"/>
+              <w:left w:type="dxa" w:w="160"/>
+              <w:bottom w:type="dxa" w:w="80"/>
+              <w:right w:type="dxa" w:w="160"/>
+            </w:tcMar>
+          </w:tcPr>
+          <w:p>
+            <w:pPr>
+              <w:spacing w:after="0" w:before="0"/>
+            </w:pPr>
+            <w:r>
+              <w:rPr>
+                <w:rFonts w:ascii="Calibri" w:cs="Calibri" w:eastAsia="Calibri" w:hAnsi="Calibri"/>
+                <w:color w:val="37474F"/>
+                <w:sz w:val="19"/>
+                <w:szCs w:val="19"/>
+              </w:rPr>
+              <w:t xml:space="preserve">The controls in this document represent a mature target state. Not every organization will implement every control on day one. What matters is that gaps are known, owned, and tracked on a risk-informed roadmap — not discovered during an incident.</w:t>
             </w:r>
           </w:p>
         </w:tc>

</xml_diff>